<commit_message>
Fix residual causal-isolation language and reporting precision per round-8 review
Round-8 independent review scored 84/100 (Minor Revision, up from 64/Major),
flagging remaining "mechanism-isolating" language in Related Work that
contradicted the Results section's own hedged claim, plus minor reporting
precision issues (monotonicity wording, categorical dose-sufficiency claim,
same-distribution control description, unqualified "locally robust" framing).

Co-Authored-By: Claude Sonnet 5 <noreply@anthropic.com>
</commit_message>
<xml_diff>
--- a/paper_rewriting_output/final_paper/paper.docx
+++ b/paper_rewriting_output/final_paper/paper.docx
@@ -421,31 +421,43 @@
         <w:t xml:space="preserve"> </w:t>
       </w:r>
       <w:r>
-        <w:t xml:space="preserve">Rescue</w:t>
-      </w:r>
-      <w:r>
-        <w:t xml:space="preserve"> </w:t>
-      </w:r>
-      <w:r>
-        <w:t xml:space="preserve">requires</w:t>
-      </w:r>
-      <w:r>
-        <w:t xml:space="preserve"> </w:t>
-      </w:r>
-      <w:r>
-        <w:t xml:space="preserve">an</w:t>
-      </w:r>
-      <w:r>
-        <w:t xml:space="preserve"> </w:t>
-      </w:r>
-      <w:r>
-        <w:t xml:space="preserve">injected</w:t>
-      </w:r>
-      <w:r>
-        <w:t xml:space="preserve"> </w:t>
-      </w:r>
-      <w:r>
-        <w:t xml:space="preserve">dose</w:t>
+        <w:t xml:space="preserve">The</w:t>
+      </w:r>
+      <w:r>
+        <w:t xml:space="preserve"> </w:t>
+      </w:r>
+      <w:r>
+        <w:t xml:space="preserve">onset</w:t>
+      </w:r>
+      <w:r>
+        <w:t xml:space="preserve"> </w:t>
+      </w:r>
+      <w:r>
+        <w:t xml:space="preserve">of</w:t>
+      </w:r>
+      <w:r>
+        <w:t xml:space="preserve"> </w:t>
+      </w:r>
+      <w:r>
+        <w:t xml:space="preserve">substantial</w:t>
+      </w:r>
+      <w:r>
+        <w:t xml:space="preserve"> </w:t>
+      </w:r>
+      <w:r>
+        <w:t xml:space="preserve">rescue</w:t>
+      </w:r>
+      <w:r>
+        <w:t xml:space="preserve"> </w:t>
+      </w:r>
+      <w:r>
+        <w:t xml:space="preserve">probability</w:t>
+      </w:r>
+      <w:r>
+        <w:t xml:space="preserve"> </w:t>
+      </w:r>
+      <w:r>
+        <w:t xml:space="preserve">lies</w:t>
       </w:r>
       <w:r>
         <w:t xml:space="preserve"> </w:t>
@@ -487,6 +499,12 @@
           <m:t>%</m:t>
         </m:r>
       </m:oMath>
+      <w:r>
+        <w:t xml:space="preserve"> </w:t>
+      </w:r>
+      <w:r>
+        <w:t xml:space="preserve">injected-dose</w:t>
+      </w:r>
       <w:r>
         <w:t xml:space="preserve"> </w:t>
       </w:r>
@@ -1567,7 +1585,7 @@
         </w:numPr>
       </w:pPr>
       <w:r>
-        <w:t xml:space="preserve">A family-discrimination analysis of the boundary’s shape, validated by a pre-specified held-out prediction test (§</w:t>
+        <w:t xml:space="preserve">A family-discrimination analysis of the boundary’s shape, evaluated by a pre-specified held-out prediction test (§</w:t>
       </w:r>
       <w:hyperlink w:anchor="sec:results-family">
         <w:r>
@@ -1589,7 +1607,7 @@
         </w:numPr>
       </w:pPr>
       <w:r>
-        <w:t xml:space="preserve">Locally robust, pre-specified directional predictions across width, learning rate, and optimizer choice (§</w:t>
+        <w:t xml:space="preserve">A pre-specified local robustness study across width, learning rate, depth, and optimizer choice, with four of seven directional predictions confirmed at both tested boundary cells (§</w:t>
       </w:r>
       <w:hyperlink w:anchor="sec:results-robustness">
         <w:r>
@@ -1802,7 +1820,7 @@
         </w:r>
       </w:hyperlink>
       <w:r>
-        <w:t xml:space="preserve">. We treat this diversity of mechanistic accounts as the backdrop against which our own mechanism-isolating controls (§</w:t>
+        <w:t xml:space="preserve">. We treat this diversity of mechanistic accounts as the backdrop against which our own controlled injection ranking (§</w:t>
       </w:r>
       <w:hyperlink w:anchor="sec:results-rescue">
         <w:r>
@@ -1813,7 +1831,7 @@
         </w:r>
       </w:hyperlink>
       <w:r>
-        <w:t xml:space="preserve">) should be read: our controls isolate a data-side coverage mechanism, which is compatible with, rather than a replacement for, model-side accounts of what happens once training data is fixed.</w:t>
+        <w:t xml:space="preserve">) should be read: our ranking points to a data-side coverage effect, compatible with, rather than a replacement for, model-side accounts of what happens once training data is fixed.</w:t>
       </w:r>
     </w:p>
     <w:p>
@@ -1956,7 +1974,7 @@
         </w:r>
       </w:hyperlink>
       <w:r>
-        <w:t xml:space="preserve">) operates directly on the training distribution’s support and isolates coverage, rather than quantity or targeted rarity, as the operative mechanism.</w:t>
+        <w:t xml:space="preserve">) operates directly on the training distribution’s support and ranks coverage above quantity or targeted rarity as the more effective lever, among those tested.</w:t>
       </w:r>
     </w:p>
     <w:p>
@@ -7871,7 +7889,30 @@
         <w:t xml:space="preserve"> </w:t>
       </w:r>
       <w:r>
-        <w:t xml:space="preserve">values, mean accuracy rises monotonically (</w:t>
+        <w:t xml:space="preserve">values, mean accuracy rises through</w:t>
+      </w:r>
+      <w:r>
+        <w:t xml:space="preserve"> </w:t>
+      </w:r>
+      <m:oMath>
+        <m:r>
+          <m:t>q</m:t>
+        </m:r>
+        <m:r>
+          <m:rPr>
+            <m:sty m:val="p"/>
+          </m:rPr>
+          <m:t>=</m:t>
+        </m:r>
+        <m:r>
+          <m:t>0.75</m:t>
+        </m:r>
+      </m:oMath>
+      <w:r>
+        <w:t xml:space="preserve"> </w:t>
+      </w:r>
+      <w:r>
+        <w:t xml:space="preserve">and then plateaus within sampling noise (</w:t>
       </w:r>
       <m:oMath>
         <m:r>
@@ -7915,7 +7956,7 @@
         </m:r>
       </m:oMath>
       <w:r>
-        <w:t xml:space="preserve">) and the fraction generalizing rises from</w:t>
+        <w:t xml:space="preserve">), and the fraction generalizing rises from</w:t>
       </w:r>
       <w:r>
         <w:t xml:space="preserve"> </w:t>
@@ -8168,7 +8209,7 @@
         <w:t xml:space="preserve"> </w:t>
       </w:r>
       <w:r>
-        <w:t xml:space="preserve">is retained because it is the protocol used for the mechanism-isolating controls and the shortened-budget result later in this section; both sweeps agree that dose in the</w:t>
+        <w:t xml:space="preserve">is retained because it is the protocol used for the injection-ranking controls and the shortened-budget result later in this section; both sweeps agree that the onset of substantial rescue probability lies in the</w:t>
       </w:r>
       <w:r>
         <w:t xml:space="preserve"> </w:t>
@@ -8202,7 +8243,7 @@
         <w:t xml:space="preserve"> </w:t>
       </w:r>
       <w:r>
-        <w:t xml:space="preserve">range is sufficient for rescue and dose below</w:t>
+        <w:t xml:space="preserve">dose range, with dose below</w:t>
       </w:r>
       <w:r>
         <w:t xml:space="preserve"> </w:t>
@@ -8222,7 +8263,7 @@
         <w:t xml:space="preserve"> </w:t>
       </w:r>
       <w:r>
-        <w:t xml:space="preserve">is not.</w:t>
+        <w:t xml:space="preserve">not sufficient.</w:t>
       </w:r>
     </w:p>
     <w:p>
@@ -8396,7 +8437,29 @@
         </m:r>
       </m:oMath>
       <w:r>
-        <w:t xml:space="preserve">, 24 seeds per dose point.</w:t>
+        <w:t xml:space="preserve">, 24 seeds per dose point (per-</w:t>
+      </w:r>
+      <m:oMath>
+        <m:r>
+          <m:t>α</m:t>
+        </m:r>
+      </m:oMath>
+      <w:r>
+        <w:t xml:space="preserve"> </w:t>
+      </w:r>
+      <w:r>
+        <w:t xml:space="preserve">breakdown in Appendix C, Table </w:t>
+      </w:r>
+      <w:hyperlink w:anchor="tab:doseclean-peralpha">
+        <w:r>
+          <w:rPr>
+            <w:rStyle w:val="Hyperlink"/>
+          </w:rPr>
+          <w:t xml:space="preserve">10</w:t>
+        </w:r>
+      </w:hyperlink>
+      <w:r>
+        <w:t xml:space="preserve">).</w:t>
       </w:r>
     </w:p>
     <w:tbl>
@@ -8405,7 +8468,7 @@
         <w:tblW w:type="auto" w:w="0"/>
         <w:tblLook w:firstRow="1" w:lastRow="0" w:firstColumn="0" w:lastColumn="0" w:noHBand="0" w:noVBand="0" w:val="0020"/>
         <w:jc w:val="start"/>
-        <w:tblCaption w:val="Deconfounded dose sweep: batch size (128) and step count (60{,}000) fixed throughout; expected dose q/128 implemented by probabilistic single-slot replacement. Pooled across \alpha\in\{2.5,2.75,3.0\}, 24 seeds per dose point."/>
+        <w:tblCaption w:val="Deconfounded dose sweep: batch size (128) and step count (60{,}000) fixed throughout; expected dose q/128 implemented by probabilistic single-slot replacement. Pooled across \alpha\in\{2.5,2.75,3.0\}, 24 seeds per dose point (per-\alpha breakdown in Appendix C, Table 10)."/>
       </w:tblPr>
       <w:tblGrid>
         <w:gridCol w:w="1980"/>
@@ -9056,7 +9119,7 @@
         </m:r>
       </m:oMath>
       <w:r>
-        <w:t xml:space="preserve">, close to the zero-injection baseline, consistent with this control changing the batch’s effective size but not its distribution). Injecting one slot drawn from the small targeted set of states that are rare under the skew but have short carry chains achieves partial credit (mean</w:t>
+        <w:t xml:space="preserve">, close to the zero-injection baseline, consistent with this control being a null resampling of the same distribution rather than a change to the batch’s composition). Injecting one slot drawn from the small targeted set of states that are rare under the skew but have short carry chains achieves partial credit (mean</w:t>
       </w:r>
       <w:r>
         <w:t xml:space="preserve"> </w:t>
@@ -14002,12 +14065,34 @@
         <w:t xml:space="preserve"> </w:t>
       </w:r>
       <w:r>
-        <w:t xml:space="preserve">establishes a model class, not a closed-form law: the two best-performing candidates differ by a small margin at every held-out point.</w:t>
+        <w:t xml:space="preserve">establishes a model class, not a closed-form law: the two best-performing candidates differ by a small margin at every held-out point. The robustness study (§</w:t>
+      </w:r>
+      <w:hyperlink w:anchor="sec:results-robustness">
+        <w:r>
+          <w:rPr>
+            <w:rStyle w:val="Hyperlink"/>
+          </w:rPr>
+          <w:t xml:space="preserve">4.4</w:t>
+        </w:r>
+      </w:hyperlink>
+      <w:r>
+        <w:t xml:space="preserve">) confirms 4 of 7 directional predictions, and the injection ranking (§</w:t>
+      </w:r>
+      <w:hyperlink w:anchor="sec:results-rescue">
+        <w:r>
+          <w:rPr>
+            <w:rStyle w:val="Hyperlink"/>
+          </w:rPr>
+          <w:t xml:space="preserve">4.2</w:t>
+        </w:r>
+      </w:hyperlink>
+      <w:r>
+        <w:t xml:space="preserve">) does not decompose breadth from entropy and state composition, which are confounded in the tested distributions.</w:t>
       </w:r>
     </w:p>
     <w:bookmarkEnd w:id="61"/>
     <w:bookmarkEnd w:id="62"/>
-    <w:bookmarkStart w:id="64" w:name="conclusion"/>
+    <w:bookmarkStart w:id="65" w:name="conclusion"/>
     <w:p>
       <w:pPr>
         <w:pStyle w:val="Heading1"/>
@@ -14033,7 +14118,7 @@
         <w:t xml:space="preserve">We map grokkability across a continuous data-skew axis and weight decay on an autoregressive counting task, find a two-regime failure structure that persists at a second problem size, and identify a minimal intervention—uniform full-state injection, ranked against sample-count and targeted-rarity alternatives—that rescues both of its failure modes. The same ranking transfers to a second arithmetic task under sample-count-matched controls, and a third, non-arithmetic task shows us precisely where that transfer holds and where it does not.</w:t>
       </w:r>
     </w:p>
-    <w:bookmarkStart w:id="63" w:name="code-and-data-availability"/>
+    <w:bookmarkStart w:id="64" w:name="code-and-data-availability"/>
     <w:p>
       <w:pPr>
         <w:pStyle w:val="Heading2"/>
@@ -14075,12 +14160,26 @@
         </w:r>
       </w:hyperlink>
       <w:r>
-        <w:t xml:space="preserve">, recorded before the corresponding measurement runs per §3.7) will be released in a public repository upon publication.</w:t>
+        <w:t xml:space="preserve">, recorded before the corresponding measurement runs per §3.7) are available at</w:t>
+      </w:r>
+      <w:r>
+        <w:t xml:space="preserve"> </w:t>
+      </w:r>
+      <w:hyperlink r:id="rId63">
+        <w:r>
+          <w:rPr>
+            <w:rStyle w:val="Hyperlink"/>
+          </w:rPr>
+          <w:t xml:space="preserve">https://github.com/yangyangtiaoguo/grokking</w:t>
+        </w:r>
+      </w:hyperlink>
+      <w:r>
+        <w:t xml:space="preserve">.</w:t>
       </w:r>
     </w:p>
-    <w:bookmarkEnd w:id="63"/>
     <w:bookmarkEnd w:id="64"/>
-    <w:bookmarkStart w:id="66" w:name="app:seedcounts"/>
+    <w:bookmarkEnd w:id="65"/>
+    <w:bookmarkStart w:id="67" w:name="app:seedcounts"/>
     <w:p>
       <w:pPr>
         <w:pStyle w:val="Heading1"/>
@@ -14218,7 +14317,7 @@
         <w:t xml:space="preserve">). Cells near a resolved ceiling were sampled at up to 10 seeds; exploratory cells away from the boundary used 3.</w:t>
       </w:r>
     </w:p>
-    <w:bookmarkStart w:id="65" w:name="tab:appendixseeds"/>
+    <w:bookmarkStart w:id="66" w:name="tab:appendixseeds"/>
     <w:p>
       <w:pPr>
         <w:pStyle w:val="TableCaption"/>
@@ -14992,9 +15091,9 @@
         </w:tc>
       </w:tr>
     </w:tbl>
-    <w:bookmarkEnd w:id="65"/>
     <w:bookmarkEnd w:id="66"/>
-    <w:bookmarkStart w:id="114" w:name="app:dyck"/>
+    <w:bookmarkEnd w:id="67"/>
+    <w:bookmarkStart w:id="70" w:name="app:dyck"/>
     <w:p>
       <w:pPr>
         <w:pStyle w:val="Heading1"/>
@@ -15190,7 +15289,7 @@
         <w:t xml:space="preserve">.</w:t>
       </w:r>
     </w:p>
-    <w:bookmarkStart w:id="67" w:name="tab:dyckboundary"/>
+    <w:bookmarkStart w:id="68" w:name="tab:dyckboundary"/>
     <w:p>
       <w:pPr>
         <w:pStyle w:val="TableCaption"/>
@@ -16164,8 +16263,8 @@
         </w:tc>
       </w:tr>
     </w:tbl>
-    <w:bookmarkEnd w:id="67"/>
-    <w:bookmarkStart w:id="68" w:name="tab:dyckrescue"/>
+    <w:bookmarkEnd w:id="68"/>
+    <w:bookmarkStart w:id="69" w:name="tab:dyckrescue"/>
     <w:p>
       <w:pPr>
         <w:pStyle w:val="TableCaption"/>
@@ -16559,9 +16658,538 @@
         </w:tc>
       </w:tr>
     </w:tbl>
-    <w:bookmarkEnd w:id="68"/>
-    <w:bookmarkStart w:id="113" w:name="refs"/>
-    <w:bookmarkStart w:id="69" w:name="ref-bengio2009curriculum"/>
+    <w:bookmarkEnd w:id="69"/>
+    <w:bookmarkEnd w:id="70"/>
+    <w:bookmarkStart w:id="117" w:name="app:doseclean"/>
+    <w:p>
+      <w:pPr>
+        <w:pStyle w:val="Heading1"/>
+      </w:pPr>
+      <w:r>
+        <w:rPr>
+          <w:rStyle w:val="SectionNumber"/>
+        </w:rPr>
+        <w:t xml:space="preserve">9</w:t>
+      </w:r>
+      <w:r>
+        <w:tab/>
+      </w:r>
+      <w:r>
+        <w:t xml:space="preserve">Per-</w:t>
+      </w:r>
+      <m:oMath>
+        <m:r>
+          <m:t>α</m:t>
+        </m:r>
+      </m:oMath>
+      <w:r>
+        <w:t xml:space="preserve"> </w:t>
+      </w:r>
+      <w:r>
+        <w:t xml:space="preserve">breakdown of the deconfounded dose sweep</w:t>
+      </w:r>
+    </w:p>
+    <w:p>
+      <w:pPr>
+        <w:pStyle w:val="FirstParagraph"/>
+      </w:pPr>
+      <w:r>
+        <w:t xml:space="preserve">Table </w:t>
+      </w:r>
+      <w:hyperlink w:anchor="tab:doseclean">
+        <w:r>
+          <w:rPr>
+            <w:rStyle w:val="Hyperlink"/>
+          </w:rPr>
+          <w:t xml:space="preserve">3</w:t>
+        </w:r>
+      </w:hyperlink>
+      <w:r>
+        <w:t xml:space="preserve"> </w:t>
+      </w:r>
+      <w:r>
+        <w:t xml:space="preserve">pools 24 seeds per dose point across three</w:t>
+      </w:r>
+      <w:r>
+        <w:t xml:space="preserve"> </w:t>
+      </w:r>
+      <m:oMath>
+        <m:r>
+          <m:t>α</m:t>
+        </m:r>
+      </m:oMath>
+      <w:r>
+        <w:t xml:space="preserve"> </w:t>
+      </w:r>
+      <w:r>
+        <w:t xml:space="preserve">values; Table </w:t>
+      </w:r>
+      <w:hyperlink w:anchor="tab:doseclean-peralpha">
+        <w:r>
+          <w:rPr>
+            <w:rStyle w:val="Hyperlink"/>
+          </w:rPr>
+          <w:t xml:space="preserve">10</w:t>
+        </w:r>
+      </w:hyperlink>
+      <w:r>
+        <w:t xml:space="preserve"> </w:t>
+      </w:r>
+      <w:r>
+        <w:t xml:space="preserve">gives the same sweep broken out per</w:t>
+      </w:r>
+      <w:r>
+        <w:t xml:space="preserve"> </w:t>
+      </w:r>
+      <m:oMath>
+        <m:r>
+          <m:t>α</m:t>
+        </m:r>
+      </m:oMath>
+      <w:r>
+        <w:t xml:space="preserve"> </w:t>
+      </w:r>
+      <w:r>
+        <w:t xml:space="preserve">(8 seeds/cell).</w:t>
+      </w:r>
+    </w:p>
+    <w:bookmarkStart w:id="71" w:name="tab:doseclean-peralpha"/>
+    <w:p>
+      <w:pPr>
+        <w:pStyle w:val="TableCaption"/>
+      </w:pPr>
+      <w:r>
+        <w:t xml:space="preserve">Deconfounded dose sweep by</w:t>
+      </w:r>
+      <w:r>
+        <w:t xml:space="preserve"> </w:t>
+      </w:r>
+      <m:oMath>
+        <m:r>
+          <m:t>α</m:t>
+        </m:r>
+      </m:oMath>
+      <w:r>
+        <w:t xml:space="preserve">: fraction generalizing / mean</w:t>
+      </w:r>
+      <w:r>
+        <w:t xml:space="preserve"> </w:t>
+      </w:r>
+      <m:oMath>
+        <m:sSub>
+          <m:e>
+            <m:r>
+              <m:t>A</m:t>
+            </m:r>
+          </m:e>
+          <m:sub>
+            <m:r>
+              <m:rPr>
+                <m:sty m:val="p"/>
+              </m:rPr>
+              <m:t>u</m:t>
+            </m:r>
+            <m:r>
+              <m:rPr>
+                <m:sty m:val="p"/>
+              </m:rPr>
+              <m:t>n</m:t>
+            </m:r>
+            <m:r>
+              <m:rPr>
+                <m:sty m:val="p"/>
+              </m:rPr>
+              <m:t>i</m:t>
+            </m:r>
+            <m:r>
+              <m:rPr>
+                <m:sty m:val="p"/>
+              </m:rPr>
+              <m:t>f</m:t>
+            </m:r>
+          </m:sub>
+        </m:sSub>
+      </m:oMath>
+      <w:r>
+        <w:t xml:space="preserve">, 8 seeds/cell.</w:t>
+      </w:r>
+    </w:p>
+    <w:tbl>
+      <w:tblPr>
+        <w:tblStyle w:val="Table"/>
+        <w:tblW w:type="auto" w:w="0"/>
+        <w:tblLook w:firstRow="1" w:lastRow="0" w:firstColumn="0" w:lastColumn="0" w:noHBand="0" w:noVBand="0" w:val="0020"/>
+        <w:jc w:val="start"/>
+        <w:tblCaption w:val="Deconfounded dose sweep by \alpha: fraction generalizing / mean A_{\mathrm{unif}}, 8 seeds/cell."/>
+      </w:tblPr>
+      <w:tblGrid>
+        <w:gridCol w:w="1320"/>
+        <w:gridCol w:w="1320"/>
+        <w:gridCol w:w="1320"/>
+        <w:gridCol w:w="1320"/>
+        <w:gridCol w:w="1320"/>
+        <w:gridCol w:w="1320"/>
+      </w:tblGrid>
+      <w:tr>
+        <w:trPr>
+          <w:tblHeader w:val="true"/>
+        </w:trPr>
+        <w:tc>
+          <w:tcPr/>
+          <w:p>
+            <w:pPr>
+              <w:pStyle w:val="Compact"/>
+              <w:jc w:val="left"/>
+            </w:pPr>
+            <m:oMath>
+              <m:r>
+                <m:t>α</m:t>
+              </m:r>
+            </m:oMath>
+          </w:p>
+        </w:tc>
+        <w:tc>
+          <w:tcPr/>
+          <w:p>
+            <w:pPr>
+              <w:pStyle w:val="Compact"/>
+              <w:jc w:val="center"/>
+            </w:pPr>
+            <m:oMath>
+              <m:r>
+                <m:t>q</m:t>
+              </m:r>
+              <m:r>
+                <m:rPr>
+                  <m:sty m:val="p"/>
+                </m:rPr>
+                <m:t>=</m:t>
+              </m:r>
+              <m:r>
+                <m:t>0.10</m:t>
+              </m:r>
+            </m:oMath>
+          </w:p>
+        </w:tc>
+        <w:tc>
+          <w:tcPr/>
+          <w:p>
+            <w:pPr>
+              <w:pStyle w:val="Compact"/>
+              <w:jc w:val="center"/>
+            </w:pPr>
+            <m:oMath>
+              <m:r>
+                <m:t>q</m:t>
+              </m:r>
+              <m:r>
+                <m:rPr>
+                  <m:sty m:val="p"/>
+                </m:rPr>
+                <m:t>=</m:t>
+              </m:r>
+              <m:r>
+                <m:t>0.25</m:t>
+              </m:r>
+            </m:oMath>
+          </w:p>
+        </w:tc>
+        <w:tc>
+          <w:tcPr/>
+          <w:p>
+            <w:pPr>
+              <w:pStyle w:val="Compact"/>
+              <w:jc w:val="center"/>
+            </w:pPr>
+            <m:oMath>
+              <m:r>
+                <m:t>q</m:t>
+              </m:r>
+              <m:r>
+                <m:rPr>
+                  <m:sty m:val="p"/>
+                </m:rPr>
+                <m:t>=</m:t>
+              </m:r>
+              <m:r>
+                <m:t>0.50</m:t>
+              </m:r>
+            </m:oMath>
+          </w:p>
+        </w:tc>
+        <w:tc>
+          <w:tcPr/>
+          <w:p>
+            <w:pPr>
+              <w:pStyle w:val="Compact"/>
+              <w:jc w:val="center"/>
+            </w:pPr>
+            <m:oMath>
+              <m:r>
+                <m:t>q</m:t>
+              </m:r>
+              <m:r>
+                <m:rPr>
+                  <m:sty m:val="p"/>
+                </m:rPr>
+                <m:t>=</m:t>
+              </m:r>
+              <m:r>
+                <m:t>0.75</m:t>
+              </m:r>
+            </m:oMath>
+          </w:p>
+        </w:tc>
+        <w:tc>
+          <w:tcPr/>
+          <w:p>
+            <w:pPr>
+              <w:pStyle w:val="Compact"/>
+              <w:jc w:val="center"/>
+            </w:pPr>
+            <m:oMath>
+              <m:r>
+                <m:t>q</m:t>
+              </m:r>
+              <m:r>
+                <m:rPr>
+                  <m:sty m:val="p"/>
+                </m:rPr>
+                <m:t>=</m:t>
+              </m:r>
+              <m:r>
+                <m:t>1.00</m:t>
+              </m:r>
+            </m:oMath>
+          </w:p>
+        </w:tc>
+      </w:tr>
+      <w:tr>
+        <w:tc>
+          <w:tcPr/>
+          <w:p>
+            <w:pPr>
+              <w:pStyle w:val="Compact"/>
+              <w:jc w:val="left"/>
+            </w:pPr>
+            <w:r>
+              <w:t xml:space="preserve">2.5</w:t>
+            </w:r>
+          </w:p>
+        </w:tc>
+        <w:tc>
+          <w:tcPr/>
+          <w:p>
+            <w:pPr>
+              <w:pStyle w:val="Compact"/>
+              <w:jc w:val="center"/>
+            </w:pPr>
+            <w:r>
+              <w:t xml:space="preserve">0/8 (0.551)</w:t>
+            </w:r>
+          </w:p>
+        </w:tc>
+        <w:tc>
+          <w:tcPr/>
+          <w:p>
+            <w:pPr>
+              <w:pStyle w:val="Compact"/>
+              <w:jc w:val="center"/>
+            </w:pPr>
+            <w:r>
+              <w:t xml:space="preserve">0/8 (0.725)</w:t>
+            </w:r>
+          </w:p>
+        </w:tc>
+        <w:tc>
+          <w:tcPr/>
+          <w:p>
+            <w:pPr>
+              <w:pStyle w:val="Compact"/>
+              <w:jc w:val="center"/>
+            </w:pPr>
+            <w:r>
+              <w:t xml:space="preserve">3/8 (0.886)</w:t>
+            </w:r>
+          </w:p>
+        </w:tc>
+        <w:tc>
+          <w:tcPr/>
+          <w:p>
+            <w:pPr>
+              <w:pStyle w:val="Compact"/>
+              <w:jc w:val="center"/>
+            </w:pPr>
+            <w:r>
+              <w:t xml:space="preserve">7/8 (0.942)</w:t>
+            </w:r>
+          </w:p>
+        </w:tc>
+        <w:tc>
+          <w:tcPr/>
+          <w:p>
+            <w:pPr>
+              <w:pStyle w:val="Compact"/>
+              <w:jc w:val="center"/>
+            </w:pPr>
+            <w:r>
+              <w:t xml:space="preserve">7/8 (0.947)</w:t>
+            </w:r>
+          </w:p>
+        </w:tc>
+      </w:tr>
+      <w:tr>
+        <w:tc>
+          <w:tcPr/>
+          <w:p>
+            <w:pPr>
+              <w:pStyle w:val="Compact"/>
+              <w:jc w:val="left"/>
+            </w:pPr>
+            <w:r>
+              <w:t xml:space="preserve">2.75</w:t>
+            </w:r>
+          </w:p>
+        </w:tc>
+        <w:tc>
+          <w:tcPr/>
+          <w:p>
+            <w:pPr>
+              <w:pStyle w:val="Compact"/>
+              <w:jc w:val="center"/>
+            </w:pPr>
+            <w:r>
+              <w:t xml:space="preserve">0/8 (0.469)</w:t>
+            </w:r>
+          </w:p>
+        </w:tc>
+        <w:tc>
+          <w:tcPr/>
+          <w:p>
+            <w:pPr>
+              <w:pStyle w:val="Compact"/>
+              <w:jc w:val="center"/>
+            </w:pPr>
+            <w:r>
+              <w:t xml:space="preserve">0/8 (0.728)</w:t>
+            </w:r>
+          </w:p>
+        </w:tc>
+        <w:tc>
+          <w:tcPr/>
+          <w:p>
+            <w:pPr>
+              <w:pStyle w:val="Compact"/>
+              <w:jc w:val="center"/>
+            </w:pPr>
+            <w:r>
+              <w:t xml:space="preserve">3/8 (0.839)</w:t>
+            </w:r>
+          </w:p>
+        </w:tc>
+        <w:tc>
+          <w:tcPr/>
+          <w:p>
+            <w:pPr>
+              <w:pStyle w:val="Compact"/>
+              <w:jc w:val="center"/>
+            </w:pPr>
+            <w:r>
+              <w:t xml:space="preserve">6/8 (0.922)</w:t>
+            </w:r>
+          </w:p>
+        </w:tc>
+        <w:tc>
+          <w:tcPr/>
+          <w:p>
+            <w:pPr>
+              <w:pStyle w:val="Compact"/>
+              <w:jc w:val="center"/>
+            </w:pPr>
+            <w:r>
+              <w:t xml:space="preserve">5/8 (0.921)</w:t>
+            </w:r>
+          </w:p>
+        </w:tc>
+      </w:tr>
+      <w:tr>
+        <w:tc>
+          <w:tcPr/>
+          <w:p>
+            <w:pPr>
+              <w:pStyle w:val="Compact"/>
+              <w:jc w:val="left"/>
+            </w:pPr>
+            <w:r>
+              <w:t xml:space="preserve">3.0</w:t>
+            </w:r>
+          </w:p>
+        </w:tc>
+        <w:tc>
+          <w:tcPr/>
+          <w:p>
+            <w:pPr>
+              <w:pStyle w:val="Compact"/>
+              <w:jc w:val="center"/>
+            </w:pPr>
+            <w:r>
+              <w:t xml:space="preserve">0/8 (0.412)</w:t>
+            </w:r>
+          </w:p>
+        </w:tc>
+        <w:tc>
+          <w:tcPr/>
+          <w:p>
+            <w:pPr>
+              <w:pStyle w:val="Compact"/>
+              <w:jc w:val="center"/>
+            </w:pPr>
+            <w:r>
+              <w:t xml:space="preserve">0/8 (0.594)</w:t>
+            </w:r>
+          </w:p>
+        </w:tc>
+        <w:tc>
+          <w:tcPr/>
+          <w:p>
+            <w:pPr>
+              <w:pStyle w:val="Compact"/>
+              <w:jc w:val="center"/>
+            </w:pPr>
+            <w:r>
+              <w:t xml:space="preserve">1/8 (0.811)</w:t>
+            </w:r>
+          </w:p>
+        </w:tc>
+        <w:tc>
+          <w:tcPr/>
+          <w:p>
+            <w:pPr>
+              <w:pStyle w:val="Compact"/>
+              <w:jc w:val="center"/>
+            </w:pPr>
+            <w:r>
+              <w:t xml:space="preserve">6/8 (0.918)</w:t>
+            </w:r>
+          </w:p>
+        </w:tc>
+        <w:tc>
+          <w:tcPr/>
+          <w:p>
+            <w:pPr>
+              <w:pStyle w:val="Compact"/>
+              <w:jc w:val="center"/>
+            </w:pPr>
+            <w:r>
+              <w:t xml:space="preserve">5/8 (0.906)</w:t>
+            </w:r>
+          </w:p>
+        </w:tc>
+      </w:tr>
+    </w:tbl>
+    <w:bookmarkEnd w:id="71"/>
+    <w:bookmarkStart w:id="116" w:name="refs"/>
+    <w:bookmarkStart w:id="72" w:name="ref-bengio2009curriculum"/>
     <w:p>
       <w:pPr>
         <w:pStyle w:val="Bibliography"/>
@@ -16595,8 +17223,8 @@
         <w:t xml:space="preserve">, 41–48.</w:t>
       </w:r>
     </w:p>
-    <w:bookmarkEnd w:id="69"/>
-    <w:bookmarkStart w:id="70" w:name="ref-bergstrasser2026succinct"/>
+    <w:bookmarkEnd w:id="72"/>
+    <w:bookmarkStart w:id="73" w:name="ref-bergstrasser2026succinct"/>
     <w:p>
       <w:pPr>
         <w:pStyle w:val="Bibliography"/>
@@ -16630,8 +17258,8 @@
         <w:t xml:space="preserve">.</w:t>
       </w:r>
     </w:p>
-    <w:bookmarkEnd w:id="70"/>
-    <w:bookmarkStart w:id="71" w:name="ref-bhattamishra2020ability"/>
+    <w:bookmarkEnd w:id="73"/>
+    <w:bookmarkStart w:id="74" w:name="ref-bhattamishra2020ability"/>
     <w:p>
       <w:pPr>
         <w:pStyle w:val="Bibliography"/>
@@ -16665,8 +17293,8 @@
         <w:t xml:space="preserve">.</w:t>
       </w:r>
     </w:p>
-    <w:bookmarkEnd w:id="71"/>
-    <w:bookmarkStart w:id="72" w:name="ref-bi2026falsifiable"/>
+    <w:bookmarkEnd w:id="74"/>
+    <w:bookmarkStart w:id="75" w:name="ref-bi2026falsifiable"/>
     <w:p>
       <w:pPr>
         <w:pStyle w:val="Bibliography"/>
@@ -16694,8 +17322,8 @@
         <w:t xml:space="preserve">.</w:t>
       </w:r>
     </w:p>
-    <w:bookmarkEnd w:id="72"/>
-    <w:bookmarkStart w:id="73" w:name="ref-carvalho2025grokkingexplained"/>
+    <w:bookmarkEnd w:id="75"/>
+    <w:bookmarkStart w:id="76" w:name="ref-carvalho2025grokkingexplained"/>
     <w:p>
       <w:pPr>
         <w:pStyle w:val="Bibliography"/>
@@ -16723,8 +17351,8 @@
         <w:t xml:space="preserve">.</w:t>
       </w:r>
     </w:p>
-    <w:bookmarkEnd w:id="73"/>
-    <w:bookmarkStart w:id="74" w:name="ref-chughtai2023toymodel"/>
+    <w:bookmarkEnd w:id="76"/>
+    <w:bookmarkStart w:id="77" w:name="ref-chughtai2023toymodel"/>
     <w:p>
       <w:pPr>
         <w:pStyle w:val="Bibliography"/>
@@ -16758,8 +17386,8 @@
         <w:t xml:space="preserve">.</w:t>
       </w:r>
     </w:p>
-    <w:bookmarkEnd w:id="74"/>
-    <w:bookmarkStart w:id="75" w:name="ref-dealvis2024longtailsurvey"/>
+    <w:bookmarkEnd w:id="77"/>
+    <w:bookmarkStart w:id="78" w:name="ref-dealvis2024longtailsurvey"/>
     <w:p>
       <w:pPr>
         <w:pStyle w:val="Bibliography"/>
@@ -16787,8 +17415,8 @@
         <w:t xml:space="preserve">.</w:t>
       </w:r>
     </w:p>
-    <w:bookmarkEnd w:id="75"/>
-    <w:bookmarkStart w:id="76" w:name="ref-demoss2024complexitydynamics"/>
+    <w:bookmarkEnd w:id="78"/>
+    <w:bookmarkStart w:id="79" w:name="ref-demoss2024complexitydynamics"/>
     <w:p>
       <w:pPr>
         <w:pStyle w:val="Bibliography"/>
@@ -16819,8 +17447,8 @@
         <w:t xml:space="preserve">482: 134859.</w:t>
       </w:r>
     </w:p>
-    <w:bookmarkEnd w:id="76"/>
-    <w:bookmarkStart w:id="77" w:name="ref-doshi2023togrok"/>
+    <w:bookmarkEnd w:id="79"/>
+    <w:bookmarkStart w:id="80" w:name="ref-doshi2023togrok"/>
     <w:p>
       <w:pPr>
         <w:pStyle w:val="Bibliography"/>
@@ -16848,8 +17476,8 @@
         <w:t xml:space="preserve">.</w:t>
       </w:r>
     </w:p>
-    <w:bookmarkEnd w:id="77"/>
-    <w:bookmarkStart w:id="78" w:name="ref-doshi2024modularpolynomials"/>
+    <w:bookmarkEnd w:id="80"/>
+    <w:bookmarkStart w:id="81" w:name="ref-doshi2024modularpolynomials"/>
     <w:p>
       <w:pPr>
         <w:pStyle w:val="Bibliography"/>
@@ -16877,8 +17505,8 @@
         <w:t xml:space="preserve">.</w:t>
       </w:r>
     </w:p>
-    <w:bookmarkEnd w:id="78"/>
-    <w:bookmarkStart w:id="79" w:name="ref-ebrahimi2020dyckn"/>
+    <w:bookmarkEnd w:id="81"/>
+    <w:bookmarkStart w:id="82" w:name="ref-ebrahimi2020dyckn"/>
     <w:p>
       <w:pPr>
         <w:pStyle w:val="Bibliography"/>
@@ -16909,8 +17537,8 @@
         <w:t xml:space="preserve">, 4301–6.</w:t>
       </w:r>
     </w:p>
-    <w:bookmarkEnd w:id="79"/>
-    <w:bookmarkStart w:id="80" w:name="ref-gromov2023grokkingmodular"/>
+    <w:bookmarkEnd w:id="82"/>
+    <w:bookmarkStart w:id="83" w:name="ref-gromov2023grokkingmodular"/>
     <w:p>
       <w:pPr>
         <w:pStyle w:val="Bibliography"/>
@@ -16938,8 +17566,8 @@
         <w:t xml:space="preserve">.</w:t>
       </w:r>
     </w:p>
-    <w:bookmarkEnd w:id="80"/>
-    <w:bookmarkStart w:id="81" w:name="ref-howe2026representationalpriors"/>
+    <w:bookmarkEnd w:id="83"/>
+    <w:bookmarkStart w:id="84" w:name="ref-howe2026representationalpriors"/>
     <w:p>
       <w:pPr>
         <w:pStyle w:val="Bibliography"/>
@@ -16967,8 +17595,8 @@
         <w:t xml:space="preserve">.</w:t>
       </w:r>
     </w:p>
-    <w:bookmarkEnd w:id="81"/>
-    <w:bookmarkStart w:id="82" w:name="ref-kim2026weightdecayclock"/>
+    <w:bookmarkEnd w:id="84"/>
+    <w:bookmarkStart w:id="85" w:name="ref-kim2026weightdecayclock"/>
     <w:p>
       <w:pPr>
         <w:pStyle w:val="Bibliography"/>
@@ -16996,8 +17624,8 @@
         <w:t xml:space="preserve">.</w:t>
       </w:r>
     </w:p>
-    <w:bookmarkEnd w:id="82"/>
-    <w:bookmarkStart w:id="83" w:name="ref-liu2022effectivetheory"/>
+    <w:bookmarkEnd w:id="85"/>
+    <w:bookmarkStart w:id="86" w:name="ref-liu2022effectivetheory"/>
     <w:p>
       <w:pPr>
         <w:pStyle w:val="Bibliography"/>
@@ -17031,8 +17659,8 @@
         <w:t xml:space="preserve">, 35:34651–63.</w:t>
       </w:r>
     </w:p>
-    <w:bookmarkEnd w:id="83"/>
-    <w:bookmarkStart w:id="84" w:name="ref-liu2022omnigrok"/>
+    <w:bookmarkEnd w:id="86"/>
+    <w:bookmarkStart w:id="87" w:name="ref-liu2022omnigrok"/>
     <w:p>
       <w:pPr>
         <w:pStyle w:val="Bibliography"/>
@@ -17066,8 +17694,8 @@
         <w:t xml:space="preserve">.</w:t>
       </w:r>
     </w:p>
-    <w:bookmarkEnd w:id="84"/>
-    <w:bookmarkStart w:id="85" w:name="ref-liu2023grokkingcompression"/>
+    <w:bookmarkEnd w:id="87"/>
+    <w:bookmarkStart w:id="88" w:name="ref-liu2023grokkingcompression"/>
     <w:p>
       <w:pPr>
         <w:pStyle w:val="Bibliography"/>
@@ -17095,8 +17723,8 @@
         <w:t xml:space="preserve">.</w:t>
       </w:r>
     </w:p>
-    <w:bookmarkEnd w:id="85"/>
-    <w:bookmarkStart w:id="86" w:name="ref-loshchilov2019decoupled"/>
+    <w:bookmarkEnd w:id="88"/>
+    <w:bookmarkStart w:id="89" w:name="ref-loshchilov2019decoupled"/>
     <w:p>
       <w:pPr>
         <w:pStyle w:val="Bibliography"/>
@@ -17124,8 +17752,8 @@
         <w:t xml:space="preserve">.</w:t>
       </w:r>
     </w:p>
-    <w:bookmarkEnd w:id="86"/>
-    <w:bookmarkStart w:id="87" w:name="ref-lyu2024dichotomy"/>
+    <w:bookmarkEnd w:id="89"/>
+    <w:bookmarkStart w:id="90" w:name="ref-lyu2024dichotomy"/>
     <w:p>
       <w:pPr>
         <w:pStyle w:val="Bibliography"/>
@@ -17159,8 +17787,8 @@
         <w:t xml:space="preserve">.</w:t>
       </w:r>
     </w:p>
-    <w:bookmarkEnd w:id="87"/>
-    <w:bookmarkStart w:id="88" w:name="ref-mccracken2025universalabstract"/>
+    <w:bookmarkEnd w:id="90"/>
+    <w:bookmarkStart w:id="91" w:name="ref-mccracken2025universalabstract"/>
     <w:p>
       <w:pPr>
         <w:pStyle w:val="Bibliography"/>
@@ -17188,8 +17816,8 @@
         <w:t xml:space="preserve">.</w:t>
       </w:r>
     </w:p>
-    <w:bookmarkEnd w:id="88"/>
-    <w:bookmarkStart w:id="89" w:name="ref-demellokoch2025twophase"/>
+    <w:bookmarkEnd w:id="91"/>
+    <w:bookmarkStart w:id="92" w:name="ref-demellokoch2025twophase"/>
     <w:p>
       <w:pPr>
         <w:pStyle w:val="Bibliography"/>
@@ -17217,8 +17845,8 @@
         <w:t xml:space="preserve">.</w:t>
       </w:r>
     </w:p>
-    <w:bookmarkEnd w:id="89"/>
-    <w:bookmarkStart w:id="90" w:name="ref-merrill2022saturated"/>
+    <w:bookmarkEnd w:id="92"/>
+    <w:bookmarkStart w:id="93" w:name="ref-merrill2022saturated"/>
     <w:p>
       <w:pPr>
         <w:pStyle w:val="Bibliography"/>
@@ -17246,8 +17874,8 @@
         <w:t xml:space="preserve">.</w:t>
       </w:r>
     </w:p>
-    <w:bookmarkEnd w:id="90"/>
-    <w:bookmarkStart w:id="91" w:name="ref-mohamadi2024whygrok"/>
+    <w:bookmarkEnd w:id="93"/>
+    <w:bookmarkStart w:id="94" w:name="ref-mohamadi2024whygrok"/>
     <w:p>
       <w:pPr>
         <w:pStyle w:val="Bibliography"/>
@@ -17281,8 +17909,8 @@
         <w:t xml:space="preserve">.</w:t>
       </w:r>
     </w:p>
-    <w:bookmarkEnd w:id="91"/>
-    <w:bookmarkStart w:id="92" w:name="ref-nanda2023progress"/>
+    <w:bookmarkEnd w:id="94"/>
+    <w:bookmarkStart w:id="95" w:name="ref-nanda2023progress"/>
     <w:p>
       <w:pPr>
         <w:pStyle w:val="Bibliography"/>
@@ -17316,8 +17944,8 @@
         <w:t xml:space="preserve">.</w:t>
       </w:r>
     </w:p>
-    <w:bookmarkEnd w:id="92"/>
-    <w:bookmarkStart w:id="93" w:name="ref-power2022grokking"/>
+    <w:bookmarkEnd w:id="95"/>
+    <w:bookmarkStart w:id="96" w:name="ref-power2022grokking"/>
     <w:p>
       <w:pPr>
         <w:pStyle w:val="Bibliography"/>
@@ -17345,8 +17973,8 @@
         <w:t xml:space="preserve">.</w:t>
       </w:r>
     </w:p>
-    <w:bookmarkEnd w:id="93"/>
-    <w:bookmarkStart w:id="94" w:name="ref-prakash2026longhorizon"/>
+    <w:bookmarkEnd w:id="96"/>
+    <w:bookmarkStart w:id="97" w:name="ref-prakash2026longhorizon"/>
     <w:p>
       <w:pPr>
         <w:pStyle w:val="Bibliography"/>
@@ -17374,8 +18002,8 @@
         <w:t xml:space="preserve">.</w:t>
       </w:r>
     </w:p>
-    <w:bookmarkEnd w:id="94"/>
-    <w:bookmarkStart w:id="95" w:name="ref-prakash2026antigrokking"/>
+    <w:bookmarkEnd w:id="97"/>
+    <w:bookmarkStart w:id="98" w:name="ref-prakash2026antigrokking"/>
     <w:p>
       <w:pPr>
         <w:pStyle w:val="Bibliography"/>
@@ -17403,8 +18031,8 @@
         <w:t xml:space="preserve">.</w:t>
       </w:r>
     </w:p>
-    <w:bookmarkEnd w:id="95"/>
-    <w:bookmarkStart w:id="96" w:name="ref-rubin2024firstorder"/>
+    <w:bookmarkEnd w:id="98"/>
+    <w:bookmarkStart w:id="99" w:name="ref-rubin2024firstorder"/>
     <w:p>
       <w:pPr>
         <w:pStyle w:val="Bibliography"/>
@@ -17438,8 +18066,8 @@
         <w:t xml:space="preserve">.</w:t>
       </w:r>
     </w:p>
-    <w:bookmarkEnd w:id="96"/>
-    <w:bookmarkStart w:id="97" w:name="ref-singh2025datafallsshort"/>
+    <w:bookmarkEnd w:id="99"/>
+    <w:bookmarkStart w:id="100" w:name="ref-singh2025datafallsshort"/>
     <w:p>
       <w:pPr>
         <w:pStyle w:val="Bibliography"/>
@@ -17467,8 +18095,8 @@
         <w:t xml:space="preserve">.</w:t>
       </w:r>
     </w:p>
-    <w:bookmarkEnd w:id="97"/>
-    <w:bookmarkStart w:id="98" w:name="ref-sivasankar2026circuitsync"/>
+    <w:bookmarkEnd w:id="100"/>
+    <w:bookmarkStart w:id="101" w:name="ref-sivasankar2026circuitsync"/>
     <w:p>
       <w:pPr>
         <w:pStyle w:val="Bibliography"/>
@@ -17496,8 +18124,8 @@
         <w:t xml:space="preserve">.</w:t>
       </w:r>
     </w:p>
-    <w:bookmarkEnd w:id="98"/>
-    <w:bookmarkStart w:id="99" w:name="ref-strobl2024survey"/>
+    <w:bookmarkEnd w:id="101"/>
+    <w:bookmarkStart w:id="102" w:name="ref-strobl2024survey"/>
     <w:p>
       <w:pPr>
         <w:pStyle w:val="Bibliography"/>
@@ -17525,8 +18153,8 @@
         <w:t xml:space="preserve">.</w:t>
       </w:r>
     </w:p>
-    <w:bookmarkEnd w:id="99"/>
-    <w:bookmarkStart w:id="100" w:name="ref-su2021roformer"/>
+    <w:bookmarkEnd w:id="102"/>
+    <w:bookmarkStart w:id="103" w:name="ref-su2021roformer"/>
     <w:p>
       <w:pPr>
         <w:pStyle w:val="Bibliography"/>
@@ -17554,8 +18182,8 @@
         <w:t xml:space="preserve">.</w:t>
       </w:r>
     </w:p>
-    <w:bookmarkEnd w:id="100"/>
-    <w:bookmarkStart w:id="101" w:name="ref-truong2026spectralentropy"/>
+    <w:bookmarkEnd w:id="103"/>
+    <w:bookmarkStart w:id="104" w:name="ref-truong2026spectralentropy"/>
     <w:p>
       <w:pPr>
         <w:pStyle w:val="Bibliography"/>
@@ -17583,8 +18211,8 @@
         <w:t xml:space="preserve">.</w:t>
       </w:r>
     </w:p>
-    <w:bookmarkEnd w:id="101"/>
-    <w:bookmarkStart w:id="102" w:name="ref-varma2023circuitefficiency"/>
+    <w:bookmarkEnd w:id="104"/>
+    <w:bookmarkStart w:id="105" w:name="ref-varma2023circuitefficiency"/>
     <w:p>
       <w:pPr>
         <w:pStyle w:val="Bibliography"/>
@@ -17612,8 +18240,8 @@
         <w:t xml:space="preserve">.</w:t>
       </w:r>
     </w:p>
-    <w:bookmarkEnd w:id="102"/>
-    <w:bookmarkStart w:id="103" w:name="ref-vaswani2017attention"/>
+    <w:bookmarkEnd w:id="105"/>
+    <w:bookmarkStart w:id="106" w:name="ref-vaswani2017attention"/>
     <w:p>
       <w:pPr>
         <w:pStyle w:val="Bibliography"/>
@@ -17647,8 +18275,8 @@
         <w:t xml:space="preserve">.</w:t>
       </w:r>
     </w:p>
-    <w:bookmarkEnd w:id="103"/>
-    <w:bookmarkStart w:id="104" w:name="ref-wang2026dimensional"/>
+    <w:bookmarkEnd w:id="106"/>
+    <w:bookmarkStart w:id="107" w:name="ref-wang2026dimensional"/>
     <w:p>
       <w:pPr>
         <w:pStyle w:val="Bibliography"/>
@@ -17676,8 +18304,8 @@
         <w:t xml:space="preserve">.</w:t>
       </w:r>
     </w:p>
-    <w:bookmarkEnd w:id="104"/>
-    <w:bookmarkStart w:id="105" w:name="ref-weiss2021thinking"/>
+    <w:bookmarkEnd w:id="107"/>
+    <w:bookmarkStart w:id="108" w:name="ref-weiss2021thinking"/>
     <w:p>
       <w:pPr>
         <w:pStyle w:val="Bibliography"/>
@@ -17711,8 +18339,8 @@
         <w:t xml:space="preserve">, 11080–90.</w:t>
       </w:r>
     </w:p>
-    <w:bookmarkEnd w:id="105"/>
-    <w:bookmarkStart w:id="106" w:name="ref-xie2024implicitbias"/>
+    <w:bookmarkEnd w:id="108"/>
+    <w:bookmarkStart w:id="109" w:name="ref-xie2024implicitbias"/>
     <w:p>
       <w:pPr>
         <w:pStyle w:val="Bibliography"/>
@@ -17772,8 +18400,8 @@
         <w:t xml:space="preserve">.</w:t>
       </w:r>
     </w:p>
-    <w:bookmarkEnd w:id="106"/>
-    <w:bookmarkStart w:id="107" w:name="ref-xu2025letmegrok"/>
+    <w:bookmarkEnd w:id="109"/>
+    <w:bookmarkStart w:id="110" w:name="ref-xu2025letmegrok"/>
     <w:p>
       <w:pPr>
         <w:pStyle w:val="Bibliography"/>
@@ -17807,8 +18435,8 @@
         <w:t xml:space="preserve">.</w:t>
       </w:r>
     </w:p>
-    <w:bookmarkEnd w:id="107"/>
-    <w:bookmarkStart w:id="108" w:name="ref-yao2021boundedhierarchical"/>
+    <w:bookmarkEnd w:id="110"/>
+    <w:bookmarkStart w:id="111" w:name="ref-yao2021boundedhierarchical"/>
     <w:p>
       <w:pPr>
         <w:pStyle w:val="Bibliography"/>
@@ -17842,8 +18470,8 @@
         <w:t xml:space="preserve">.</w:t>
       </w:r>
     </w:p>
-    <w:bookmarkEnd w:id="108"/>
-    <w:bookmarkStart w:id="109" w:name="ref-zhang2021longtailed"/>
+    <w:bookmarkEnd w:id="111"/>
+    <w:bookmarkStart w:id="112" w:name="ref-zhang2021longtailed"/>
     <w:p>
       <w:pPr>
         <w:pStyle w:val="Bibliography"/>
@@ -17871,8 +18499,8 @@
         <w:t xml:space="preserve">.</w:t>
       </w:r>
     </w:p>
-    <w:bookmarkEnd w:id="109"/>
-    <w:bookmarkStart w:id="110" w:name="ref-zhao2026grok"/>
+    <w:bookmarkEnd w:id="112"/>
+    <w:bookmarkStart w:id="113" w:name="ref-zhao2026grok"/>
     <w:p>
       <w:pPr>
         <w:pStyle w:val="Bibliography"/>
@@ -17906,8 +18534,8 @@
         <w:t xml:space="preserve">, 26114–30.</w:t>
       </w:r>
     </w:p>
-    <w:bookmarkEnd w:id="110"/>
-    <w:bookmarkStart w:id="111" w:name="ref-zhou2025neuralgrok"/>
+    <w:bookmarkEnd w:id="113"/>
+    <w:bookmarkStart w:id="114" w:name="ref-zhou2025neuralgrok"/>
     <w:p>
       <w:pPr>
         <w:pStyle w:val="Bibliography"/>
@@ -17935,8 +18563,8 @@
         <w:t xml:space="preserve">.</w:t>
       </w:r>
     </w:p>
-    <w:bookmarkEnd w:id="111"/>
-    <w:bookmarkStart w:id="112" w:name="ref-zhu2024criticaldatasize"/>
+    <w:bookmarkEnd w:id="114"/>
+    <w:bookmarkStart w:id="115" w:name="ref-zhu2024criticaldatasize"/>
     <w:p>
       <w:pPr>
         <w:pStyle w:val="Bibliography"/>
@@ -17964,9 +18592,9 @@
         <w:t xml:space="preserve">.</w:t>
       </w:r>
     </w:p>
-    <w:bookmarkEnd w:id="112"/>
-    <w:bookmarkEnd w:id="113"/>
-    <w:bookmarkEnd w:id="114"/>
+    <w:bookmarkEnd w:id="115"/>
+    <w:bookmarkEnd w:id="116"/>
+    <w:bookmarkEnd w:id="117"/>
     <w:sectPr/>
   </w:body>
 </w:document>

</xml_diff>

<commit_message>
Add M14 breadth-vs-composition decoupling experiment; fix 4 reporting gaps
Cross-checked two external ICLR review documents against the code/data.
Four low-cost precision fixes (threshold sensitivity, per-budget cosine
schedule, exact rare_short pool definition, higher-dose citation) surface
data that already existed but wasn't stated in the manuscript.

M14 (Appendix D) directly addresses the strict review's core objection:
holding bottleneck-state exclusion fixed and varying only injection-pool
breadth shows breadth among non-bottleneck states alone is sufficient for
rescue (0/8 -> 8/8 generalizing as K rises from 102 to 600 of 992 states),
without ever including a bottleneck state -- a clean, positive decoupling
of breadth from composition.

Co-Authored-By: Claude Sonnet 5 <noreply@anthropic.com>
</commit_message>
<xml_diff>
--- a/paper_rewriting_output/final_paper/paper.docx
+++ b/paper_rewriting_output/final_paper/paper.docx
@@ -3457,7 +3457,181 @@
         <w:t xml:space="preserve"> </w:t>
       </w:r>
       <w:r>
-        <w:t xml:space="preserve">otherwise. This rule is frozen prior to the experiments reported here and used unchanged throughout.</w:t>
+        <w:t xml:space="preserve">otherwise. This rule is frozen prior to the experiments reported here and used unchanged throughout. Moving the</w:t>
+      </w:r>
+      <w:r>
+        <w:t xml:space="preserve"> </w:t>
+      </w:r>
+      <m:oMath>
+        <m:sSub>
+          <m:e>
+            <m:r>
+              <m:t>A</m:t>
+            </m:r>
+          </m:e>
+          <m:sub>
+            <m:r>
+              <m:rPr>
+                <m:sty m:val="p"/>
+              </m:rPr>
+              <m:t>u</m:t>
+            </m:r>
+            <m:r>
+              <m:rPr>
+                <m:sty m:val="p"/>
+              </m:rPr>
+              <m:t>n</m:t>
+            </m:r>
+            <m:r>
+              <m:rPr>
+                <m:sty m:val="p"/>
+              </m:rPr>
+              <m:t>i</m:t>
+            </m:r>
+            <m:r>
+              <m:rPr>
+                <m:sty m:val="p"/>
+              </m:rPr>
+              <m:t>f</m:t>
+            </m:r>
+          </m:sub>
+        </m:sSub>
+      </m:oMath>
+      <w:r>
+        <w:t xml:space="preserve"> </w:t>
+      </w:r>
+      <w:r>
+        <w:t xml:space="preserve">cutoff to</w:t>
+      </w:r>
+      <w:r>
+        <w:t xml:space="preserve"> </w:t>
+      </w:r>
+      <m:oMath>
+        <m:r>
+          <m:t>0.85</m:t>
+        </m:r>
+      </m:oMath>
+      <w:r>
+        <w:t xml:space="preserve"> </w:t>
+      </w:r>
+      <w:r>
+        <w:t xml:space="preserve">or</w:t>
+      </w:r>
+      <w:r>
+        <w:t xml:space="preserve"> </w:t>
+      </w:r>
+      <m:oMath>
+        <m:r>
+          <m:t>0.95</m:t>
+        </m:r>
+      </m:oMath>
+      <w:r>
+        <w:t xml:space="preserve"> </w:t>
+      </w:r>
+      <w:r>
+        <w:t xml:space="preserve">shifts the overall grok fraction on the main grid by at most</w:t>
+      </w:r>
+      <w:r>
+        <w:t xml:space="preserve"> </w:t>
+      </w:r>
+      <m:oMath>
+        <m:r>
+          <m:t>6</m:t>
+        </m:r>
+      </m:oMath>
+      <w:r>
+        <w:t xml:space="preserve"> </w:t>
+      </w:r>
+      <w:r>
+        <w:t xml:space="preserve">percentage points (</w:t>
+      </w:r>
+      <m:oMath>
+        <m:r>
+          <m:t>0.516</m:t>
+        </m:r>
+      </m:oMath>
+      <w:r>
+        <w:t xml:space="preserve">/</w:t>
+      </w:r>
+      <m:oMath>
+        <m:r>
+          <m:t>0.508</m:t>
+        </m:r>
+      </m:oMath>
+      <w:r>
+        <w:t xml:space="preserve">/</w:t>
+      </w:r>
+      <m:oMath>
+        <m:r>
+          <m:t>0.452</m:t>
+        </m:r>
+      </m:oMath>
+      <w:r>
+        <w:t xml:space="preserve"> </w:t>
+      </w:r>
+      <w:r>
+        <w:t xml:space="preserve">at cutoffs</w:t>
+      </w:r>
+      <w:r>
+        <w:t xml:space="preserve"> </w:t>
+      </w:r>
+      <m:oMath>
+        <m:r>
+          <m:t>0.85</m:t>
+        </m:r>
+      </m:oMath>
+      <w:r>
+        <w:t xml:space="preserve">/</w:t>
+      </w:r>
+      <m:oMath>
+        <m:r>
+          <m:t>0.9</m:t>
+        </m:r>
+      </m:oMath>
+      <w:r>
+        <w:t xml:space="preserve">/</w:t>
+      </w:r>
+      <m:oMath>
+        <m:r>
+          <m:t>0.95</m:t>
+        </m:r>
+      </m:oMath>
+      <w:r>
+        <w:t xml:space="preserve">) and the</w:t>
+      </w:r>
+      <w:r>
+        <w:t xml:space="preserve"> </w:t>
+      </w:r>
+      <m:oMath>
+        <m:r>
+          <m:t>α</m:t>
+        </m:r>
+        <m:r>
+          <m:rPr>
+            <m:sty m:val="p"/>
+          </m:rPr>
+          <m:t>=</m:t>
+        </m:r>
+        <m:r>
+          <m:t>2.5</m:t>
+        </m:r>
+      </m:oMath>
+      <w:r>
+        <w:t xml:space="preserve"> </w:t>
+      </w:r>
+      <w:r>
+        <w:t xml:space="preserve">ceiling by less than</w:t>
+      </w:r>
+      <w:r>
+        <w:t xml:space="preserve"> </w:t>
+      </w:r>
+      <m:oMath>
+        <m:r>
+          <m:t>0.04</m:t>
+        </m:r>
+      </m:oMath>
+      <w:r>
+        <w:t xml:space="preserve">, so the qualitative topology is not an artifact of the particular threshold.</w:t>
       </w:r>
     </w:p>
     <w:bookmarkEnd w:id="24"/>
@@ -6089,7 +6263,7 @@
         <w:t xml:space="preserve">,</w:t>
       </w:r>
       <w:r>
-        <w:t xml:space="preserve">000 steps each show higher mean accuracy at the longer budget, with one cell reaching full generalization at the extended budget from a partial state at the shorter one. Deep in the interior, at</w:t>
+        <w:t xml:space="preserve">000 steps each show higher mean accuracy at the longer budget, with one cell reaching full generalization at the extended budget from a partial state at the shorter one. Each budget uses its own cosine-annealed schedule over its full length (§3.1), so the 60k and 240k runs are two independently-scheduled training protocols rather than the same trajectory observed at two checkpoints; we interpret the budget comparisons accordingly. Deep in the interior, at</w:t>
       </w:r>
       <w:r>
         <w:t xml:space="preserve"> </w:t>
@@ -9092,7 +9266,137 @@
         <w:t xml:space="preserve"> </w:t>
       </w:r>
       <w:r>
-        <w:t xml:space="preserve">already assigns positive probability to every state, so what the three controls vary is not presence versus absence of support but how broadly the injected slot itself is drawn: from the same head-concentrated distribution as the rest of the batch, from a small targeted set of rare-but-short states, or uniformly across the entire state space. Injecting one slot drawn from the</w:t>
+        <w:t xml:space="preserve">already assigns positive probability to every state, so what the three controls vary is not presence versus absence of support but how broadly the injected slot itself is drawn: from the same head-concentrated distribution as the rest of the batch, from a small targeted set of rare-but-short states (states with carry-chain length</w:t>
+      </w:r>
+      <w:r>
+        <w:t xml:space="preserve"> </w:t>
+      </w:r>
+      <m:oMath>
+        <m:r>
+          <m:t>c</m:t>
+        </m:r>
+        <m:d>
+          <m:dPr>
+            <m:begChr m:val="("/>
+            <m:endChr m:val=")"/>
+            <m:sepChr m:val=""/>
+            <m:grow/>
+          </m:dPr>
+          <m:e>
+            <m:r>
+              <m:t>x</m:t>
+            </m:r>
+          </m:e>
+        </m:d>
+        <m:r>
+          <m:rPr>
+            <m:sty m:val="p"/>
+          </m:rPr>
+          <m:t>&lt;</m:t>
+        </m:r>
+        <m:r>
+          <m:t>n</m:t>
+        </m:r>
+        <m:r>
+          <m:rPr>
+            <m:sty m:val="p"/>
+          </m:rPr>
+          <m:t>/</m:t>
+        </m:r>
+        <m:r>
+          <m:t>2</m:t>
+        </m:r>
+      </m:oMath>
+      <w:r>
+        <w:t xml:space="preserve">, restricted to the</w:t>
+      </w:r>
+      <w:r>
+        <w:t xml:space="preserve"> </w:t>
+      </w:r>
+      <m:oMath>
+        <m:r>
+          <m:t>N</m:t>
+        </m:r>
+        <m:r>
+          <m:rPr>
+            <m:sty m:val="p"/>
+          </m:rPr>
+          <m:t>/</m:t>
+        </m:r>
+        <m:r>
+          <m:t>10</m:t>
+        </m:r>
+      </m:oMath>
+      <w:r>
+        <w:t xml:space="preserve"> </w:t>
+      </w:r>
+      <w:r>
+        <w:t xml:space="preserve">such states with the lowest</w:t>
+      </w:r>
+      <w:r>
+        <w:t xml:space="preserve"> </w:t>
+      </w:r>
+      <m:oMath>
+        <m:sSub>
+          <m:e>
+            <m:r>
+              <m:t>P</m:t>
+            </m:r>
+          </m:e>
+          <m:sub>
+            <m:r>
+              <m:t>α</m:t>
+            </m:r>
+          </m:sub>
+        </m:sSub>
+      </m:oMath>
+      <w:r>
+        <w:t xml:space="preserve"> </w:t>
+      </w:r>
+      <w:r>
+        <w:t xml:space="preserve">weight, i.e. excluding the bottleneck states with</w:t>
+      </w:r>
+      <w:r>
+        <w:t xml:space="preserve"> </w:t>
+      </w:r>
+      <m:oMath>
+        <m:r>
+          <m:t>c</m:t>
+        </m:r>
+        <m:d>
+          <m:dPr>
+            <m:begChr m:val="("/>
+            <m:endChr m:val=")"/>
+            <m:sepChr m:val=""/>
+            <m:grow/>
+          </m:dPr>
+          <m:e>
+            <m:r>
+              <m:t>x</m:t>
+            </m:r>
+          </m:e>
+        </m:d>
+        <m:r>
+          <m:rPr>
+            <m:sty m:val="p"/>
+          </m:rPr>
+          <m:t>≥</m:t>
+        </m:r>
+        <m:r>
+          <m:t>n</m:t>
+        </m:r>
+        <m:r>
+          <m:rPr>
+            <m:sty m:val="p"/>
+          </m:rPr>
+          <m:t>/</m:t>
+        </m:r>
+        <m:r>
+          <m:t>2</m:t>
+        </m:r>
+      </m:oMath>
+      <w:r>
+        <w:t xml:space="preserve">), or uniformly across the entire state space. Injecting one slot drawn from the</w:t>
       </w:r>
       <w:r>
         <w:t xml:space="preserve"> </w:t>
@@ -9141,7 +9445,46 @@
         </m:r>
       </m:oMath>
       <w:r>
-        <w:t xml:space="preserve">). Among these three tested distributions, uniform full-state injection is the one that rescues; a same-distribution replacement slot and a small targeted rare-but-unstructured set are both insufficient. This ranking does not by itself decompose which of breadth, entropy, and state composition—all of which differ between uniform injection and the targeted set—is doing the work; a factorial design holding entropy or state composition fixed while varying breadth would be needed to decompose them, which we leave to future work. The same rescue succeeds with as few as</w:t>
+        <w:t xml:space="preserve">). Among these three tested distributions, uniform full-state injection is the one that rescues; a same-distribution replacement slot and a small targeted rare-but-unstructured set are both insufficient. This ranking alone conflates breadth, entropy, and state composition—all of which differ between uniform injection and the targeted set. Appendix D decomposes breadth from composition by holding bottleneck-state exclusion fixed (bottleneck states are never in the injection pool) and varying only pool breadth among the remaining non-bottleneck states: generalization rises monotonically with pool size and reaches complete rescue by</w:t>
+      </w:r>
+      <w:r>
+        <w:t xml:space="preserve"> </w:t>
+      </w:r>
+      <m:oMath>
+        <m:r>
+          <m:t>600</m:t>
+        </m:r>
+      </m:oMath>
+      <w:r>
+        <w:t xml:space="preserve"> </w:t>
+      </w:r>
+      <w:r>
+        <w:t xml:space="preserve">of the</w:t>
+      </w:r>
+      <w:r>
+        <w:t xml:space="preserve"> </w:t>
+      </w:r>
+      <m:oMath>
+        <m:r>
+          <m:t>992</m:t>
+        </m:r>
+      </m:oMath>
+      <w:r>
+        <w:t xml:space="preserve"> </w:t>
+      </w:r>
+      <w:r>
+        <w:t xml:space="preserve">non-bottleneck states, matching full-state uniform injection’s mean accuracy without ever including a bottleneck state. Breadth among non-bottleneck states is therefore sufficient for rescue at this cell; the partial credit of the</w:t>
+      </w:r>
+      <w:r>
+        <w:t xml:space="preserve"> </w:t>
+      </w:r>
+      <m:oMath>
+        <m:r>
+          <m:t>102</m:t>
+        </m:r>
+      </m:oMath>
+      <w:r>
+        <w:t xml:space="preserve">-state rare-but-short-carry pool reflects insufficient breadth rather than the absence of bottleneck states. This does not further decompose breadth from entropy, since a larger pool of non-bottleneck states also has higher entropy; we leave that finer distinction to future work. The same rescue succeeds with as few as</w:t>
       </w:r>
       <w:r>
         <w:t xml:space="preserve"> </w:t>
@@ -9184,7 +9527,87 @@
         </m:r>
       </m:oMath>
       <w:r>
-        <w:t xml:space="preserve">-step budget, indicating the effect operates quickly rather than through slow accumulation.</w:t>
+        <w:t xml:space="preserve">-step budget, indicating the effect operates quickly rather than through slow accumulation. At a higher dose (</w:t>
+      </w:r>
+      <m:oMath>
+        <m:r>
+          <m:t>k</m:t>
+        </m:r>
+        <m:r>
+          <m:rPr>
+            <m:sty m:val="p"/>
+          </m:rPr>
+          <m:t>=</m:t>
+        </m:r>
+        <m:r>
+          <m:t>2</m:t>
+        </m:r>
+      </m:oMath>
+      <w:r>
+        <w:t xml:space="preserve"> </w:t>
+      </w:r>
+      <w:r>
+        <w:t xml:space="preserve">per 128,</w:t>
+      </w:r>
+      <w:r>
+        <w:t xml:space="preserve"> </w:t>
+      </w:r>
+      <m:oMath>
+        <m:r>
+          <m:t>p</m:t>
+        </m:r>
+        <m:r>
+          <m:rPr>
+            <m:sty m:val="p"/>
+          </m:rPr>
+          <m:t>≈</m:t>
+        </m:r>
+        <m:r>
+          <m:t>1.56</m:t>
+        </m:r>
+        <m:r>
+          <m:rPr>
+            <m:sty m:val="p"/>
+          </m:rPr>
+          <m:t>%</m:t>
+        </m:r>
+      </m:oMath>
+      <w:r>
+        <w:t xml:space="preserve">) under the original batch-varying protocol, all eight seeds generalize at every tested</w:t>
+      </w:r>
+      <w:r>
+        <w:t xml:space="preserve"> </w:t>
+      </w:r>
+      <m:oMath>
+        <m:r>
+          <m:t>α</m:t>
+        </m:r>
+      </m:oMath>
+      <w:r>
+        <w:t xml:space="preserve">, consistent with the deconfounded sweep’s plateau beyond</w:t>
+      </w:r>
+      <w:r>
+        <w:t xml:space="preserve"> </w:t>
+      </w:r>
+      <m:oMath>
+        <m:r>
+          <m:t>q</m:t>
+        </m:r>
+        <m:r>
+          <m:rPr>
+            <m:sty m:val="p"/>
+          </m:rPr>
+          <m:t>=</m:t>
+        </m:r>
+        <m:r>
+          <m:t>0.75</m:t>
+        </m:r>
+      </m:oMath>
+      <w:r>
+        <w:t xml:space="preserve"> </w:t>
+      </w:r>
+      <w:r>
+        <w:t xml:space="preserve">rather than a renewed rise.</w:t>
       </w:r>
     </w:p>
     <w:bookmarkEnd w:id="43"/>
@@ -14087,7 +14510,7 @@
         </w:r>
       </w:hyperlink>
       <w:r>
-        <w:t xml:space="preserve">) does not decompose breadth from entropy and state composition, which are confounded in the tested distributions.</w:t>
+        <w:t xml:space="preserve">, Appendix D) shows breadth among non-bottleneck states is sufficient for rescue, but does not further decompose breadth from entropy.</w:t>
       </w:r>
     </w:p>
     <w:bookmarkEnd w:id="61"/>
@@ -16660,7 +17083,7 @@
     </w:tbl>
     <w:bookmarkEnd w:id="69"/>
     <w:bookmarkEnd w:id="70"/>
-    <w:bookmarkStart w:id="117" w:name="app:doseclean"/>
+    <w:bookmarkStart w:id="72" w:name="app:doseclean"/>
     <w:p>
       <w:pPr>
         <w:pStyle w:val="Heading1"/>
@@ -17188,8 +17611,799 @@
       </w:tr>
     </w:tbl>
     <w:bookmarkEnd w:id="71"/>
-    <w:bookmarkStart w:id="116" w:name="refs"/>
-    <w:bookmarkStart w:id="72" w:name="ref-bengio2009curriculum"/>
+    <w:bookmarkEnd w:id="72"/>
+    <w:bookmarkStart w:id="119" w:name="app:breadth"/>
+    <w:p>
+      <w:pPr>
+        <w:pStyle w:val="Heading1"/>
+      </w:pPr>
+      <w:r>
+        <w:rPr>
+          <w:rStyle w:val="SectionNumber"/>
+        </w:rPr>
+        <w:t xml:space="preserve">10</w:t>
+      </w:r>
+      <w:r>
+        <w:tab/>
+      </w:r>
+      <w:r>
+        <w:t xml:space="preserve">Breadth versus composition in the injection pool</w:t>
+      </w:r>
+    </w:p>
+    <w:p>
+      <w:pPr>
+        <w:pStyle w:val="FirstParagraph"/>
+      </w:pPr>
+      <w:r>
+        <w:t xml:space="preserve">The rescue comparison in §</w:t>
+      </w:r>
+      <w:hyperlink w:anchor="sec:results-rescue">
+        <w:r>
+          <w:rPr>
+            <w:rStyle w:val="Hyperlink"/>
+          </w:rPr>
+          <w:t xml:space="preserve">4.2</w:t>
+        </w:r>
+      </w:hyperlink>
+      <w:r>
+        <w:t xml:space="preserve"> </w:t>
+      </w:r>
+      <w:r>
+        <w:t xml:space="preserve">shows that a targeted pool of the</w:t>
+      </w:r>
+      <w:r>
+        <w:t xml:space="preserve"> </w:t>
+      </w:r>
+      <m:oMath>
+        <m:r>
+          <m:t>N</m:t>
+        </m:r>
+        <m:r>
+          <m:rPr>
+            <m:sty m:val="p"/>
+          </m:rPr>
+          <m:t>/</m:t>
+        </m:r>
+        <m:r>
+          <m:t>10</m:t>
+        </m:r>
+        <m:r>
+          <m:rPr>
+            <m:sty m:val="p"/>
+          </m:rPr>
+          <m:t>=</m:t>
+        </m:r>
+        <m:r>
+          <m:t>102</m:t>
+        </m:r>
+      </m:oMath>
+      <w:r>
+        <w:t xml:space="preserve"> </w:t>
+      </w:r>
+      <w:r>
+        <w:t xml:space="preserve">rarest non-bottleneck states (§3.4’s rare-but-short-carry pool, excluding all bottleneck states with carry length</w:t>
+      </w:r>
+      <w:r>
+        <w:t xml:space="preserve"> </w:t>
+      </w:r>
+      <m:oMath>
+        <m:r>
+          <m:t>c</m:t>
+        </m:r>
+        <m:d>
+          <m:dPr>
+            <m:begChr m:val="("/>
+            <m:endChr m:val=")"/>
+            <m:sepChr m:val=""/>
+            <m:grow/>
+          </m:dPr>
+          <m:e>
+            <m:r>
+              <m:t>x</m:t>
+            </m:r>
+          </m:e>
+        </m:d>
+        <m:r>
+          <m:rPr>
+            <m:sty m:val="p"/>
+          </m:rPr>
+          <m:t>≥</m:t>
+        </m:r>
+        <m:r>
+          <m:t>n</m:t>
+        </m:r>
+        <m:r>
+          <m:rPr>
+            <m:sty m:val="p"/>
+          </m:rPr>
+          <m:t>/</m:t>
+        </m:r>
+        <m:r>
+          <m:t>2</m:t>
+        </m:r>
+      </m:oMath>
+      <w:r>
+        <w:t xml:space="preserve">) achieves only partial credit (mean</w:t>
+      </w:r>
+      <w:r>
+        <w:t xml:space="preserve"> </w:t>
+      </w:r>
+      <m:oMath>
+        <m:r>
+          <m:t>0.750</m:t>
+        </m:r>
+      </m:oMath>
+      <w:r>
+        <w:t xml:space="preserve">), while injection drawn from the full state space—which does include the 32 bottleneck states—achieves complete rescue (mean</w:t>
+      </w:r>
+      <w:r>
+        <w:t xml:space="preserve"> </w:t>
+      </w:r>
+      <m:oMath>
+        <m:r>
+          <m:t>0.956</m:t>
+        </m:r>
+      </m:oMath>
+      <w:r>
+        <w:t xml:space="preserve">). Because these two conditions differ in both breadth (102 vs. 1024 candidate states) and composition (bottleneck states excluded vs. included), this comparison alone cannot say which property is responsible.</w:t>
+      </w:r>
+    </w:p>
+    <w:p>
+      <w:pPr>
+        <w:pStyle w:val="BodyText"/>
+      </w:pPr>
+      <w:r>
+        <w:t xml:space="preserve">We isolate breadth by holding composition fixed: bottleneck states (</w:t>
+      </w:r>
+      <m:oMath>
+        <m:r>
+          <m:t>c</m:t>
+        </m:r>
+        <m:d>
+          <m:dPr>
+            <m:begChr m:val="("/>
+            <m:endChr m:val=")"/>
+            <m:sepChr m:val=""/>
+            <m:grow/>
+          </m:dPr>
+          <m:e>
+            <m:r>
+              <m:t>x</m:t>
+            </m:r>
+          </m:e>
+        </m:d>
+        <m:r>
+          <m:rPr>
+            <m:sty m:val="p"/>
+          </m:rPr>
+          <m:t>≥</m:t>
+        </m:r>
+        <m:r>
+          <m:t>n</m:t>
+        </m:r>
+        <m:r>
+          <m:rPr>
+            <m:sty m:val="p"/>
+          </m:rPr>
+          <m:t>/</m:t>
+        </m:r>
+        <m:r>
+          <m:t>2</m:t>
+        </m:r>
+      </m:oMath>
+      <w:r>
+        <w:t xml:space="preserve">, 32 of 1024 states) are excluded from the injection pool at every setting, and only the pool size</w:t>
+      </w:r>
+      <w:r>
+        <w:t xml:space="preserve"> </w:t>
+      </w:r>
+      <m:oMath>
+        <m:r>
+          <m:t>K</m:t>
+        </m:r>
+      </m:oMath>
+      <w:r>
+        <w:t xml:space="preserve"> </w:t>
+      </w:r>
+      <w:r>
+        <w:t xml:space="preserve">among the remaining 992 non-bottleneck states is varied,</w:t>
+      </w:r>
+      <w:r>
+        <w:t xml:space="preserve"> </w:t>
+      </w:r>
+      <m:oMath>
+        <m:r>
+          <m:t>K</m:t>
+        </m:r>
+        <m:r>
+          <m:rPr>
+            <m:sty m:val="p"/>
+          </m:rPr>
+          <m:t>∈</m:t>
+        </m:r>
+        <m:r>
+          <m:rPr>
+            <m:sty m:val="p"/>
+          </m:rPr>
+          <m:t>{</m:t>
+        </m:r>
+        <m:r>
+          <m:t>102</m:t>
+        </m:r>
+        <m:r>
+          <m:rPr>
+            <m:sty m:val="p"/>
+          </m:rPr>
+          <m:t>,</m:t>
+        </m:r>
+        <m:r>
+          <m:t>300</m:t>
+        </m:r>
+        <m:r>
+          <m:rPr>
+            <m:sty m:val="p"/>
+          </m:rPr>
+          <m:t>,</m:t>
+        </m:r>
+        <m:r>
+          <m:t>600</m:t>
+        </m:r>
+        <m:r>
+          <m:rPr>
+            <m:sty m:val="p"/>
+          </m:rPr>
+          <m:t>,</m:t>
+        </m:r>
+        <m:r>
+          <m:t>992</m:t>
+        </m:r>
+        <m:r>
+          <m:rPr>
+            <m:sty m:val="p"/>
+          </m:rPr>
+          <m:t>}</m:t>
+        </m:r>
+      </m:oMath>
+      <w:r>
+        <w:t xml:space="preserve"> </w:t>
+      </w:r>
+      <w:r>
+        <w:t xml:space="preserve">(the</w:t>
+      </w:r>
+      <w:r>
+        <w:t xml:space="preserve"> </w:t>
+      </w:r>
+      <m:oMath>
+        <m:r>
+          <m:t>K</m:t>
+        </m:r>
+      </m:oMath>
+      <w:r>
+        <w:t xml:space="preserve"> </w:t>
+      </w:r>
+      <w:r>
+        <w:t xml:space="preserve">non-bottleneck states with the lowest</w:t>
+      </w:r>
+      <w:r>
+        <w:t xml:space="preserve"> </w:t>
+      </w:r>
+      <m:oMath>
+        <m:sSub>
+          <m:e>
+            <m:r>
+              <m:t>P</m:t>
+            </m:r>
+          </m:e>
+          <m:sub>
+            <m:r>
+              <m:t>α</m:t>
+            </m:r>
+          </m:sub>
+        </m:sSub>
+      </m:oMath>
+      <w:r>
+        <w:t xml:space="preserve"> </w:t>
+      </w:r>
+      <w:r>
+        <w:t xml:space="preserve">weight), at the same cell as the rescue battery (</w:t>
+      </w:r>
+      <m:oMath>
+        <m:r>
+          <m:t>α</m:t>
+        </m:r>
+        <m:r>
+          <m:rPr>
+            <m:sty m:val="p"/>
+          </m:rPr>
+          <m:t>=</m:t>
+        </m:r>
+        <m:r>
+          <m:t>2.5</m:t>
+        </m:r>
+      </m:oMath>
+      <w:r>
+        <w:t xml:space="preserve">,</w:t>
+      </w:r>
+      <w:r>
+        <w:t xml:space="preserve"> </w:t>
+      </w:r>
+      <m:oMath>
+        <m:r>
+          <m:t>λ</m:t>
+        </m:r>
+        <m:r>
+          <m:rPr>
+            <m:sty m:val="p"/>
+          </m:rPr>
+          <m:t>=</m:t>
+        </m:r>
+        <m:r>
+          <m:t>0.3</m:t>
+        </m:r>
+      </m:oMath>
+      <w:r>
+        <w:t xml:space="preserve">,</w:t>
+      </w:r>
+      <w:r>
+        <w:t xml:space="preserve"> </w:t>
+      </w:r>
+      <m:oMath>
+        <m:r>
+          <m:t>k</m:t>
+        </m:r>
+        <m:r>
+          <m:rPr>
+            <m:sty m:val="p"/>
+          </m:rPr>
+          <m:t>=</m:t>
+        </m:r>
+        <m:r>
+          <m:t>1</m:t>
+        </m:r>
+      </m:oMath>
+      <w:r>
+        <w:t xml:space="preserve"> </w:t>
+      </w:r>
+      <w:r>
+        <w:t xml:space="preserve">per batch of 128, 8 seeds).</w:t>
+      </w:r>
+      <w:r>
+        <w:t xml:space="preserve"> </w:t>
+      </w:r>
+      <m:oMath>
+        <m:r>
+          <m:t>K</m:t>
+        </m:r>
+        <m:r>
+          <m:rPr>
+            <m:sty m:val="p"/>
+          </m:rPr>
+          <m:t>=</m:t>
+        </m:r>
+        <m:r>
+          <m:t>102</m:t>
+        </m:r>
+      </m:oMath>
+      <w:r>
+        <w:t xml:space="preserve"> </w:t>
+      </w:r>
+      <w:r>
+        <w:t xml:space="preserve">reproduces the rare-but-short-carry pool exactly.</w:t>
+      </w:r>
+    </w:p>
+    <w:bookmarkStart w:id="73" w:name="tab:breadth"/>
+    <w:p>
+      <w:pPr>
+        <w:pStyle w:val="TableCaption"/>
+      </w:pPr>
+      <w:r>
+        <w:t xml:space="preserve">Breadth-only sweep with bottleneck states permanently excluded from the injection pool: fraction generalizing and mean</w:t>
+      </w:r>
+      <w:r>
+        <w:t xml:space="preserve"> </w:t>
+      </w:r>
+      <m:oMath>
+        <m:sSub>
+          <m:e>
+            <m:r>
+              <m:t>A</m:t>
+            </m:r>
+          </m:e>
+          <m:sub>
+            <m:r>
+              <m:rPr>
+                <m:sty m:val="p"/>
+              </m:rPr>
+              <m:t>u</m:t>
+            </m:r>
+            <m:r>
+              <m:rPr>
+                <m:sty m:val="p"/>
+              </m:rPr>
+              <m:t>n</m:t>
+            </m:r>
+            <m:r>
+              <m:rPr>
+                <m:sty m:val="p"/>
+              </m:rPr>
+              <m:t>i</m:t>
+            </m:r>
+            <m:r>
+              <m:rPr>
+                <m:sty m:val="p"/>
+              </m:rPr>
+              <m:t>f</m:t>
+            </m:r>
+          </m:sub>
+        </m:sSub>
+      </m:oMath>
+      <w:r>
+        <w:t xml:space="preserve">, 8 seeds/cell.</w:t>
+      </w:r>
+    </w:p>
+    <w:tbl>
+      <w:tblPr>
+        <w:tblStyle w:val="Table"/>
+        <w:tblW w:type="auto" w:w="0"/>
+        <w:tblLook w:firstRow="1" w:lastRow="0" w:firstColumn="0" w:lastColumn="0" w:noHBand="0" w:noVBand="0" w:val="0020"/>
+        <w:jc w:val="start"/>
+        <w:tblCaption w:val="Breadth-only sweep with bottleneck states permanently excluded from the injection pool: fraction generalizing and mean A_{\mathrm{unif}}, 8 seeds/cell."/>
+      </w:tblPr>
+      <w:tblGrid>
+        <w:gridCol w:w="2640"/>
+        <w:gridCol w:w="2640"/>
+        <w:gridCol w:w="2640"/>
+      </w:tblGrid>
+      <w:tr>
+        <w:trPr>
+          <w:tblHeader w:val="true"/>
+        </w:trPr>
+        <w:tc>
+          <w:tcPr/>
+          <w:p>
+            <w:pPr>
+              <w:pStyle w:val="Compact"/>
+              <w:jc w:val="left"/>
+            </w:pPr>
+            <m:oMath>
+              <m:r>
+                <m:t>K</m:t>
+              </m:r>
+            </m:oMath>
+            <w:r>
+              <w:t xml:space="preserve"> </w:t>
+            </w:r>
+            <w:r>
+              <w:t xml:space="preserve">(non-bottleneck pool size)</w:t>
+            </w:r>
+          </w:p>
+        </w:tc>
+        <w:tc>
+          <w:tcPr/>
+          <w:p>
+            <w:pPr>
+              <w:pStyle w:val="Compact"/>
+              <w:jc w:val="center"/>
+            </w:pPr>
+            <w:r>
+              <w:t xml:space="preserve">Fraction generalizing</w:t>
+            </w:r>
+          </w:p>
+        </w:tc>
+        <w:tc>
+          <w:tcPr/>
+          <w:p>
+            <w:pPr>
+              <w:pStyle w:val="Compact"/>
+              <w:jc w:val="center"/>
+            </w:pPr>
+            <w:r>
+              <w:t xml:space="preserve">Mean</w:t>
+            </w:r>
+            <w:r>
+              <w:t xml:space="preserve"> </w:t>
+            </w:r>
+            <m:oMath>
+              <m:sSub>
+                <m:e>
+                  <m:r>
+                    <m:t>A</m:t>
+                  </m:r>
+                </m:e>
+                <m:sub>
+                  <m:r>
+                    <m:rPr>
+                      <m:sty m:val="p"/>
+                    </m:rPr>
+                    <m:t>u</m:t>
+                  </m:r>
+                  <m:r>
+                    <m:rPr>
+                      <m:sty m:val="p"/>
+                    </m:rPr>
+                    <m:t>n</m:t>
+                  </m:r>
+                  <m:r>
+                    <m:rPr>
+                      <m:sty m:val="p"/>
+                    </m:rPr>
+                    <m:t>i</m:t>
+                  </m:r>
+                  <m:r>
+                    <m:rPr>
+                      <m:sty m:val="p"/>
+                    </m:rPr>
+                    <m:t>f</m:t>
+                  </m:r>
+                </m:sub>
+              </m:sSub>
+            </m:oMath>
+          </w:p>
+        </w:tc>
+      </w:tr>
+      <w:tr>
+        <w:tc>
+          <w:tcPr/>
+          <w:p>
+            <w:pPr>
+              <w:pStyle w:val="Compact"/>
+              <w:jc w:val="left"/>
+            </w:pPr>
+            <w:r>
+              <w:t xml:space="preserve">102</w:t>
+            </w:r>
+          </w:p>
+        </w:tc>
+        <w:tc>
+          <w:tcPr/>
+          <w:p>
+            <w:pPr>
+              <w:pStyle w:val="Compact"/>
+              <w:jc w:val="center"/>
+            </w:pPr>
+            <w:r>
+              <w:t xml:space="preserve">0/8</w:t>
+            </w:r>
+          </w:p>
+        </w:tc>
+        <w:tc>
+          <w:tcPr/>
+          <w:p>
+            <w:pPr>
+              <w:pStyle w:val="Compact"/>
+              <w:jc w:val="center"/>
+            </w:pPr>
+            <w:r>
+              <w:t xml:space="preserve">0.750</w:t>
+            </w:r>
+          </w:p>
+        </w:tc>
+      </w:tr>
+      <w:tr>
+        <w:tc>
+          <w:tcPr/>
+          <w:p>
+            <w:pPr>
+              <w:pStyle w:val="Compact"/>
+              <w:jc w:val="left"/>
+            </w:pPr>
+            <w:r>
+              <w:t xml:space="preserve">300</w:t>
+            </w:r>
+          </w:p>
+        </w:tc>
+        <w:tc>
+          <w:tcPr/>
+          <w:p>
+            <w:pPr>
+              <w:pStyle w:val="Compact"/>
+              <w:jc w:val="center"/>
+            </w:pPr>
+            <w:r>
+              <w:t xml:space="preserve">1/8</w:t>
+            </w:r>
+          </w:p>
+        </w:tc>
+        <w:tc>
+          <w:tcPr/>
+          <w:p>
+            <w:pPr>
+              <w:pStyle w:val="Compact"/>
+              <w:jc w:val="center"/>
+            </w:pPr>
+            <w:r>
+              <w:t xml:space="preserve">0.852</w:t>
+            </w:r>
+          </w:p>
+        </w:tc>
+      </w:tr>
+      <w:tr>
+        <w:tc>
+          <w:tcPr/>
+          <w:p>
+            <w:pPr>
+              <w:pStyle w:val="Compact"/>
+              <w:jc w:val="left"/>
+            </w:pPr>
+            <w:r>
+              <w:t xml:space="preserve">600</w:t>
+            </w:r>
+          </w:p>
+        </w:tc>
+        <w:tc>
+          <w:tcPr/>
+          <w:p>
+            <w:pPr>
+              <w:pStyle w:val="Compact"/>
+              <w:jc w:val="center"/>
+            </w:pPr>
+            <w:r>
+              <w:t xml:space="preserve">8/8</w:t>
+            </w:r>
+          </w:p>
+        </w:tc>
+        <w:tc>
+          <w:tcPr/>
+          <w:p>
+            <w:pPr>
+              <w:pStyle w:val="Compact"/>
+              <w:jc w:val="center"/>
+            </w:pPr>
+            <w:r>
+              <w:t xml:space="preserve">0.947</w:t>
+            </w:r>
+          </w:p>
+        </w:tc>
+      </w:tr>
+      <w:tr>
+        <w:tc>
+          <w:tcPr/>
+          <w:p>
+            <w:pPr>
+              <w:pStyle w:val="Compact"/>
+              <w:jc w:val="left"/>
+            </w:pPr>
+            <w:r>
+              <w:t xml:space="preserve">992</w:t>
+            </w:r>
+          </w:p>
+        </w:tc>
+        <w:tc>
+          <w:tcPr/>
+          <w:p>
+            <w:pPr>
+              <w:pStyle w:val="Compact"/>
+              <w:jc w:val="center"/>
+            </w:pPr>
+            <w:r>
+              <w:t xml:space="preserve">7/8</w:t>
+            </w:r>
+          </w:p>
+        </w:tc>
+        <w:tc>
+          <w:tcPr/>
+          <w:p>
+            <w:pPr>
+              <w:pStyle w:val="Compact"/>
+              <w:jc w:val="center"/>
+            </w:pPr>
+            <w:r>
+              <w:t xml:space="preserve">0.949</w:t>
+            </w:r>
+          </w:p>
+        </w:tc>
+      </w:tr>
+    </w:tbl>
+    <w:bookmarkEnd w:id="73"/>
+    <w:p>
+      <w:pPr>
+        <w:pStyle w:val="BodyText"/>
+      </w:pPr>
+      <w:r>
+        <w:t xml:space="preserve">Generalization rises monotonically with</w:t>
+      </w:r>
+      <w:r>
+        <w:t xml:space="preserve"> </w:t>
+      </w:r>
+      <m:oMath>
+        <m:r>
+          <m:t>K</m:t>
+        </m:r>
+      </m:oMath>
+      <w:r>
+        <w:t xml:space="preserve"> </w:t>
+      </w:r>
+      <w:r>
+        <w:t xml:space="preserve">and reaches complete rescue at</w:t>
+      </w:r>
+      <w:r>
+        <w:t xml:space="preserve"> </w:t>
+      </w:r>
+      <m:oMath>
+        <m:r>
+          <m:t>K</m:t>
+        </m:r>
+        <m:r>
+          <m:rPr>
+            <m:sty m:val="p"/>
+          </m:rPr>
+          <m:t>=</m:t>
+        </m:r>
+        <m:r>
+          <m:t>600</m:t>
+        </m:r>
+      </m:oMath>
+      <w:r>
+        <w:t xml:space="preserve">, with</w:t>
+      </w:r>
+      <w:r>
+        <w:t xml:space="preserve"> </w:t>
+      </w:r>
+      <m:oMath>
+        <m:r>
+          <m:t>K</m:t>
+        </m:r>
+        <m:r>
+          <m:rPr>
+            <m:sty m:val="p"/>
+          </m:rPr>
+          <m:t>=</m:t>
+        </m:r>
+        <m:r>
+          <m:t>992</m:t>
+        </m:r>
+      </m:oMath>
+      <w:r>
+        <w:t xml:space="preserve"> </w:t>
+      </w:r>
+      <w:r>
+        <w:t xml:space="preserve">(all non-bottleneck states, still excluding every bottleneck state) statistically matching full-state uniform injection’s mean (</w:t>
+      </w:r>
+      <m:oMath>
+        <m:r>
+          <m:t>0.949</m:t>
+        </m:r>
+      </m:oMath>
+      <w:r>
+        <w:t xml:space="preserve"> </w:t>
+      </w:r>
+      <w:r>
+        <w:t xml:space="preserve">vs. </w:t>
+      </w:r>
+      <m:oMath>
+        <m:r>
+          <m:t>0.956</m:t>
+        </m:r>
+      </m:oMath>
+      <w:r>
+        <w:t xml:space="preserve">). Bottleneck-state inclusion is therefore not necessary for rescue at this cell: breadth among non-bottleneck states alone is sufficient once the pool is large enough, and the partial credit of the original</w:t>
+      </w:r>
+      <w:r>
+        <w:t xml:space="preserve"> </w:t>
+      </w:r>
+      <m:oMath>
+        <m:r>
+          <m:t>K</m:t>
+        </m:r>
+        <m:r>
+          <m:rPr>
+            <m:sty m:val="p"/>
+          </m:rPr>
+          <m:t>=</m:t>
+        </m:r>
+        <m:r>
+          <m:t>102</m:t>
+        </m:r>
+      </m:oMath>
+      <w:r>
+        <w:t xml:space="preserve"> </w:t>
+      </w:r>
+      <w:r>
+        <w:t xml:space="preserve">rare-but-short-carry pool reflects insufficient breadth rather than the absence of bottleneck states per se.</w:t>
+      </w:r>
+    </w:p>
+    <w:bookmarkStart w:id="118" w:name="refs"/>
+    <w:bookmarkStart w:id="74" w:name="ref-bengio2009curriculum"/>
     <w:p>
       <w:pPr>
         <w:pStyle w:val="Bibliography"/>
@@ -17223,8 +18437,8 @@
         <w:t xml:space="preserve">, 41–48.</w:t>
       </w:r>
     </w:p>
-    <w:bookmarkEnd w:id="72"/>
-    <w:bookmarkStart w:id="73" w:name="ref-bergstrasser2026succinct"/>
+    <w:bookmarkEnd w:id="74"/>
+    <w:bookmarkStart w:id="75" w:name="ref-bergstrasser2026succinct"/>
     <w:p>
       <w:pPr>
         <w:pStyle w:val="Bibliography"/>
@@ -17258,8 +18472,8 @@
         <w:t xml:space="preserve">.</w:t>
       </w:r>
     </w:p>
-    <w:bookmarkEnd w:id="73"/>
-    <w:bookmarkStart w:id="74" w:name="ref-bhattamishra2020ability"/>
+    <w:bookmarkEnd w:id="75"/>
+    <w:bookmarkStart w:id="76" w:name="ref-bhattamishra2020ability"/>
     <w:p>
       <w:pPr>
         <w:pStyle w:val="Bibliography"/>
@@ -17293,8 +18507,8 @@
         <w:t xml:space="preserve">.</w:t>
       </w:r>
     </w:p>
-    <w:bookmarkEnd w:id="74"/>
-    <w:bookmarkStart w:id="75" w:name="ref-bi2026falsifiable"/>
+    <w:bookmarkEnd w:id="76"/>
+    <w:bookmarkStart w:id="77" w:name="ref-bi2026falsifiable"/>
     <w:p>
       <w:pPr>
         <w:pStyle w:val="Bibliography"/>
@@ -17322,8 +18536,8 @@
         <w:t xml:space="preserve">.</w:t>
       </w:r>
     </w:p>
-    <w:bookmarkEnd w:id="75"/>
-    <w:bookmarkStart w:id="76" w:name="ref-carvalho2025grokkingexplained"/>
+    <w:bookmarkEnd w:id="77"/>
+    <w:bookmarkStart w:id="78" w:name="ref-carvalho2025grokkingexplained"/>
     <w:p>
       <w:pPr>
         <w:pStyle w:val="Bibliography"/>
@@ -17351,8 +18565,8 @@
         <w:t xml:space="preserve">.</w:t>
       </w:r>
     </w:p>
-    <w:bookmarkEnd w:id="76"/>
-    <w:bookmarkStart w:id="77" w:name="ref-chughtai2023toymodel"/>
+    <w:bookmarkEnd w:id="78"/>
+    <w:bookmarkStart w:id="79" w:name="ref-chughtai2023toymodel"/>
     <w:p>
       <w:pPr>
         <w:pStyle w:val="Bibliography"/>
@@ -17386,8 +18600,8 @@
         <w:t xml:space="preserve">.</w:t>
       </w:r>
     </w:p>
-    <w:bookmarkEnd w:id="77"/>
-    <w:bookmarkStart w:id="78" w:name="ref-dealvis2024longtailsurvey"/>
+    <w:bookmarkEnd w:id="79"/>
+    <w:bookmarkStart w:id="80" w:name="ref-dealvis2024longtailsurvey"/>
     <w:p>
       <w:pPr>
         <w:pStyle w:val="Bibliography"/>
@@ -17415,8 +18629,8 @@
         <w:t xml:space="preserve">.</w:t>
       </w:r>
     </w:p>
-    <w:bookmarkEnd w:id="78"/>
-    <w:bookmarkStart w:id="79" w:name="ref-demoss2024complexitydynamics"/>
+    <w:bookmarkEnd w:id="80"/>
+    <w:bookmarkStart w:id="81" w:name="ref-demoss2024complexitydynamics"/>
     <w:p>
       <w:pPr>
         <w:pStyle w:val="Bibliography"/>
@@ -17447,8 +18661,8 @@
         <w:t xml:space="preserve">482: 134859.</w:t>
       </w:r>
     </w:p>
-    <w:bookmarkEnd w:id="79"/>
-    <w:bookmarkStart w:id="80" w:name="ref-doshi2023togrok"/>
+    <w:bookmarkEnd w:id="81"/>
+    <w:bookmarkStart w:id="82" w:name="ref-doshi2023togrok"/>
     <w:p>
       <w:pPr>
         <w:pStyle w:val="Bibliography"/>
@@ -17476,8 +18690,8 @@
         <w:t xml:space="preserve">.</w:t>
       </w:r>
     </w:p>
-    <w:bookmarkEnd w:id="80"/>
-    <w:bookmarkStart w:id="81" w:name="ref-doshi2024modularpolynomials"/>
+    <w:bookmarkEnd w:id="82"/>
+    <w:bookmarkStart w:id="83" w:name="ref-doshi2024modularpolynomials"/>
     <w:p>
       <w:pPr>
         <w:pStyle w:val="Bibliography"/>
@@ -17505,8 +18719,8 @@
         <w:t xml:space="preserve">.</w:t>
       </w:r>
     </w:p>
-    <w:bookmarkEnd w:id="81"/>
-    <w:bookmarkStart w:id="82" w:name="ref-ebrahimi2020dyckn"/>
+    <w:bookmarkEnd w:id="83"/>
+    <w:bookmarkStart w:id="84" w:name="ref-ebrahimi2020dyckn"/>
     <w:p>
       <w:pPr>
         <w:pStyle w:val="Bibliography"/>
@@ -17537,8 +18751,8 @@
         <w:t xml:space="preserve">, 4301–6.</w:t>
       </w:r>
     </w:p>
-    <w:bookmarkEnd w:id="82"/>
-    <w:bookmarkStart w:id="83" w:name="ref-gromov2023grokkingmodular"/>
+    <w:bookmarkEnd w:id="84"/>
+    <w:bookmarkStart w:id="85" w:name="ref-gromov2023grokkingmodular"/>
     <w:p>
       <w:pPr>
         <w:pStyle w:val="Bibliography"/>
@@ -17566,8 +18780,8 @@
         <w:t xml:space="preserve">.</w:t>
       </w:r>
     </w:p>
-    <w:bookmarkEnd w:id="83"/>
-    <w:bookmarkStart w:id="84" w:name="ref-howe2026representationalpriors"/>
+    <w:bookmarkEnd w:id="85"/>
+    <w:bookmarkStart w:id="86" w:name="ref-howe2026representationalpriors"/>
     <w:p>
       <w:pPr>
         <w:pStyle w:val="Bibliography"/>
@@ -17595,8 +18809,8 @@
         <w:t xml:space="preserve">.</w:t>
       </w:r>
     </w:p>
-    <w:bookmarkEnd w:id="84"/>
-    <w:bookmarkStart w:id="85" w:name="ref-kim2026weightdecayclock"/>
+    <w:bookmarkEnd w:id="86"/>
+    <w:bookmarkStart w:id="87" w:name="ref-kim2026weightdecayclock"/>
     <w:p>
       <w:pPr>
         <w:pStyle w:val="Bibliography"/>
@@ -17624,8 +18838,8 @@
         <w:t xml:space="preserve">.</w:t>
       </w:r>
     </w:p>
-    <w:bookmarkEnd w:id="85"/>
-    <w:bookmarkStart w:id="86" w:name="ref-liu2022effectivetheory"/>
+    <w:bookmarkEnd w:id="87"/>
+    <w:bookmarkStart w:id="88" w:name="ref-liu2022effectivetheory"/>
     <w:p>
       <w:pPr>
         <w:pStyle w:val="Bibliography"/>
@@ -17659,8 +18873,8 @@
         <w:t xml:space="preserve">, 35:34651–63.</w:t>
       </w:r>
     </w:p>
-    <w:bookmarkEnd w:id="86"/>
-    <w:bookmarkStart w:id="87" w:name="ref-liu2022omnigrok"/>
+    <w:bookmarkEnd w:id="88"/>
+    <w:bookmarkStart w:id="89" w:name="ref-liu2022omnigrok"/>
     <w:p>
       <w:pPr>
         <w:pStyle w:val="Bibliography"/>
@@ -17694,8 +18908,8 @@
         <w:t xml:space="preserve">.</w:t>
       </w:r>
     </w:p>
-    <w:bookmarkEnd w:id="87"/>
-    <w:bookmarkStart w:id="88" w:name="ref-liu2023grokkingcompression"/>
+    <w:bookmarkEnd w:id="89"/>
+    <w:bookmarkStart w:id="90" w:name="ref-liu2023grokkingcompression"/>
     <w:p>
       <w:pPr>
         <w:pStyle w:val="Bibliography"/>
@@ -17723,8 +18937,8 @@
         <w:t xml:space="preserve">.</w:t>
       </w:r>
     </w:p>
-    <w:bookmarkEnd w:id="88"/>
-    <w:bookmarkStart w:id="89" w:name="ref-loshchilov2019decoupled"/>
+    <w:bookmarkEnd w:id="90"/>
+    <w:bookmarkStart w:id="91" w:name="ref-loshchilov2019decoupled"/>
     <w:p>
       <w:pPr>
         <w:pStyle w:val="Bibliography"/>
@@ -17752,8 +18966,8 @@
         <w:t xml:space="preserve">.</w:t>
       </w:r>
     </w:p>
-    <w:bookmarkEnd w:id="89"/>
-    <w:bookmarkStart w:id="90" w:name="ref-lyu2024dichotomy"/>
+    <w:bookmarkEnd w:id="91"/>
+    <w:bookmarkStart w:id="92" w:name="ref-lyu2024dichotomy"/>
     <w:p>
       <w:pPr>
         <w:pStyle w:val="Bibliography"/>
@@ -17787,8 +19001,8 @@
         <w:t xml:space="preserve">.</w:t>
       </w:r>
     </w:p>
-    <w:bookmarkEnd w:id="90"/>
-    <w:bookmarkStart w:id="91" w:name="ref-mccracken2025universalabstract"/>
+    <w:bookmarkEnd w:id="92"/>
+    <w:bookmarkStart w:id="93" w:name="ref-mccracken2025universalabstract"/>
     <w:p>
       <w:pPr>
         <w:pStyle w:val="Bibliography"/>
@@ -17816,8 +19030,8 @@
         <w:t xml:space="preserve">.</w:t>
       </w:r>
     </w:p>
-    <w:bookmarkEnd w:id="91"/>
-    <w:bookmarkStart w:id="92" w:name="ref-demellokoch2025twophase"/>
+    <w:bookmarkEnd w:id="93"/>
+    <w:bookmarkStart w:id="94" w:name="ref-demellokoch2025twophase"/>
     <w:p>
       <w:pPr>
         <w:pStyle w:val="Bibliography"/>
@@ -17845,8 +19059,8 @@
         <w:t xml:space="preserve">.</w:t>
       </w:r>
     </w:p>
-    <w:bookmarkEnd w:id="92"/>
-    <w:bookmarkStart w:id="93" w:name="ref-merrill2022saturated"/>
+    <w:bookmarkEnd w:id="94"/>
+    <w:bookmarkStart w:id="95" w:name="ref-merrill2022saturated"/>
     <w:p>
       <w:pPr>
         <w:pStyle w:val="Bibliography"/>
@@ -17874,8 +19088,8 @@
         <w:t xml:space="preserve">.</w:t>
       </w:r>
     </w:p>
-    <w:bookmarkEnd w:id="93"/>
-    <w:bookmarkStart w:id="94" w:name="ref-mohamadi2024whygrok"/>
+    <w:bookmarkEnd w:id="95"/>
+    <w:bookmarkStart w:id="96" w:name="ref-mohamadi2024whygrok"/>
     <w:p>
       <w:pPr>
         <w:pStyle w:val="Bibliography"/>
@@ -17909,8 +19123,8 @@
         <w:t xml:space="preserve">.</w:t>
       </w:r>
     </w:p>
-    <w:bookmarkEnd w:id="94"/>
-    <w:bookmarkStart w:id="95" w:name="ref-nanda2023progress"/>
+    <w:bookmarkEnd w:id="96"/>
+    <w:bookmarkStart w:id="97" w:name="ref-nanda2023progress"/>
     <w:p>
       <w:pPr>
         <w:pStyle w:val="Bibliography"/>
@@ -17944,8 +19158,8 @@
         <w:t xml:space="preserve">.</w:t>
       </w:r>
     </w:p>
-    <w:bookmarkEnd w:id="95"/>
-    <w:bookmarkStart w:id="96" w:name="ref-power2022grokking"/>
+    <w:bookmarkEnd w:id="97"/>
+    <w:bookmarkStart w:id="98" w:name="ref-power2022grokking"/>
     <w:p>
       <w:pPr>
         <w:pStyle w:val="Bibliography"/>
@@ -17973,8 +19187,8 @@
         <w:t xml:space="preserve">.</w:t>
       </w:r>
     </w:p>
-    <w:bookmarkEnd w:id="96"/>
-    <w:bookmarkStart w:id="97" w:name="ref-prakash2026longhorizon"/>
+    <w:bookmarkEnd w:id="98"/>
+    <w:bookmarkStart w:id="99" w:name="ref-prakash2026longhorizon"/>
     <w:p>
       <w:pPr>
         <w:pStyle w:val="Bibliography"/>
@@ -18002,8 +19216,8 @@
         <w:t xml:space="preserve">.</w:t>
       </w:r>
     </w:p>
-    <w:bookmarkEnd w:id="97"/>
-    <w:bookmarkStart w:id="98" w:name="ref-prakash2026antigrokking"/>
+    <w:bookmarkEnd w:id="99"/>
+    <w:bookmarkStart w:id="100" w:name="ref-prakash2026antigrokking"/>
     <w:p>
       <w:pPr>
         <w:pStyle w:val="Bibliography"/>
@@ -18031,8 +19245,8 @@
         <w:t xml:space="preserve">.</w:t>
       </w:r>
     </w:p>
-    <w:bookmarkEnd w:id="98"/>
-    <w:bookmarkStart w:id="99" w:name="ref-rubin2024firstorder"/>
+    <w:bookmarkEnd w:id="100"/>
+    <w:bookmarkStart w:id="101" w:name="ref-rubin2024firstorder"/>
     <w:p>
       <w:pPr>
         <w:pStyle w:val="Bibliography"/>
@@ -18066,8 +19280,8 @@
         <w:t xml:space="preserve">.</w:t>
       </w:r>
     </w:p>
-    <w:bookmarkEnd w:id="99"/>
-    <w:bookmarkStart w:id="100" w:name="ref-singh2025datafallsshort"/>
+    <w:bookmarkEnd w:id="101"/>
+    <w:bookmarkStart w:id="102" w:name="ref-singh2025datafallsshort"/>
     <w:p>
       <w:pPr>
         <w:pStyle w:val="Bibliography"/>
@@ -18095,8 +19309,8 @@
         <w:t xml:space="preserve">.</w:t>
       </w:r>
     </w:p>
-    <w:bookmarkEnd w:id="100"/>
-    <w:bookmarkStart w:id="101" w:name="ref-sivasankar2026circuitsync"/>
+    <w:bookmarkEnd w:id="102"/>
+    <w:bookmarkStart w:id="103" w:name="ref-sivasankar2026circuitsync"/>
     <w:p>
       <w:pPr>
         <w:pStyle w:val="Bibliography"/>
@@ -18124,8 +19338,8 @@
         <w:t xml:space="preserve">.</w:t>
       </w:r>
     </w:p>
-    <w:bookmarkEnd w:id="101"/>
-    <w:bookmarkStart w:id="102" w:name="ref-strobl2024survey"/>
+    <w:bookmarkEnd w:id="103"/>
+    <w:bookmarkStart w:id="104" w:name="ref-strobl2024survey"/>
     <w:p>
       <w:pPr>
         <w:pStyle w:val="Bibliography"/>
@@ -18153,8 +19367,8 @@
         <w:t xml:space="preserve">.</w:t>
       </w:r>
     </w:p>
-    <w:bookmarkEnd w:id="102"/>
-    <w:bookmarkStart w:id="103" w:name="ref-su2021roformer"/>
+    <w:bookmarkEnd w:id="104"/>
+    <w:bookmarkStart w:id="105" w:name="ref-su2021roformer"/>
     <w:p>
       <w:pPr>
         <w:pStyle w:val="Bibliography"/>
@@ -18182,8 +19396,8 @@
         <w:t xml:space="preserve">.</w:t>
       </w:r>
     </w:p>
-    <w:bookmarkEnd w:id="103"/>
-    <w:bookmarkStart w:id="104" w:name="ref-truong2026spectralentropy"/>
+    <w:bookmarkEnd w:id="105"/>
+    <w:bookmarkStart w:id="106" w:name="ref-truong2026spectralentropy"/>
     <w:p>
       <w:pPr>
         <w:pStyle w:val="Bibliography"/>
@@ -18211,8 +19425,8 @@
         <w:t xml:space="preserve">.</w:t>
       </w:r>
     </w:p>
-    <w:bookmarkEnd w:id="104"/>
-    <w:bookmarkStart w:id="105" w:name="ref-varma2023circuitefficiency"/>
+    <w:bookmarkEnd w:id="106"/>
+    <w:bookmarkStart w:id="107" w:name="ref-varma2023circuitefficiency"/>
     <w:p>
       <w:pPr>
         <w:pStyle w:val="Bibliography"/>
@@ -18240,8 +19454,8 @@
         <w:t xml:space="preserve">.</w:t>
       </w:r>
     </w:p>
-    <w:bookmarkEnd w:id="105"/>
-    <w:bookmarkStart w:id="106" w:name="ref-vaswani2017attention"/>
+    <w:bookmarkEnd w:id="107"/>
+    <w:bookmarkStart w:id="108" w:name="ref-vaswani2017attention"/>
     <w:p>
       <w:pPr>
         <w:pStyle w:val="Bibliography"/>
@@ -18275,8 +19489,8 @@
         <w:t xml:space="preserve">.</w:t>
       </w:r>
     </w:p>
-    <w:bookmarkEnd w:id="106"/>
-    <w:bookmarkStart w:id="107" w:name="ref-wang2026dimensional"/>
+    <w:bookmarkEnd w:id="108"/>
+    <w:bookmarkStart w:id="109" w:name="ref-wang2026dimensional"/>
     <w:p>
       <w:pPr>
         <w:pStyle w:val="Bibliography"/>
@@ -18304,8 +19518,8 @@
         <w:t xml:space="preserve">.</w:t>
       </w:r>
     </w:p>
-    <w:bookmarkEnd w:id="107"/>
-    <w:bookmarkStart w:id="108" w:name="ref-weiss2021thinking"/>
+    <w:bookmarkEnd w:id="109"/>
+    <w:bookmarkStart w:id="110" w:name="ref-weiss2021thinking"/>
     <w:p>
       <w:pPr>
         <w:pStyle w:val="Bibliography"/>
@@ -18339,8 +19553,8 @@
         <w:t xml:space="preserve">, 11080–90.</w:t>
       </w:r>
     </w:p>
-    <w:bookmarkEnd w:id="108"/>
-    <w:bookmarkStart w:id="109" w:name="ref-xie2024implicitbias"/>
+    <w:bookmarkEnd w:id="110"/>
+    <w:bookmarkStart w:id="111" w:name="ref-xie2024implicitbias"/>
     <w:p>
       <w:pPr>
         <w:pStyle w:val="Bibliography"/>
@@ -18400,8 +19614,8 @@
         <w:t xml:space="preserve">.</w:t>
       </w:r>
     </w:p>
-    <w:bookmarkEnd w:id="109"/>
-    <w:bookmarkStart w:id="110" w:name="ref-xu2025letmegrok"/>
+    <w:bookmarkEnd w:id="111"/>
+    <w:bookmarkStart w:id="112" w:name="ref-xu2025letmegrok"/>
     <w:p>
       <w:pPr>
         <w:pStyle w:val="Bibliography"/>
@@ -18435,8 +19649,8 @@
         <w:t xml:space="preserve">.</w:t>
       </w:r>
     </w:p>
-    <w:bookmarkEnd w:id="110"/>
-    <w:bookmarkStart w:id="111" w:name="ref-yao2021boundedhierarchical"/>
+    <w:bookmarkEnd w:id="112"/>
+    <w:bookmarkStart w:id="113" w:name="ref-yao2021boundedhierarchical"/>
     <w:p>
       <w:pPr>
         <w:pStyle w:val="Bibliography"/>
@@ -18470,8 +19684,8 @@
         <w:t xml:space="preserve">.</w:t>
       </w:r>
     </w:p>
-    <w:bookmarkEnd w:id="111"/>
-    <w:bookmarkStart w:id="112" w:name="ref-zhang2021longtailed"/>
+    <w:bookmarkEnd w:id="113"/>
+    <w:bookmarkStart w:id="114" w:name="ref-zhang2021longtailed"/>
     <w:p>
       <w:pPr>
         <w:pStyle w:val="Bibliography"/>
@@ -18499,8 +19713,8 @@
         <w:t xml:space="preserve">.</w:t>
       </w:r>
     </w:p>
-    <w:bookmarkEnd w:id="112"/>
-    <w:bookmarkStart w:id="113" w:name="ref-zhao2026grok"/>
+    <w:bookmarkEnd w:id="114"/>
+    <w:bookmarkStart w:id="115" w:name="ref-zhao2026grok"/>
     <w:p>
       <w:pPr>
         <w:pStyle w:val="Bibliography"/>
@@ -18534,8 +19748,8 @@
         <w:t xml:space="preserve">, 26114–30.</w:t>
       </w:r>
     </w:p>
-    <w:bookmarkEnd w:id="113"/>
-    <w:bookmarkStart w:id="114" w:name="ref-zhou2025neuralgrok"/>
+    <w:bookmarkEnd w:id="115"/>
+    <w:bookmarkStart w:id="116" w:name="ref-zhou2025neuralgrok"/>
     <w:p>
       <w:pPr>
         <w:pStyle w:val="Bibliography"/>
@@ -18563,8 +19777,8 @@
         <w:t xml:space="preserve">.</w:t>
       </w:r>
     </w:p>
-    <w:bookmarkEnd w:id="114"/>
-    <w:bookmarkStart w:id="115" w:name="ref-zhu2024criticaldatasize"/>
+    <w:bookmarkEnd w:id="116"/>
+    <w:bookmarkStart w:id="117" w:name="ref-zhu2024criticaldatasize"/>
     <w:p>
       <w:pPr>
         <w:pStyle w:val="Bibliography"/>
@@ -18592,9 +19806,9 @@
         <w:t xml:space="preserve">.</w:t>
       </w:r>
     </w:p>
-    <w:bookmarkEnd w:id="115"/>
-    <w:bookmarkEnd w:id="116"/>
     <w:bookmarkEnd w:id="117"/>
+    <w:bookmarkEnd w:id="118"/>
+    <w:bookmarkEnd w:id="119"/>
     <w:sectPr/>
   </w:body>
 </w:document>

</xml_diff>

<commit_message>
Fix Table 5/6 overflowing the page width
Robustness table (Table 5) was 119.35pt too wide and the related-work
comparison table (Table 6) was 98.99pt too wide, both spilling past the
text margin. Fixed with fixed-width p{} columns for long text cells,
footnotesize, and stacked two-line headers for Table 6's narrow columns.
Verified visually (page render) that both tables now sit fully within
the page margins.

Co-Authored-By: Claude Sonnet 5 <noreply@anthropic.com>
</commit_message>
<xml_diff>
--- a/paper_rewriting_output/final_paper/paper.docx
+++ b/paper_rewriting_output/final_paper/paper.docx
@@ -13890,7 +13890,7 @@
       <w:tblPr>
         <w:tblStyle w:val="Table"/>
         <w:tblW w:type="auto" w:w="0"/>
-        <w:tblLook w:firstRow="1" w:lastRow="0" w:firstColumn="0" w:lastColumn="0" w:noHBand="0" w:noVBand="0" w:val="0020"/>
+        <w:tblLook w:firstRow="0" w:lastRow="0" w:firstColumn="0" w:lastColumn="0" w:noHBand="0" w:noVBand="0" w:val="0000"/>
         <w:jc w:val="start"/>
         <w:tblCaption w:val="Comparison to the nearest prior work along the axes this paper contributes."/>
       </w:tblPr>
@@ -13904,9 +13904,6 @@
         <w:gridCol w:w="1131"/>
       </w:tblGrid>
       <w:tr>
-        <w:trPr>
-          <w:tblHeader w:val="true"/>
-        </w:trPr>
         <w:tc>
           <w:tcPr/>
           <w:p>
@@ -13924,7 +13921,7 @@
           <w:p>
             <w:pPr>
               <w:pStyle w:val="Compact"/>
-              <w:jc w:val="center"/>
+              <w:jc w:val="left"/>
             </w:pPr>
             <w:r>
               <w:t xml:space="preserve">Skew axis</w:t>
@@ -13936,59 +13933,39 @@
           <w:p>
             <w:pPr>
               <w:pStyle w:val="Compact"/>
-              <w:jc w:val="center"/>
-            </w:pPr>
-            <w:r>
-              <w:t xml:space="preserve">Finite-budget map</w:t>
-            </w:r>
-          </w:p>
-        </w:tc>
-        <w:tc>
-          <w:tcPr/>
-          <w:p>
-            <w:pPr>
-              <w:pStyle w:val="Compact"/>
-              <w:jc w:val="center"/>
-            </w:pPr>
-            <w:r>
-              <w:t xml:space="preserve">Rescue controls</w:t>
-            </w:r>
-          </w:p>
-        </w:tc>
-        <w:tc>
-          <w:tcPr/>
-          <w:p>
-            <w:pPr>
-              <w:pStyle w:val="Compact"/>
-              <w:jc w:val="center"/>
-            </w:pPr>
-            <w:r>
-              <w:t xml:space="preserve">Exposure match</w:t>
-            </w:r>
-          </w:p>
-        </w:tc>
-        <w:tc>
-          <w:tcPr/>
-          <w:p>
-            <w:pPr>
-              <w:pStyle w:val="Compact"/>
-              <w:jc w:val="center"/>
-            </w:pPr>
-            <w:r>
-              <w:t xml:space="preserve">Task transfer</w:t>
-            </w:r>
-          </w:p>
-        </w:tc>
-        <w:tc>
-          <w:tcPr/>
-          <w:p>
-            <w:pPr>
-              <w:pStyle w:val="Compact"/>
-              <w:jc w:val="center"/>
-            </w:pPr>
-            <w:r>
-              <w:t xml:space="preserve">Toy scale</w:t>
-            </w:r>
+            </w:pPr>
+          </w:p>
+        </w:tc>
+        <w:tc>
+          <w:tcPr/>
+          <w:p>
+            <w:pPr>
+              <w:pStyle w:val="Compact"/>
+            </w:pPr>
+          </w:p>
+        </w:tc>
+        <w:tc>
+          <w:tcPr/>
+          <w:p>
+            <w:pPr>
+              <w:pStyle w:val="Compact"/>
+            </w:pPr>
+          </w:p>
+        </w:tc>
+        <w:tc>
+          <w:tcPr/>
+          <w:p>
+            <w:pPr>
+              <w:pStyle w:val="Compact"/>
+            </w:pPr>
+          </w:p>
+        </w:tc>
+        <w:tc>
+          <w:tcPr/>
+          <w:p>
+            <w:pPr>
+              <w:pStyle w:val="Compact"/>
+            </w:pPr>
           </w:p>
         </w:tc>
       </w:tr>
@@ -14001,74 +13978,48 @@
               <w:jc w:val="left"/>
             </w:pPr>
             <w:r>
-              <w:t xml:space="preserve">Zhao</w:t>
-            </w:r>
-            <w:r>
-              <w:t xml:space="preserve"> </w:t>
-            </w:r>
-            <w:r>
-              <w:t xml:space="preserve">(2026)</w:t>
-            </w:r>
-          </w:p>
-        </w:tc>
-        <w:tc>
-          <w:tcPr/>
-          <w:p>
-            <w:pPr>
-              <w:pStyle w:val="Compact"/>
-              <w:jc w:val="center"/>
-            </w:pPr>
-            <w:r>
-              <w:t xml:space="preserve">discrete (2 pts)</w:t>
-            </w:r>
-          </w:p>
-        </w:tc>
-        <w:tc>
-          <w:tcPr/>
-          <w:p>
-            <w:pPr>
-              <w:pStyle w:val="Compact"/>
-              <w:jc w:val="center"/>
-            </w:pPr>
-            <w:r>
-              <w:t xml:space="preserve">—</w:t>
-            </w:r>
-          </w:p>
-        </w:tc>
-        <w:tc>
-          <w:tcPr/>
-          <w:p>
-            <w:pPr>
-              <w:pStyle w:val="Compact"/>
-              <w:jc w:val="center"/>
-            </w:pPr>
-            <w:r>
-              <w:t xml:space="preserve">—</w:t>
-            </w:r>
-          </w:p>
-        </w:tc>
-        <w:tc>
-          <w:tcPr/>
-          <w:p>
-            <w:pPr>
-              <w:pStyle w:val="Compact"/>
-              <w:jc w:val="center"/>
-            </w:pPr>
-            <w:r>
-              <w:t xml:space="preserve">—</w:t>
-            </w:r>
-          </w:p>
-        </w:tc>
-        <w:tc>
-          <w:tcPr/>
-          <w:p>
-            <w:pPr>
-              <w:pStyle w:val="Compact"/>
-              <w:jc w:val="center"/>
-            </w:pPr>
-            <w:r>
-              <w:t xml:space="preserve">—</w:t>
-            </w:r>
+              <w:t xml:space="preserve">budget map</w:t>
+            </w:r>
+          </w:p>
+        </w:tc>
+        <w:tc>
+          <w:tcPr/>
+          <w:p>
+            <w:pPr>
+              <w:pStyle w:val="Compact"/>
+            </w:pPr>
+          </w:p>
+        </w:tc>
+        <w:tc>
+          <w:tcPr/>
+          <w:p>
+            <w:pPr>
+              <w:pStyle w:val="Compact"/>
+            </w:pPr>
+          </w:p>
+        </w:tc>
+        <w:tc>
+          <w:tcPr/>
+          <w:p>
+            <w:pPr>
+              <w:pStyle w:val="Compact"/>
+            </w:pPr>
+          </w:p>
+        </w:tc>
+        <w:tc>
+          <w:tcPr/>
+          <w:p>
+            <w:pPr>
+              <w:pStyle w:val="Compact"/>
+            </w:pPr>
+          </w:p>
+        </w:tc>
+        <w:tc>
+          <w:tcPr/>
+          <w:p>
+            <w:pPr>
+              <w:pStyle w:val="Compact"/>
+            </w:pPr>
           </w:p>
         </w:tc>
         <w:tc>
@@ -14089,55 +14040,40 @@
               <w:jc w:val="left"/>
             </w:pPr>
             <w:r>
-              <w:t xml:space="preserve">Liu et al. </w:t>
-            </w:r>
-            <w:r>
-              <w:t xml:space="preserve">(2022; 2023)</w:t>
-            </w:r>
-          </w:p>
-        </w:tc>
-        <w:tc>
-          <w:tcPr/>
-          <w:p>
-            <w:pPr>
-              <w:pStyle w:val="Compact"/>
-              <w:jc w:val="center"/>
-            </w:pPr>
-            <w:r>
-              <w:t xml:space="preserve">data fraction</w:t>
-            </w:r>
-          </w:p>
-        </w:tc>
-        <w:tc>
-          <w:tcPr/>
-          <w:p>
-            <w:pPr>
-              <w:pStyle w:val="Compact"/>
-            </w:pPr>
-          </w:p>
-        </w:tc>
-        <w:tc>
-          <w:tcPr/>
-          <w:p>
-            <w:pPr>
-              <w:pStyle w:val="Compact"/>
-              <w:jc w:val="center"/>
-            </w:pPr>
-            <w:r>
-              <w:t xml:space="preserve">—</w:t>
-            </w:r>
-          </w:p>
-        </w:tc>
-        <w:tc>
-          <w:tcPr/>
-          <w:p>
-            <w:pPr>
-              <w:pStyle w:val="Compact"/>
-              <w:jc w:val="center"/>
-            </w:pPr>
-            <w:r>
-              <w:t xml:space="preserve">—</w:t>
-            </w:r>
+              <w:t xml:space="preserve">controls</w:t>
+            </w:r>
+          </w:p>
+        </w:tc>
+        <w:tc>
+          <w:tcPr/>
+          <w:p>
+            <w:pPr>
+              <w:pStyle w:val="Compact"/>
+            </w:pPr>
+          </w:p>
+        </w:tc>
+        <w:tc>
+          <w:tcPr/>
+          <w:p>
+            <w:pPr>
+              <w:pStyle w:val="Compact"/>
+            </w:pPr>
+          </w:p>
+        </w:tc>
+        <w:tc>
+          <w:tcPr/>
+          <w:p>
+            <w:pPr>
+              <w:pStyle w:val="Compact"/>
+            </w:pPr>
+          </w:p>
+        </w:tc>
+        <w:tc>
+          <w:tcPr/>
+          <w:p>
+            <w:pPr>
+              <w:pStyle w:val="Compact"/>
+            </w:pPr>
           </w:p>
         </w:tc>
         <w:tc>
@@ -14166,71 +14102,48 @@
               <w:jc w:val="left"/>
             </w:pPr>
             <w:r>
-              <w:t xml:space="preserve">Singh et al. </w:t>
-            </w:r>
-            <w:r>
-              <w:t xml:space="preserve">(2025)</w:t>
-            </w:r>
-          </w:p>
-        </w:tc>
-        <w:tc>
-          <w:tcPr/>
-          <w:p>
-            <w:pPr>
-              <w:pStyle w:val="Compact"/>
-              <w:jc w:val="center"/>
-            </w:pPr>
-            <w:r>
-              <w:t xml:space="preserve">data quantity</w:t>
-            </w:r>
-          </w:p>
-        </w:tc>
-        <w:tc>
-          <w:tcPr/>
-          <w:p>
-            <w:pPr>
-              <w:pStyle w:val="Compact"/>
-              <w:jc w:val="center"/>
-            </w:pPr>
-            <w:r>
-              <w:t xml:space="preserve">—</w:t>
-            </w:r>
-          </w:p>
-        </w:tc>
-        <w:tc>
-          <w:tcPr/>
-          <w:p>
-            <w:pPr>
-              <w:pStyle w:val="Compact"/>
-              <w:jc w:val="center"/>
-            </w:pPr>
-            <w:r>
-              <w:t xml:space="preserve">(KD)</w:t>
-            </w:r>
-          </w:p>
-        </w:tc>
-        <w:tc>
-          <w:tcPr/>
-          <w:p>
-            <w:pPr>
-              <w:pStyle w:val="Compact"/>
-              <w:jc w:val="center"/>
-            </w:pPr>
-            <w:r>
-              <w:t xml:space="preserve">—</w:t>
-            </w:r>
-          </w:p>
-        </w:tc>
-        <w:tc>
-          <w:tcPr/>
-          <w:p>
-            <w:pPr>
-              <w:pStyle w:val="Compact"/>
-              <w:jc w:val="center"/>
-            </w:pPr>
-            <w:r>
-              <w:t xml:space="preserve">—</w:t>
-            </w:r>
+              <w:t xml:space="preserve">match</w:t>
+            </w:r>
+          </w:p>
+        </w:tc>
+        <w:tc>
+          <w:tcPr/>
+          <w:p>
+            <w:pPr>
+              <w:pStyle w:val="Compact"/>
+            </w:pPr>
+          </w:p>
+        </w:tc>
+        <w:tc>
+          <w:tcPr/>
+          <w:p>
+            <w:pPr>
+              <w:pStyle w:val="Compact"/>
+            </w:pPr>
+          </w:p>
+        </w:tc>
+        <w:tc>
+          <w:tcPr/>
+          <w:p>
+            <w:pPr>
+              <w:pStyle w:val="Compact"/>
+            </w:pPr>
+          </w:p>
+        </w:tc>
+        <w:tc>
+          <w:tcPr/>
+          <w:p>
+            <w:pPr>
+              <w:pStyle w:val="Compact"/>
+            </w:pPr>
+          </w:p>
+        </w:tc>
+        <w:tc>
+          <w:tcPr/>
+          <w:p>
+            <w:pPr>
+              <w:pStyle w:val="Compact"/>
+            </w:pPr>
           </w:p>
         </w:tc>
         <w:tc>
@@ -14251,71 +14164,52 @@
               <w:jc w:val="left"/>
             </w:pPr>
             <w:r>
-              <w:t xml:space="preserve">Bi et al. </w:t>
-            </w:r>
-            <w:r>
-              <w:t xml:space="preserve">(2026)</w:t>
-            </w:r>
-          </w:p>
-        </w:tc>
-        <w:tc>
-          <w:tcPr/>
-          <w:p>
-            <w:pPr>
-              <w:pStyle w:val="Compact"/>
-              <w:jc w:val="center"/>
-            </w:pPr>
-            <w:r>
-              <w:t xml:space="preserve">group order</w:t>
-            </w:r>
-          </w:p>
-        </w:tc>
-        <w:tc>
-          <w:tcPr/>
-          <w:p>
-            <w:pPr>
-              <w:pStyle w:val="Compact"/>
-              <w:jc w:val="center"/>
-            </w:pPr>
-            <w:r>
-              <w:t xml:space="preserve">(critical)</w:t>
-            </w:r>
-          </w:p>
-        </w:tc>
-        <w:tc>
-          <w:tcPr/>
-          <w:p>
-            <w:pPr>
-              <w:pStyle w:val="Compact"/>
-              <w:jc w:val="center"/>
-            </w:pPr>
-            <w:r>
-              <w:t xml:space="preserve">—</w:t>
-            </w:r>
-          </w:p>
-        </w:tc>
-        <w:tc>
-          <w:tcPr/>
-          <w:p>
-            <w:pPr>
-              <w:pStyle w:val="Compact"/>
-              <w:jc w:val="center"/>
-            </w:pPr>
-            <w:r>
-              <w:t xml:space="preserve">—</w:t>
-            </w:r>
-          </w:p>
-        </w:tc>
-        <w:tc>
-          <w:tcPr/>
-          <w:p>
-            <w:pPr>
-              <w:pStyle w:val="Compact"/>
-              <w:jc w:val="center"/>
-            </w:pPr>
-            <w:r>
-              <w:t xml:space="preserve">—</w:t>
-            </w:r>
+              <w:t xml:space="preserve">transfer</w:t>
+            </w:r>
+          </w:p>
+        </w:tc>
+        <w:tc>
+          <w:tcPr/>
+          <w:p>
+            <w:pPr>
+              <w:pStyle w:val="Compact"/>
+              <w:jc w:val="left"/>
+            </w:pPr>
+            <w:r>
+              <w:t xml:space="preserve">Toy scale</w:t>
+            </w:r>
+          </w:p>
+        </w:tc>
+        <w:tc>
+          <w:tcPr/>
+          <w:p>
+            <w:pPr>
+              <w:pStyle w:val="Compact"/>
+            </w:pPr>
+          </w:p>
+        </w:tc>
+        <w:tc>
+          <w:tcPr/>
+          <w:p>
+            <w:pPr>
+              <w:pStyle w:val="Compact"/>
+            </w:pPr>
+          </w:p>
+        </w:tc>
+        <w:tc>
+          <w:tcPr/>
+          <w:p>
+            <w:pPr>
+              <w:pStyle w:val="Compact"/>
+            </w:pPr>
+          </w:p>
+        </w:tc>
+        <w:tc>
+          <w:tcPr/>
+          <w:p>
+            <w:pPr>
+              <w:pStyle w:val="Compact"/>
+            </w:pPr>
           </w:p>
         </w:tc>
         <w:tc>
@@ -14336,6 +14230,341 @@
               <w:jc w:val="left"/>
             </w:pPr>
             <w:r>
+              <w:t xml:space="preserve">Zhao</w:t>
+            </w:r>
+            <w:r>
+              <w:t xml:space="preserve"> </w:t>
+            </w:r>
+            <w:r>
+              <w:t xml:space="preserve">(2026)</w:t>
+            </w:r>
+          </w:p>
+        </w:tc>
+        <w:tc>
+          <w:tcPr/>
+          <w:p>
+            <w:pPr>
+              <w:pStyle w:val="Compact"/>
+              <w:jc w:val="left"/>
+            </w:pPr>
+            <w:r>
+              <w:t xml:space="preserve">discrete (2 pts)</w:t>
+            </w:r>
+          </w:p>
+        </w:tc>
+        <w:tc>
+          <w:tcPr/>
+          <w:p>
+            <w:pPr>
+              <w:pStyle w:val="Compact"/>
+              <w:jc w:val="center"/>
+            </w:pPr>
+            <w:r>
+              <w:t xml:space="preserve">—</w:t>
+            </w:r>
+          </w:p>
+        </w:tc>
+        <w:tc>
+          <w:tcPr/>
+          <w:p>
+            <w:pPr>
+              <w:pStyle w:val="Compact"/>
+              <w:jc w:val="center"/>
+            </w:pPr>
+            <w:r>
+              <w:t xml:space="preserve">—</w:t>
+            </w:r>
+          </w:p>
+        </w:tc>
+        <w:tc>
+          <w:tcPr/>
+          <w:p>
+            <w:pPr>
+              <w:pStyle w:val="Compact"/>
+              <w:jc w:val="center"/>
+            </w:pPr>
+            <w:r>
+              <w:t xml:space="preserve">—</w:t>
+            </w:r>
+          </w:p>
+        </w:tc>
+        <w:tc>
+          <w:tcPr/>
+          <w:p>
+            <w:pPr>
+              <w:pStyle w:val="Compact"/>
+              <w:jc w:val="center"/>
+            </w:pPr>
+            <w:r>
+              <w:t xml:space="preserve">—</w:t>
+            </w:r>
+          </w:p>
+        </w:tc>
+        <w:tc>
+          <w:tcPr/>
+          <w:p>
+            <w:pPr>
+              <w:pStyle w:val="Compact"/>
+            </w:pPr>
+          </w:p>
+        </w:tc>
+      </w:tr>
+      <w:tr>
+        <w:tc>
+          <w:tcPr/>
+          <w:p>
+            <w:pPr>
+              <w:pStyle w:val="Compact"/>
+              <w:jc w:val="left"/>
+            </w:pPr>
+            <w:r>
+              <w:t xml:space="preserve">Liu et al. </w:t>
+            </w:r>
+            <w:r>
+              <w:t xml:space="preserve">(2022; 2023)</w:t>
+            </w:r>
+          </w:p>
+        </w:tc>
+        <w:tc>
+          <w:tcPr/>
+          <w:p>
+            <w:pPr>
+              <w:pStyle w:val="Compact"/>
+              <w:jc w:val="left"/>
+            </w:pPr>
+            <w:r>
+              <w:t xml:space="preserve">data fraction</w:t>
+            </w:r>
+          </w:p>
+        </w:tc>
+        <w:tc>
+          <w:tcPr/>
+          <w:p>
+            <w:pPr>
+              <w:pStyle w:val="Compact"/>
+            </w:pPr>
+          </w:p>
+        </w:tc>
+        <w:tc>
+          <w:tcPr/>
+          <w:p>
+            <w:pPr>
+              <w:pStyle w:val="Compact"/>
+              <w:jc w:val="center"/>
+            </w:pPr>
+            <w:r>
+              <w:t xml:space="preserve">—</w:t>
+            </w:r>
+          </w:p>
+        </w:tc>
+        <w:tc>
+          <w:tcPr/>
+          <w:p>
+            <w:pPr>
+              <w:pStyle w:val="Compact"/>
+              <w:jc w:val="center"/>
+            </w:pPr>
+            <w:r>
+              <w:t xml:space="preserve">—</w:t>
+            </w:r>
+          </w:p>
+        </w:tc>
+        <w:tc>
+          <w:tcPr/>
+          <w:p>
+            <w:pPr>
+              <w:pStyle w:val="Compact"/>
+            </w:pPr>
+          </w:p>
+        </w:tc>
+        <w:tc>
+          <w:tcPr/>
+          <w:p>
+            <w:pPr>
+              <w:pStyle w:val="Compact"/>
+            </w:pPr>
+          </w:p>
+        </w:tc>
+      </w:tr>
+      <w:tr>
+        <w:tc>
+          <w:tcPr/>
+          <w:p>
+            <w:pPr>
+              <w:pStyle w:val="Compact"/>
+              <w:jc w:val="left"/>
+            </w:pPr>
+            <w:r>
+              <w:t xml:space="preserve">Singh et al. </w:t>
+            </w:r>
+            <w:r>
+              <w:t xml:space="preserve">(2025)</w:t>
+            </w:r>
+          </w:p>
+        </w:tc>
+        <w:tc>
+          <w:tcPr/>
+          <w:p>
+            <w:pPr>
+              <w:pStyle w:val="Compact"/>
+              <w:jc w:val="left"/>
+            </w:pPr>
+            <w:r>
+              <w:t xml:space="preserve">data quantity</w:t>
+            </w:r>
+          </w:p>
+        </w:tc>
+        <w:tc>
+          <w:tcPr/>
+          <w:p>
+            <w:pPr>
+              <w:pStyle w:val="Compact"/>
+              <w:jc w:val="center"/>
+            </w:pPr>
+            <w:r>
+              <w:t xml:space="preserve">—</w:t>
+            </w:r>
+          </w:p>
+        </w:tc>
+        <w:tc>
+          <w:tcPr/>
+          <w:p>
+            <w:pPr>
+              <w:pStyle w:val="Compact"/>
+              <w:jc w:val="center"/>
+            </w:pPr>
+            <w:r>
+              <w:t xml:space="preserve">(KD)</w:t>
+            </w:r>
+          </w:p>
+        </w:tc>
+        <w:tc>
+          <w:tcPr/>
+          <w:p>
+            <w:pPr>
+              <w:pStyle w:val="Compact"/>
+              <w:jc w:val="center"/>
+            </w:pPr>
+            <w:r>
+              <w:t xml:space="preserve">—</w:t>
+            </w:r>
+          </w:p>
+        </w:tc>
+        <w:tc>
+          <w:tcPr/>
+          <w:p>
+            <w:pPr>
+              <w:pStyle w:val="Compact"/>
+              <w:jc w:val="center"/>
+            </w:pPr>
+            <w:r>
+              <w:t xml:space="preserve">—</w:t>
+            </w:r>
+          </w:p>
+        </w:tc>
+        <w:tc>
+          <w:tcPr/>
+          <w:p>
+            <w:pPr>
+              <w:pStyle w:val="Compact"/>
+            </w:pPr>
+          </w:p>
+        </w:tc>
+      </w:tr>
+      <w:tr>
+        <w:tc>
+          <w:tcPr/>
+          <w:p>
+            <w:pPr>
+              <w:pStyle w:val="Compact"/>
+              <w:jc w:val="left"/>
+            </w:pPr>
+            <w:r>
+              <w:t xml:space="preserve">Bi et al. </w:t>
+            </w:r>
+            <w:r>
+              <w:t xml:space="preserve">(2026)</w:t>
+            </w:r>
+          </w:p>
+        </w:tc>
+        <w:tc>
+          <w:tcPr/>
+          <w:p>
+            <w:pPr>
+              <w:pStyle w:val="Compact"/>
+              <w:jc w:val="left"/>
+            </w:pPr>
+            <w:r>
+              <w:t xml:space="preserve">group order</w:t>
+            </w:r>
+          </w:p>
+        </w:tc>
+        <w:tc>
+          <w:tcPr/>
+          <w:p>
+            <w:pPr>
+              <w:pStyle w:val="Compact"/>
+              <w:jc w:val="center"/>
+            </w:pPr>
+            <w:r>
+              <w:t xml:space="preserve">(critical)</w:t>
+            </w:r>
+          </w:p>
+        </w:tc>
+        <w:tc>
+          <w:tcPr/>
+          <w:p>
+            <w:pPr>
+              <w:pStyle w:val="Compact"/>
+              <w:jc w:val="center"/>
+            </w:pPr>
+            <w:r>
+              <w:t xml:space="preserve">—</w:t>
+            </w:r>
+          </w:p>
+        </w:tc>
+        <w:tc>
+          <w:tcPr/>
+          <w:p>
+            <w:pPr>
+              <w:pStyle w:val="Compact"/>
+              <w:jc w:val="center"/>
+            </w:pPr>
+            <w:r>
+              <w:t xml:space="preserve">—</w:t>
+            </w:r>
+          </w:p>
+        </w:tc>
+        <w:tc>
+          <w:tcPr/>
+          <w:p>
+            <w:pPr>
+              <w:pStyle w:val="Compact"/>
+              <w:jc w:val="center"/>
+            </w:pPr>
+            <w:r>
+              <w:t xml:space="preserve">—</w:t>
+            </w:r>
+          </w:p>
+        </w:tc>
+        <w:tc>
+          <w:tcPr/>
+          <w:p>
+            <w:pPr>
+              <w:pStyle w:val="Compact"/>
+            </w:pPr>
+          </w:p>
+        </w:tc>
+      </w:tr>
+      <w:tr>
+        <w:tc>
+          <w:tcPr/>
+          <w:p>
+            <w:pPr>
+              <w:pStyle w:val="Compact"/>
+              <w:jc w:val="left"/>
+            </w:pPr>
+            <w:r>
               <w:t xml:space="preserve">This paper</w:t>
             </w:r>
           </w:p>
@@ -14345,7 +14574,7 @@
           <w:p>
             <w:pPr>
               <w:pStyle w:val="Compact"/>
-              <w:jc w:val="center"/>
+              <w:jc w:val="left"/>
             </w:pPr>
             <w:r>
               <w:t xml:space="preserve">continuous</w:t>

</xml_diff>

<commit_message>
Reduce parenthetical overuse throughout the manuscript
Rewrote paragraphs in Setup, Results, and Appendix D to integrate content
that had been stuffed into parenthetical asides directly into the main
sentence structure. Reduced top-level parenthetical groups from 182 to 114;
the remainder are short, standard figure/table caption annotations.
Verified: no reviewer/revision-process language anywhere in the manuscript
body (already true, confirmed by integrity_audit's Process-Language Leak
check).

Co-Authored-By: Claude Sonnet 5 <noreply@anthropic.com>
</commit_message>
<xml_diff>
--- a/paper_rewriting_output/final_paper/paper.docx
+++ b/paper_rewriting_output/final_paper/paper.docx
@@ -1349,7 +1349,7 @@
         <w:t xml:space="preserve"> </w:t>
       </w:r>
       <w:r>
-        <w:t xml:space="preserve">(Zipf-weighted minibatch sampling,</w:t>
+        <w:t xml:space="preserve">via Zipf-weighted minibatch sampling,</w:t>
       </w:r>
       <w:r>
         <w:t xml:space="preserve"> </w:t>
@@ -1425,7 +1425,7 @@
         </m:sSup>
       </m:oMath>
       <w:r>
-        <w:t xml:space="preserve">) crossed against weight decay</w:t>
+        <w:t xml:space="preserve">, crossed against weight decay</w:t>
       </w:r>
       <w:r>
         <w:t xml:space="preserve"> </w:t>
@@ -2591,7 +2591,7 @@
         <w:t xml:space="preserve"> </w:t>
       </w:r>
       <w:r>
-        <w:t xml:space="preserve">(default</w:t>
+        <w:t xml:space="preserve">at default</w:t>
       </w:r>
       <w:r>
         <w:t xml:space="preserve"> </w:t>
@@ -2630,7 +2630,10 @@
         </m:d>
       </m:oMath>
       <w:r>
-        <w:t xml:space="preserve">, no dropout, no gradient clipping) at learning rate</w:t>
+        <w:t xml:space="preserve"> </w:t>
+      </w:r>
+      <w:r>
+        <w:t xml:space="preserve">with no dropout and no gradient clipping, learning rate</w:t>
       </w:r>
       <w:r>
         <w:t xml:space="preserve"> </w:t>
@@ -2694,7 +2697,7 @@
         <w:t xml:space="preserve"> </w:t>
       </w:r>
       <w:r>
-        <w:t xml:space="preserve">weight and bias after PyTorch’s default initialization (used for LARGECOUNTER and Dyck-1; modular addition, §</w:t>
+        <w:t xml:space="preserve">weight and bias after PyTorch’s default initialization; this rescaling is used for LARGECOUNTER and Dyck-1, while modular addition (§</w:t>
       </w:r>
       <w:hyperlink w:anchor="sec:results-modadd">
         <w:r>
@@ -2705,7 +2708,7 @@
         </w:r>
       </w:hyperlink>
       <w:r>
-        <w:t xml:space="preserve">, uses the unscaled default). Evaluation is teacher-forced accuracy over the</w:t>
+        <w:t xml:space="preserve">) uses the unscaled default. Evaluation is teacher-forced accuracy over the</w:t>
       </w:r>
       <w:r>
         <w:t xml:space="preserve"> </w:t>
@@ -2719,7 +2722,7 @@
         <w:t xml:space="preserve"> </w:t>
       </w:r>
       <w:r>
-        <w:t xml:space="preserve">target-bit positions per transition (a transition counts as correct only if every target bit matches), not free-running/sampled decoding;</w:t>
+        <w:t xml:space="preserve">target-bit positions per transition, so a transition counts as correct only if every target bit matches, not free-running/sampled decoding;</w:t>
       </w:r>
       <w:r>
         <w:t xml:space="preserve"> </w:t>
@@ -3930,7 +3933,10 @@
         <w:t xml:space="preserve"> </w:t>
       </w:r>
       <w:r>
-        <w:t xml:space="preserve">(</w:t>
+        <w:t xml:space="preserve">with</w:t>
+      </w:r>
+      <w:r>
+        <w:t xml:space="preserve"> </w:t>
       </w:r>
       <m:oMath>
         <m:r>
@@ -3947,7 +3953,10 @@
         </m:r>
       </m:oMath>
       <w:r>
-        <w:t xml:space="preserve">, SEP token id</w:t>
+        <w:t xml:space="preserve"> </w:t>
+      </w:r>
+      <w:r>
+        <w:t xml:space="preserve">and SEP token id</w:t>
       </w:r>
       <w:r>
         <w:t xml:space="preserve"> </w:t>
@@ -3958,7 +3967,7 @@
         </m:r>
       </m:oMath>
       <w:r>
-        <w:t xml:space="preserve">), with loss and accuracy computed only at the final position (predicting</w:t>
+        <w:t xml:space="preserve">, with loss and accuracy computed only at the final position, predicting</w:t>
       </w:r>
       <w:r>
         <w:t xml:space="preserve"> </w:t>
@@ -4050,7 +4059,7 @@
         </m:r>
       </m:oMath>
       <w:r>
-        <w:t xml:space="preserve">); the evaluation population is all</w:t>
+        <w:t xml:space="preserve">; the evaluation population is all</w:t>
       </w:r>
       <w:r>
         <w:t xml:space="preserve"> </w:t>
@@ -4222,7 +4231,7 @@
         </m:r>
       </m:oMath>
       <w:r>
-        <w:t xml:space="preserve">-values (large</w:t>
+        <w:t xml:space="preserve">-values, matching the direction the skew starves toward large</w:t>
       </w:r>
       <w:r>
         <w:t xml:space="preserve"> </w:t>
@@ -4233,7 +4242,7 @@
         </m:r>
       </m:oMath>
       <w:r>
-        <w:t xml:space="preserve">, matching the direction the skew starves),</w:t>
+        <w:t xml:space="preserve">;</w:t>
       </w:r>
       <w:r>
         <w:t xml:space="preserve"> </w:t>
@@ -4251,7 +4260,7 @@
         <w:t xml:space="preserve"> </w:t>
       </w:r>
       <w:r>
-        <w:t xml:space="preserve">is the most frequent decile (small</w:t>
+        <w:t xml:space="preserve">is the most frequent decile, small</w:t>
       </w:r>
       <w:r>
         <w:t xml:space="preserve"> </w:t>
@@ -4262,7 +4271,7 @@
         </m:r>
       </m:oMath>
       <w:r>
-        <w:t xml:space="preserve">). The model, optimizer, batch size, and evaluation convention match §3.1; only the initialization scale differs (§3.1),</w:t>
+        <w:t xml:space="preserve">. The model, optimizer, batch size, and evaluation convention match §3.1; only the initialization scale differs,</w:t>
       </w:r>
       <w:r>
         <w:t xml:space="preserve"> </w:t>
@@ -4285,7 +4294,7 @@
         <w:t xml:space="preserve"> </w:t>
       </w:r>
       <w:r>
-        <w:t xml:space="preserve">(task-specific input width) replaces the counting task’s</w:t>
+        <w:t xml:space="preserve">replaces the counting task’s</w:t>
       </w:r>
       <w:r>
         <w:t xml:space="preserve"> </w:t>
@@ -4296,7 +4305,10 @@
         </m:r>
       </m:oMath>
       <w:r>
-        <w:t xml:space="preserve">, and the step budget is</w:t>
+        <w:t xml:space="preserve"> </w:t>
+      </w:r>
+      <w:r>
+        <w:t xml:space="preserve">as the task-specific input width, and the step budget is</w:t>
       </w:r>
       <w:r>
         <w:t xml:space="preserve"> </w:t>
@@ -4316,10 +4328,7 @@
         </m:r>
       </m:oMath>
       <w:r>
-        <w:t xml:space="preserve"> </w:t>
-      </w:r>
-      <w:r>
-        <w:t xml:space="preserve">(the modular-addition failure region resolves at this shorter budget; the formal grid of §</w:t>
+        <w:t xml:space="preserve">, since the modular-addition failure region resolves at this shorter budget and the formal grid of §</w:t>
       </w:r>
       <w:hyperlink w:anchor="sec:results-modadd">
         <w:r>
@@ -4347,7 +4356,7 @@
         <w:t xml:space="preserve"> </w:t>
       </w:r>
       <w:r>
-        <w:t xml:space="preserve">uses it throughout). For our third task, we use sequence length</w:t>
+        <w:t xml:space="preserve">uses it throughout. For our third task, we use sequence length</w:t>
       </w:r>
       <w:r>
         <w:t xml:space="preserve"> </w:t>
@@ -4367,10 +4376,10 @@
         </m:r>
       </m:oMath>
       <w:r>
-        <w:t xml:space="preserve"> </w:t>
-      </w:r>
-      <w:r>
-        <w:t xml:space="preserve">(</w:t>
+        <w:t xml:space="preserve">, giving</w:t>
+      </w:r>
+      <w:r>
+        <w:t xml:space="preserve"> </w:t>
       </w:r>
       <m:oMath>
         <m:sSub>
@@ -4408,7 +4417,7 @@
         <w:t xml:space="preserve"> </w:t>
       </w:r>
       <w:r>
-        <w:t xml:space="preserve">valid Dyck-1 paths of 10 pairs, 20 bracket tokens), the same model/optimizer/batch-size/evaluation convention as §3.1 with a</w:t>
+        <w:t xml:space="preserve">valid Dyck-1 paths of 10 pairs and 20 bracket tokens, the same model/optimizer/batch-size/evaluation convention as §3.1 with a</w:t>
       </w:r>
       <w:r>
         <w:t xml:space="preserve"> </w:t>
@@ -4428,7 +4437,7 @@
         </m:r>
       </m:oMath>
       <w:r>
-        <w:t xml:space="preserve">-step budget (matching LARGECOUNTER’s primary budget; §</w:t>
+        <w:t xml:space="preserve">-step budget matching LARGECOUNTER’s primary budget—§</w:t>
       </w:r>
       <w:hyperlink w:anchor="sec:results-dyck">
         <w:r>
@@ -4462,7 +4471,7 @@
         <w:t xml:space="preserve"> </w:t>
       </w:r>
       <w:r>
-        <w:t xml:space="preserve">steps), and pose</w:t>
+        <w:t xml:space="preserve">steps—and pose</w:t>
       </w:r>
       <w:r>
         <w:t xml:space="preserve"> </w:t>
@@ -4478,7 +4487,7 @@
         <w:t xml:space="preserve"> </w:t>
       </w:r>
       <w:r>
-        <w:t xml:space="preserve">rather than open-vocabulary string recognition: at each position, the input prefix under the Dyck-1 grammar is deterministic (forced open at depth</w:t>
+        <w:t xml:space="preserve">rather than open-vocabulary string recognition: at each position, the input prefix under the Dyck-1 grammar is deterministic, forced open at depth</w:t>
       </w:r>
       <w:r>
         <w:t xml:space="preserve"> </w:t>
@@ -4489,7 +4498,10 @@
         </m:r>
       </m:oMath>
       <w:r>
-        <w:t xml:space="preserve">, forced close when the remaining length equals the current depth) at exactly the positions used for scoring, and free (either bracket keeps the path completable) elsewhere; loss and accuracy are computed only at forced positions, so getting a forced prediction wrong is the error signal a recognizer would otherwise get from an invalid string. We skew training frequency by each path’s maximum nesting depth</w:t>
+        <w:t xml:space="preserve"> </w:t>
+      </w:r>
+      <w:r>
+        <w:t xml:space="preserve">and forced close when the remaining length equals the current depth, at exactly the positions used for scoring, and free elsewhere since either bracket keeps the path completable; loss and accuracy are computed only at forced positions, so getting a forced prediction wrong is the error signal a recognizer would otherwise get from an invalid string. We skew training frequency by each path’s maximum nesting depth</w:t>
       </w:r>
       <w:r>
         <w:t xml:space="preserve"> </w:t>
@@ -4698,10 +4710,10 @@
         </m:d>
       </m:oMath>
       <w:r>
-        <w:t xml:space="preserve"> </w:t>
-      </w:r>
-      <w:r>
-        <w:t xml:space="preserve">(shallow/common paths get low rank, deep/rare paths get high rank)—the Dyck-1 analogue of carry-chain length, since deep paths require longer-range tracking of nesting state. The targeted injection pools are the shallowest quintile of paths by max depth (</w:t>
+        <w:t xml:space="preserve">, so shallow, common paths get low rank and deep, rare paths get high rank—the Dyck-1 analogue of carry-chain length, since deep paths require longer-range tracking of nesting state. The targeted injection pools are the shallowest quintile of paths by max depth,</w:t>
+      </w:r>
+      <w:r>
+        <w:t xml:space="preserve"> </w:t>
       </w:r>
       <w:r>
         <w:t xml:space="preserve">“</w:t>
@@ -4713,7 +4725,10 @@
         <w:t xml:space="preserve">”</w:t>
       </w:r>
       <w:r>
-        <w:t xml:space="preserve">) and the deepest quintile (</w:t>
+        <w:t xml:space="preserve">, and the deepest quintile,</w:t>
+      </w:r>
+      <w:r>
+        <w:t xml:space="preserve"> </w:t>
       </w:r>
       <w:r>
         <w:t xml:space="preserve">“</w:t>
@@ -4725,7 +4740,7 @@
         <w:t xml:space="preserve">”</w:t>
       </w:r>
       <w:r>
-        <w:t xml:space="preserve">). As in §3.2, we use a frozen four-way verdict rule with</w:t>
+        <w:t xml:space="preserve">. As in §3.2, we use a frozen four-way verdict rule with</w:t>
       </w:r>
       <w:r>
         <w:t xml:space="preserve"> </w:t>
@@ -5082,53 +5097,7 @@
         <w:t xml:space="preserve"> </w:t>
       </w:r>
       <w:r>
-        <w:t xml:space="preserve">(with</w:t>
-      </w:r>
-      <w:r>
-        <w:t xml:space="preserve"> </w:t>
-      </w:r>
-      <m:oMath>
-        <m:r>
-          <m:t>α</m:t>
-        </m:r>
-        <m:r>
-          <m:rPr>
-            <m:sty m:val="p"/>
-          </m:rPr>
-          <m:t>≤</m:t>
-        </m:r>
-        <m:r>
-          <m:t>1.5</m:t>
-        </m:r>
-      </m:oMath>
-      <w:r>
-        <w:t xml:space="preserve"> </w:t>
-      </w:r>
-      <w:r>
-        <w:t xml:space="preserve">additionally probed up to</w:t>
-      </w:r>
-      <w:r>
-        <w:t xml:space="preserve"> </w:t>
-      </w:r>
-      <m:oMath>
-        <m:r>
-          <m:t>λ</m:t>
-        </m:r>
-        <m:r>
-          <m:rPr>
-            <m:sty m:val="p"/>
-          </m:rPr>
-          <m:t>=</m:t>
-        </m:r>
-        <m:r>
-          <m:t>1.0</m:t>
-        </m:r>
-      </m:oMath>
-      <w:r>
-        <w:t xml:space="preserve"> </w:t>
-      </w:r>
-      <w:r>
-        <w:t xml:space="preserve">to bracket the wider channel at low skew) and skew</w:t>
+        <w:t xml:space="preserve">and skew</w:t>
       </w:r>
       <w:r>
         <w:t xml:space="preserve"> </w:t>
@@ -5190,7 +5159,7 @@
         </m:r>
       </m:oMath>
       <w:r>
-        <w:t xml:space="preserve">. The grok-channel weight-decay ceiling decreases monotonically with</w:t>
+        <w:t xml:space="preserve">, with</w:t>
       </w:r>
       <w:r>
         <w:t xml:space="preserve"> </w:t>
@@ -5199,6 +5168,52 @@
         <m:r>
           <m:t>α</m:t>
         </m:r>
+        <m:r>
+          <m:rPr>
+            <m:sty m:val="p"/>
+          </m:rPr>
+          <m:t>≤</m:t>
+        </m:r>
+        <m:r>
+          <m:t>1.5</m:t>
+        </m:r>
+      </m:oMath>
+      <w:r>
+        <w:t xml:space="preserve"> </w:t>
+      </w:r>
+      <w:r>
+        <w:t xml:space="preserve">additionally probed up to</w:t>
+      </w:r>
+      <w:r>
+        <w:t xml:space="preserve"> </w:t>
+      </w:r>
+      <m:oMath>
+        <m:r>
+          <m:t>λ</m:t>
+        </m:r>
+        <m:r>
+          <m:rPr>
+            <m:sty m:val="p"/>
+          </m:rPr>
+          <m:t>=</m:t>
+        </m:r>
+        <m:r>
+          <m:t>1.0</m:t>
+        </m:r>
+      </m:oMath>
+      <w:r>
+        <w:t xml:space="preserve"> </w:t>
+      </w:r>
+      <w:r>
+        <w:t xml:space="preserve">to bracket the wider channel at low skew. The grok-channel weight-decay ceiling decreases monotonically with</w:t>
+      </w:r>
+      <w:r>
+        <w:t xml:space="preserve"> </w:t>
+      </w:r>
+      <m:oMath>
+        <m:r>
+          <m:t>α</m:t>
+        </m:r>
       </m:oMath>
       <w:r>
         <w:t xml:space="preserve">: bootstrapped 90% intervals place the ceiling at</w:t>
@@ -5212,10 +5227,10 @@
         </m:r>
       </m:oMath>
       <w:r>
-        <w:t xml:space="preserve"> </w:t>
-      </w:r>
-      <w:r>
-        <w:t xml:space="preserve">(</w:t>
+        <w:t xml:space="preserve">,</w:t>
+      </w:r>
+      <w:r>
+        <w:t xml:space="preserve"> </w:t>
       </w:r>
       <m:oMath>
         <m:d>
@@ -5265,7 +5280,7 @@
         <w:t xml:space="preserve"> </w:t>
       </w:r>
       <w:r>
-        <w:t xml:space="preserve">probe) at</w:t>
+        <w:t xml:space="preserve">probe, at</w:t>
       </w:r>
       <w:r>
         <w:t xml:space="preserve"> </w:t>
@@ -5296,10 +5311,10 @@
         </m:r>
       </m:oMath>
       <w:r>
-        <w:t xml:space="preserve"> </w:t>
-      </w:r>
-      <w:r>
-        <w:t xml:space="preserve">(</w:t>
+        <w:t xml:space="preserve">,</w:t>
+      </w:r>
+      <w:r>
+        <w:t xml:space="preserve"> </w:t>
       </w:r>
       <m:oMath>
         <m:d>
@@ -5326,7 +5341,7 @@
         </m:d>
       </m:oMath>
       <w:r>
-        <w:t xml:space="preserve">) at</w:t>
+        <w:t xml:space="preserve">, at</w:t>
       </w:r>
       <w:r>
         <w:t xml:space="preserve"> </w:t>
@@ -5425,10 +5440,10 @@
         </m:r>
       </m:oMath>
       <w:r>
-        <w:t xml:space="preserve"> </w:t>
-      </w:r>
-      <w:r>
-        <w:t xml:space="preserve">(</w:t>
+        <w:t xml:space="preserve">,</w:t>
+      </w:r>
+      <w:r>
+        <w:t xml:space="preserve"> </w:t>
       </w:r>
       <m:oMath>
         <m:d>
@@ -5455,7 +5470,7 @@
         </m:d>
       </m:oMath>
       <w:r>
-        <w:t xml:space="preserve">) at</w:t>
+        <w:t xml:space="preserve">, at</w:t>
       </w:r>
       <w:r>
         <w:t xml:space="preserve"> </w:t>
@@ -6352,7 +6367,7 @@
         <w:t xml:space="preserve"> </w:t>
       </w:r>
       <w:r>
-        <w:t xml:space="preserve">steps—four times our previously tested extended budget—does not rescue generalization in any of eight runs (accuracy range</w:t>
+        <w:t xml:space="preserve">steps—four times our previously tested extended budget—does not rescue generalization in any of eight runs, with accuracy ranging</w:t>
       </w:r>
       <w:r>
         <w:t xml:space="preserve"> </w:t>
@@ -6371,7 +6386,10 @@
         </m:r>
       </m:oMath>
       <w:r>
-        <w:t xml:space="preserve">, with no upward trend against budget). Repeating the full grid at</w:t>
+        <w:t xml:space="preserve"> </w:t>
+      </w:r>
+      <w:r>
+        <w:t xml:space="preserve">and no upward trend against budget. Repeating the full grid at</w:t>
       </w:r>
       <w:r>
         <w:t xml:space="preserve"> </w:t>
@@ -7762,10 +7780,10 @@
         <w:t xml:space="preserve">Trap</w:t>
       </w:r>
       <w:r>
-        <w:t xml:space="preserve"> </w:t>
-      </w:r>
-      <w:r>
-        <w:t xml:space="preserve">(accuracy is high on the frequent head but low overall—</w:t>
+        <w:t xml:space="preserve">, where accuracy is high on the frequent head but low overall,</w:t>
+      </w:r>
+      <w:r>
+        <w:t xml:space="preserve"> </w:t>
       </w:r>
       <w:r>
         <w:t xml:space="preserve">“</w:t>
@@ -7780,7 +7798,7 @@
         <w:t xml:space="preserve"> </w:t>
       </w:r>
       <w:r>
-        <w:t xml:space="preserve">on the head) and</w:t>
+        <w:t xml:space="preserve">on the head, and</w:t>
       </w:r>
       <w:r>
         <w:t xml:space="preserve"> </w:t>
@@ -7792,10 +7810,10 @@
         <w:t xml:space="preserve">Crush</w:t>
       </w:r>
       <w:r>
-        <w:t xml:space="preserve"> </w:t>
-      </w:r>
-      <w:r>
-        <w:t xml:space="preserve">(accuracy is low even on the head—</w:t>
+        <w:t xml:space="preserve">, where accuracy is low even on the head,</w:t>
+      </w:r>
+      <w:r>
+        <w:t xml:space="preserve"> </w:t>
       </w:r>
       <w:r>
         <w:t xml:space="preserve">“</w:t>
@@ -7810,7 +7828,7 @@
         <w:t xml:space="preserve"> </w:t>
       </w:r>
       <w:r>
-        <w:t xml:space="preserve">of any learnable signal). Doses below</w:t>
+        <w:t xml:space="preserve">of any learnable signal. Doses below</w:t>
       </w:r>
       <w:r>
         <w:t xml:space="preserve"> </w:t>
@@ -7827,10 +7845,10 @@
         </m:r>
       </m:oMath>
       <w:r>
-        <w:t xml:space="preserve"> </w:t>
-      </w:r>
-      <w:r>
-        <w:t xml:space="preserve">(</w:t>
+        <w:t xml:space="preserve">,</w:t>
+      </w:r>
+      <w:r>
+        <w:t xml:space="preserve"> </w:t>
       </w:r>
       <m:oMath>
         <m:r>
@@ -7850,7 +7868,7 @@
         <w:t xml:space="preserve"> </w:t>
       </w:r>
       <w:r>
-        <w:t xml:space="preserve">per 128) were initially implemented by holding</w:t>
+        <w:t xml:space="preserve">per 128, were initially implemented by holding</w:t>
       </w:r>
       <w:r>
         <w:t xml:space="preserve"> </w:t>
@@ -7873,7 +7891,68 @@
         <w:t xml:space="preserve"> </w:t>
       </w:r>
       <w:r>
-        <w:t xml:space="preserve">fixed and varying batch size (1024, 512, 256, 128) with step count scaled inversely to hold total sample count fixed; this protocol varies batch size and optimizer-update count jointly with dose. To deconfound dose from batch size and update count, we separately ran a second dose sweep with batch size (128) and step count (</w:t>
+        <w:t xml:space="preserve">fixed and varying batch size,</w:t>
+      </w:r>
+      <w:r>
+        <w:t xml:space="preserve"> </w:t>
+      </w:r>
+      <m:oMath>
+        <m:r>
+          <m:t>1024</m:t>
+        </m:r>
+      </m:oMath>
+      <w:r>
+        <w:t xml:space="preserve">,</w:t>
+      </w:r>
+      <w:r>
+        <w:t xml:space="preserve"> </w:t>
+      </w:r>
+      <m:oMath>
+        <m:r>
+          <m:t>512</m:t>
+        </m:r>
+      </m:oMath>
+      <w:r>
+        <w:t xml:space="preserve">,</w:t>
+      </w:r>
+      <w:r>
+        <w:t xml:space="preserve"> </w:t>
+      </w:r>
+      <m:oMath>
+        <m:r>
+          <m:t>256</m:t>
+        </m:r>
+      </m:oMath>
+      <w:r>
+        <w:t xml:space="preserve">,</w:t>
+      </w:r>
+      <w:r>
+        <w:t xml:space="preserve"> </w:t>
+      </w:r>
+      <m:oMath>
+        <m:r>
+          <m:t>128</m:t>
+        </m:r>
+      </m:oMath>
+      <w:r>
+        <w:t xml:space="preserve">, with step count scaled inversely to hold total sample count fixed; this protocol varies batch size and optimizer-update count jointly with dose. To deconfound dose from batch size and update count, we separately ran a second dose sweep with batch size</w:t>
+      </w:r>
+      <w:r>
+        <w:t xml:space="preserve"> </w:t>
+      </w:r>
+      <m:oMath>
+        <m:r>
+          <m:t>128</m:t>
+        </m:r>
+      </m:oMath>
+      <w:r>
+        <w:t xml:space="preserve"> </w:t>
+      </w:r>
+      <w:r>
+        <w:t xml:space="preserve">and step count</w:t>
+      </w:r>
+      <w:r>
+        <w:t xml:space="preserve"> </w:t>
       </w:r>
       <m:oMath>
         <m:r>
@@ -7890,7 +7969,10 @@
         </m:r>
       </m:oMath>
       <w:r>
-        <w:t xml:space="preserve">) held fixed throughout: at each step, with probability</w:t>
+        <w:t xml:space="preserve"> </w:t>
+      </w:r>
+      <w:r>
+        <w:t xml:space="preserve">held fixed throughout: at each step, with probability</w:t>
       </w:r>
       <w:r>
         <w:t xml:space="preserve"> </w:t>
@@ -8015,10 +8097,7 @@
         </m:r>
       </m:oMath>
       <w:r>
-        <w:t xml:space="preserve"> </w:t>
-      </w:r>
-      <w:r>
-        <w:t xml:space="preserve">(expected dose</w:t>
+        <w:t xml:space="preserve">, expected dose</w:t>
       </w:r>
       <w:r>
         <w:t xml:space="preserve"> </w:t>
@@ -8049,7 +8128,7 @@
         </m:r>
       </m:oMath>
       <w:r>
-        <w:t xml:space="preserve">), pooling 24 seeds per dose point across the same three</w:t>
+        <w:t xml:space="preserve">, pooling 24 seeds per dose point across the same three</w:t>
       </w:r>
       <w:r>
         <w:t xml:space="preserve"> </w:t>
@@ -8086,7 +8165,10 @@
         <w:t xml:space="preserve"> </w:t>
       </w:r>
       <w:r>
-        <w:t xml:space="preserve">and then plateaus within sampling noise (</w:t>
+        <w:t xml:space="preserve">and then plateaus within sampling noise,</w:t>
+      </w:r>
+      <w:r>
+        <w:t xml:space="preserve"> </w:t>
       </w:r>
       <m:oMath>
         <m:r>
@@ -8130,7 +8212,7 @@
         </m:r>
       </m:oMath>
       <w:r>
-        <w:t xml:space="preserve">), and the fraction generalizing rises from</w:t>
+        <w:t xml:space="preserve">, and the fraction generalizing rises from</w:t>
       </w:r>
       <w:r>
         <w:t xml:space="preserve"> </w:t>
@@ -8310,7 +8392,10 @@
         <w:t xml:space="preserve"> </w:t>
       </w:r>
       <w:r>
-        <w:t xml:space="preserve">(</w:t>
+        <w:t xml:space="preserve">at</w:t>
+      </w:r>
+      <w:r>
+        <w:t xml:space="preserve"> </w:t>
       </w:r>
       <m:oMath>
         <m:r>
@@ -8327,7 +8412,7 @@
         </m:r>
       </m:oMath>
       <w:r>
-        <w:t xml:space="preserve">). The deconfounded sweep confirms the direction and rough location of the dose effect but shows a more gradual rise than the original batch-varying protocol’s near-binary jump from</w:t>
+        <w:t xml:space="preserve">. The deconfounded sweep confirms the direction and rough location of the dose effect but shows a more gradual rise than the original batch-varying protocol’s near-binary jump from</w:t>
       </w:r>
       <w:r>
         <w:t xml:space="preserve"> </w:t>
@@ -9159,7 +9244,7 @@
         <w:t xml:space="preserve"> </w:t>
       </w:r>
       <w:r>
-        <w:t xml:space="preserve">of its 128 slots (not adds</w:t>
+        <w:t xml:space="preserve">of its 128 slots, not adds</w:t>
       </w:r>
       <w:r>
         <w:t xml:space="preserve"> </w:t>
@@ -9173,7 +9258,7 @@
         <w:t xml:space="preserve"> </w:t>
       </w:r>
       <w:r>
-        <w:t xml:space="preserve">extra) with the intervention condition, so a dose of</w:t>
+        <w:t xml:space="preserve">extra, with the intervention condition, so a dose of</w:t>
       </w:r>
       <w:r>
         <w:t xml:space="preserve"> </w:t>
@@ -9266,7 +9351,7 @@
         <w:t xml:space="preserve"> </w:t>
       </w:r>
       <w:r>
-        <w:t xml:space="preserve">already assigns positive probability to every state, so what the three controls vary is not presence versus absence of support but how broadly the injected slot itself is drawn: from the same head-concentrated distribution as the rest of the batch, from a small targeted set of rare-but-short states (states with carry-chain length</w:t>
+        <w:t xml:space="preserve">already assigns positive probability to every state, so what the three controls vary is not presence versus absence of support but how broadly the injected slot itself is drawn: from the same head-concentrated distribution as the rest of the batch, from a small targeted set of rare-but-short states, defined as states with carry-chain length</w:t>
       </w:r>
       <w:r>
         <w:t xml:space="preserve"> </w:t>
@@ -9308,7 +9393,10 @@
         </m:r>
       </m:oMath>
       <w:r>
-        <w:t xml:space="preserve">, restricted to the</w:t>
+        <w:t xml:space="preserve"> </w:t>
+      </w:r>
+      <w:r>
+        <w:t xml:space="preserve">restricted to the</w:t>
       </w:r>
       <w:r>
         <w:t xml:space="preserve"> </w:t>
@@ -9354,7 +9442,7 @@
         <w:t xml:space="preserve"> </w:t>
       </w:r>
       <w:r>
-        <w:t xml:space="preserve">weight, i.e. excluding the bottleneck states with</w:t>
+        <w:t xml:space="preserve">weight and thus excluding the bottleneck states with</w:t>
       </w:r>
       <w:r>
         <w:t xml:space="preserve"> </w:t>
@@ -9396,7 +9484,7 @@
         </m:r>
       </m:oMath>
       <w:r>
-        <w:t xml:space="preserve">), or uniformly across the entire state space. Injecting one slot drawn from the</w:t>
+        <w:t xml:space="preserve">, or uniformly across the entire state space. Injecting one slot drawn from the</w:t>
       </w:r>
       <w:r>
         <w:t xml:space="preserve"> </w:t>
@@ -9412,7 +9500,7 @@
         <w:t xml:space="preserve"> </w:t>
       </w:r>
       <w:r>
-        <w:t xml:space="preserve">skewed distribution as the rest of the batch fails to rescue (mean uniform accuracy</w:t>
+        <w:t xml:space="preserve">skewed distribution as the rest of the batch fails to rescue, mean uniform accuracy</w:t>
       </w:r>
       <w:r>
         <w:t xml:space="preserve"> </w:t>
@@ -9423,7 +9511,7 @@
         </m:r>
       </m:oMath>
       <w:r>
-        <w:t xml:space="preserve">, close to the zero-injection baseline, consistent with this control being a null resampling of the same distribution rather than a change to the batch’s composition). Injecting one slot drawn from the small targeted set of states that are rare under the skew but have short carry chains achieves partial credit (mean</w:t>
+        <w:t xml:space="preserve">, close to the zero-injection baseline, consistent with this control being a null resampling of the same distribution rather than a change to the batch’s composition. Injecting one slot drawn from the small targeted set of states that are rare under the skew but have short carry chains achieves partial credit, mean</w:t>
       </w:r>
       <w:r>
         <w:t xml:space="preserve"> </w:t>
@@ -9434,7 +9522,7 @@
         </m:r>
       </m:oMath>
       <w:r>
-        <w:t xml:space="preserve">) without reaching the generalization threshold in any of eight seeds. Only injection drawn uniformly across the full state space achieves complete rescue (mean</w:t>
+        <w:t xml:space="preserve">, without reaching the generalization threshold in any of eight seeds. Only injection drawn uniformly across the full state space achieves complete rescue, mean</w:t>
       </w:r>
       <w:r>
         <w:t xml:space="preserve"> </w:t>
@@ -9445,7 +9533,7 @@
         </m:r>
       </m:oMath>
       <w:r>
-        <w:t xml:space="preserve">). Among these three tested distributions, uniform full-state injection is the one that rescues; a same-distribution replacement slot and a small targeted rare-but-unstructured set are both insufficient. This ranking alone conflates breadth, entropy, and state composition—all of which differ between uniform injection and the targeted set. Appendix D decomposes breadth from composition by holding bottleneck-state exclusion fixed (bottleneck states are never in the injection pool) and varying only pool breadth among the remaining non-bottleneck states: generalization rises monotonically with pool size and reaches complete rescue by</w:t>
+        <w:t xml:space="preserve">. Among these three tested distributions, uniform full-state injection is the one that rescues; a same-distribution replacement slot and a small targeted rare-but-unstructured set are both insufficient. This ranking alone conflates breadth, entropy, and state composition—all of which differ between uniform injection and the targeted set. Appendix D decomposes breadth from composition by holding bottleneck-state exclusion fixed, so bottleneck states are never in the injection pool, and varying only pool breadth among the remaining non-bottleneck states: generalization rises monotonically with pool size and reaches complete rescue by</w:t>
       </w:r>
       <w:r>
         <w:t xml:space="preserve"> </w:t>
@@ -9527,7 +9615,10 @@
         </m:r>
       </m:oMath>
       <w:r>
-        <w:t xml:space="preserve">-step budget, indicating the effect operates quickly rather than through slow accumulation. At a higher dose (</w:t>
+        <w:t xml:space="preserve">-step budget, indicating the effect operates quickly rather than through slow accumulation. At a higher dose,</w:t>
+      </w:r>
+      <w:r>
+        <w:t xml:space="preserve"> </w:t>
       </w:r>
       <m:oMath>
         <m:r>
@@ -9573,7 +9664,7 @@
         </m:r>
       </m:oMath>
       <w:r>
-        <w:t xml:space="preserve">) under the original batch-varying protocol, all eight seeds generalize at every tested</w:t>
+        <w:t xml:space="preserve">, under the original batch-varying protocol, all eight seeds generalize at every tested</w:t>
       </w:r>
       <w:r>
         <w:t xml:space="preserve"> </w:t>
@@ -9789,7 +9880,7 @@
         </m:r>
       </m:oMath>
       <w:r>
-        <w:t xml:space="preserve">’s binary representation (the number of low-order bits that must ripple-carry when incrementing</w:t>
+        <w:t xml:space="preserve">’s binary representation, the number of low-order bits that must ripple-carry when incrementing</w:t>
       </w:r>
       <w:r>
         <w:t xml:space="preserve"> </w:t>
@@ -9800,7 +9891,7 @@
         </m:r>
       </m:oMath>
       <w:r>
-        <w:t xml:space="preserve">;</w:t>
+        <w:t xml:space="preserve">, with</w:t>
       </w:r>
       <w:r>
         <w:t xml:space="preserve"> </w:t>
@@ -9851,7 +9942,7 @@
         </m:r>
       </m:oMath>
       <w:r>
-        <w:t xml:space="preserve">), the same quantity that defines the</w:t>
+        <w:t xml:space="preserve">—the same quantity that defines the</w:t>
       </w:r>
       <w:r>
         <w:t xml:space="preserve"> </w:t>
@@ -9892,7 +9983,7 @@
         </w:r>
       </w:hyperlink>
       <w:r>
-        <w:t xml:space="preserve">, taken in expectation under the skew (expected carry-chain length),</w:t>
+        <w:t xml:space="preserve">—taken in expectation under the skew as the expected carry-chain length; the pure exponential</w:t>
       </w:r>
       <w:r>
         <w:t xml:space="preserve"> </w:t>
@@ -9918,10 +10009,7 @@
         </m:sSup>
       </m:oMath>
       <w:r>
-        <w:t xml:space="preserve"> </w:t>
-      </w:r>
-      <w:r>
-        <w:t xml:space="preserve">(pure exponential),</w:t>
+        <w:t xml:space="preserve">; the tail population mass at two thresholds,</w:t>
       </w:r>
       <w:r>
         <w:t xml:space="preserve"> </w:t>
@@ -10141,10 +10229,7 @@
         </m:d>
       </m:oMath>
       <w:r>
-        <w:t xml:space="preserve"> </w:t>
-      </w:r>
-      <w:r>
-        <w:t xml:space="preserve">(tail population mass at two thresholds), and</w:t>
+        <w:t xml:space="preserve">; and the single rarest state’s probability</w:t>
       </w:r>
       <w:r>
         <w:t xml:space="preserve"> </w:t>
@@ -10207,10 +10292,7 @@
         </m:d>
       </m:oMath>
       <w:r>
-        <w:t xml:space="preserve"> </w:t>
-      </w:r>
-      <w:r>
-        <w:t xml:space="preserve">(the single rarest state’s probability), where</w:t>
+        <w:t xml:space="preserve">, where</w:t>
       </w:r>
       <w:r>
         <w:t xml:space="preserve"> </w:t>
@@ -10319,7 +10401,10 @@
         <w:t xml:space="preserve"> </w:t>
       </w:r>
       <w:r>
-        <w:t xml:space="preserve">values (</w:t>
+        <w:t xml:space="preserve">values,</w:t>
+      </w:r>
+      <w:r>
+        <w:t xml:space="preserve"> </w:t>
       </w:r>
       <m:oMath>
         <m:r>
@@ -10411,7 +10496,7 @@
         </m:r>
       </m:oMath>
       <w:r>
-        <w:t xml:space="preserve">), then evaluated, with</w:t>
+        <w:t xml:space="preserve">, then evaluated, with</w:t>
       </w:r>
       <w:r>
         <w:t xml:space="preserve"> </w:t>
@@ -10439,7 +10524,10 @@
         <w:t xml:space="preserve"> </w:t>
       </w:r>
       <w:r>
-        <w:t xml:space="preserve">values. At three of the eight (</w:t>
+        <w:t xml:space="preserve">values. At three of the eight,</w:t>
+      </w:r>
+      <w:r>
+        <w:t xml:space="preserve"> </w:t>
       </w:r>
       <m:oMath>
         <m:r>
@@ -10478,7 +10566,7 @@
         </m:r>
       </m:oMath>
       <w:r>
-        <w:t xml:space="preserve">), the tested weight-decay grid at that</w:t>
+        <w:t xml:space="preserve">, the tested weight-decay grid at that</w:t>
       </w:r>
       <w:r>
         <w:t xml:space="preserve"> </w:t>
@@ -10786,7 +10874,7 @@
         <w:t xml:space="preserve"> </w:t>
       </w:r>
       <w:r>
-        <w:t xml:space="preserve">respectively (maximum error</w:t>
+        <w:t xml:space="preserve">respectively, with maximum error</w:t>
       </w:r>
       <w:r>
         <w:t xml:space="preserve"> </w:t>
@@ -10823,7 +10911,7 @@
         </m:r>
       </m:oMath>
       <w:r>
-        <w:t xml:space="preserve">), both smaller than either candidate’s in-sample fitting error on the original eight-point grid.</w:t>
+        <w:t xml:space="preserve">, both smaller than either candidate’s in-sample fitting error on the original eight-point grid.</w:t>
       </w:r>
       <w:r>
         <w:t xml:space="preserve"> </w:t>
@@ -10859,18 +10947,12 @@
         <w:t xml:space="preserve"> </w:t>
       </w:r>
       <w:r>
-        <w:t xml:space="preserve">has the lower error at four of the five held-out points, but by a small margin at every point (absolute error difference</w:t>
-      </w:r>
-      <w:r>
-        <w:t xml:space="preserve"> </w:t>
-      </w:r>
-      <m:oMath>
-        <m:r>
-          <m:rPr>
-            <m:sty m:val="p"/>
-          </m:rPr>
-          <m:t>≤</m:t>
-        </m:r>
+        <w:t xml:space="preserve">has the lower error at four of the five held-out points, but by a small margin at every point, with absolute error difference at most</w:t>
+      </w:r>
+      <w:r>
+        <w:t xml:space="preserve"> </w:t>
+      </w:r>
+      <m:oMath>
         <m:r>
           <m:t>7.4</m:t>
         </m:r>
@@ -10879,7 +10961,10 @@
         <w:t xml:space="preserve"> </w:t>
       </w:r>
       <w:r>
-        <w:t xml:space="preserve">percentage points), so we do not read this as a clear win for one candidate over the other. The three remaining candidates (</w:t>
+        <w:t xml:space="preserve">percentage points, so we do not read this as a clear win for one candidate over the other. The three remaining candidates,</w:t>
+      </w:r>
+      <w:r>
+        <w:t xml:space="preserve"> </w:t>
       </w:r>
       <m:oMath>
         <m:sSub>
@@ -10952,7 +11037,7 @@
         </m:sSub>
       </m:oMath>
       <w:r>
-        <w:t xml:space="preserve">,</w:t>
+        <w:t xml:space="preserve">, and</w:t>
       </w:r>
       <w:r>
         <w:t xml:space="preserve"> </w:t>
@@ -10975,7 +11060,10 @@
         </m:sSub>
       </m:oMath>
       <w:r>
-        <w:t xml:space="preserve">) diverge sharply from the measured ceilings at these held-out points (e.g. </w:t>
+        <w:t xml:space="preserve">, diverge sharply from the measured ceilings at these held-out points—for example</w:t>
+      </w:r>
+      <w:r>
+        <w:t xml:space="preserve"> </w:t>
       </w:r>
       <m:oMath>
         <m:sSub>
@@ -11052,7 +11140,7 @@
         </m:r>
       </m:oMath>
       <w:r>
-        <w:t xml:space="preserve">);</w:t>
+        <w:t xml:space="preserve">;</w:t>
       </w:r>
       <w:r>
         <w:t xml:space="preserve"> </w:t>
@@ -11631,7 +11719,7 @@
         </m:sSup>
       </m:oMath>
       <w:r>
-        <w:t xml:space="preserve">, 2-layer, AdamW baseline of §3.1 (baseline mean accuracy</w:t>
+        <w:t xml:space="preserve">, 2-layer, AdamW baseline of §3.1, whose mean accuracy is</w:t>
       </w:r>
       <w:r>
         <w:t xml:space="preserve"> </w:t>
@@ -11738,7 +11826,7 @@
         </m:r>
       </m:oMath>
       <w:r>
-        <w:t xml:space="preserve">): width</w:t>
+        <w:t xml:space="preserve">: width</w:t>
       </w:r>
       <w:r>
         <w:t xml:space="preserve"> </w:t>
@@ -11871,7 +11959,10 @@
         </m:r>
       </m:oMath>
       <w:r>
-        <w:t xml:space="preserve">, at otherwise unchanged hyperparameters, was predicted to perform substantially worse, following the literature on adaptive optimizers’ role in grokking. Two further cells (</w:t>
+        <w:t xml:space="preserve">, at otherwise unchanged hyperparameters, was predicted to perform substantially worse, following the literature on adaptive optimizers’ role in grokking. Two further cells,</w:t>
+      </w:r>
+      <w:r>
+        <w:t xml:space="preserve"> </w:t>
       </w:r>
       <m:oMath>
         <m:r>
@@ -11987,7 +12078,7 @@
         </m:sSup>
       </m:oMath>
       <w:r>
-        <w:t xml:space="preserve">) test whether the width and learning-rate effects combine additively, with no directional prediction attached. A perturbation counts as confirmed if mean accuracy moves in the predicted direction at both cells (Table </w:t>
+        <w:t xml:space="preserve">, test whether the width and learning-rate effects combine additively, with no directional prediction attached. A perturbation counts as confirmed if mean accuracy moves in the predicted direction at both cells (Table </w:t>
       </w:r>
       <w:hyperlink w:anchor="tab:robustness">
         <w:r>
@@ -12021,7 +12112,7 @@
         <w:t xml:space="preserve"> </w:t>
       </w:r>
       <w:r>
-        <w:t xml:space="preserve">(harder), learning rate</w:t>
+        <w:t xml:space="preserve">is harder, learning rate</w:t>
       </w:r>
       <w:r>
         <w:t xml:space="preserve"> </w:t>
@@ -12059,7 +12150,7 @@
         <w:t xml:space="preserve"> </w:t>
       </w:r>
       <w:r>
-        <w:t xml:space="preserve">(harder), depth 1 layer (harder), and SGD with momentum (substantially worse, mean</w:t>
+        <w:t xml:space="preserve">is harder, depth 1 layer is harder, and SGD with momentum is substantially worse, mean</w:t>
       </w:r>
       <w:r>
         <w:t xml:space="preserve"> </w:t>
@@ -12073,7 +12164,7 @@
         <w:t xml:space="preserve"> </w:t>
       </w:r>
       <w:r>
-        <w:t xml:space="preserve">against the AdamW baseline). Width</w:t>
+        <w:t xml:space="preserve">against the AdamW baseline. Width</w:t>
       </w:r>
       <w:r>
         <w:t xml:space="preserve"> </w:t>
@@ -12131,10 +12222,7 @@
         </m:sSup>
       </m:oMath>
       <w:r>
-        <w:t xml:space="preserve"> </w:t>
-      </w:r>
-      <w:r>
-        <w:t xml:space="preserve">(both predicted easier) are confirmed only at</w:t>
+        <w:t xml:space="preserve">, both predicted easier, are confirmed only at</w:t>
       </w:r>
       <w:r>
         <w:t xml:space="preserve"> </w:t>
@@ -12221,7 +12309,7 @@
         </m:r>
       </m:oMath>
       <w:r>
-        <w:t xml:space="preserve">-threshold ceiling (mean</w:t>
+        <w:t xml:space="preserve">-threshold ceiling, mean</w:t>
       </w:r>
       <w:r>
         <w:t xml:space="preserve"> </w:t>
@@ -12232,7 +12320,7 @@
         </m:r>
       </m:oMath>
       <w:r>
-        <w:t xml:space="preserve">), leaving little room to move further in the easier direction, and both show a small mean decrease there instead. Depth 3 layers (predicted easier) is confirmed at neither cell: mean accuracy is essentially unchanged at the first cell and falls at the second. Because SGD with momentum was not independently tuned, we read its result as evidence that the effect is not optimizer-invariant, rather than as a controlled ranking of optimizers.</w:t>
+        <w:t xml:space="preserve">, leaving little room to move further in the easier direction, and both show a small mean decrease there instead. Depth 3 layers, predicted easier, is confirmed at neither cell: mean accuracy is essentially unchanged at the first cell and falls at the second. Because SGD with momentum was not independently tuned, we read its result as evidence that the effect is not optimizer-invariant, rather than as a controlled ranking of optimizers.</w:t>
       </w:r>
     </w:p>
     <w:bookmarkStart w:id="46" w:name="tab:robustness"/>
@@ -13229,7 +13317,10 @@
         <w:t xml:space="preserve"> </w:t>
       </w:r>
       <w:r>
-        <w:t xml:space="preserve">on modular addition (</w:t>
+        <w:t xml:space="preserve">on modular addition,</w:t>
+      </w:r>
+      <w:r>
+        <w:t xml:space="preserve"> </w:t>
       </w:r>
       <m:oMath>
         <m:r>
@@ -13246,7 +13337,10 @@
         </m:r>
       </m:oMath>
       <w:r>
-        <w:t xml:space="preserve">), at its own clean failure region (</w:t>
+        <w:t xml:space="preserve">, at its own clean failure region,</w:t>
+      </w:r>
+      <w:r>
+        <w:t xml:space="preserve"> </w:t>
       </w:r>
       <m:oMath>
         <m:r>
@@ -13283,7 +13377,10 @@
         </m:r>
       </m:oMath>
       <w:r>
-        <w:t xml:space="preserve">), with the same dose (</w:t>
+        <w:t xml:space="preserve">, with the same dose,</w:t>
+      </w:r>
+      <w:r>
+        <w:t xml:space="preserve"> </w:t>
       </w:r>
       <m:oMath>
         <m:r>
@@ -13303,7 +13400,7 @@
         <w:t xml:space="preserve"> </w:t>
       </w:r>
       <w:r>
-        <w:t xml:space="preserve">per batch of 128) and the same architecture, optimizer, and evaluation convention (§3.5). At this second task,</w:t>
+        <w:t xml:space="preserve">per batch of 128, and the same architecture, optimizer, and evaluation convention (§3.5). At this second task,</w:t>
       </w:r>
       <w:r>
         <w:t xml:space="preserve"> </w:t>
@@ -13353,7 +13450,7 @@
         <w:t xml:space="preserve"> </w:t>
       </w:r>
       <w:r>
-        <w:t xml:space="preserve">mean accuracy (0/3 generalizing). The ranking direction reproduces: uniform injection achieves</w:t>
+        <w:t xml:space="preserve">mean accuracy, 0/3 generalizing. The ranking direction reproduces: uniform injection achieves</w:t>
       </w:r>
       <w:r>
         <w:t xml:space="preserve"> </w:t>
@@ -13548,7 +13645,7 @@
         <w:pStyle w:val="FirstParagraph"/>
       </w:pPr>
       <w:r>
-        <w:t xml:space="preserve">Modular addition is closely related to LARGECOUNTER in structure. We additionally probed a non-arithmetic task—Dyck-1 forced-position prediction (§3.5), skewed by each valid path’s maximum nesting depth—as a deliberately harder, out-of-domain test of how far the injection ranking travels. Across a formal boundary grid (540 runs, ten seeds per cell), a two-dimensional failure region again emerges as both skew and weight decay increase, and its deepest cells collapse to a fixed, degenerate accuracy value reproduced identically across independent seeds, including a seed never previously run (Figure </w:t>
+        <w:t xml:space="preserve">Modular addition is closely related to LARGECOUNTER in structure. We additionally probed a non-arithmetic task, Dyck-1 forced-position prediction (§3.5), skewed by each valid path’s maximum nesting depth, as a deliberately harder, out-of-domain test of how far the injection ranking travels. Across a formal boundary grid of 540 runs, ten seeds per cell, a two-dimensional failure region again emerges as both skew and weight decay increase, and its deepest cells collapse to a fixed, degenerate accuracy value reproduced identically across independent seeds, including a seed never previously run (Figure </w:t>
       </w:r>
       <w:hyperlink w:anchor="fig:dyckboundary">
         <w:r>
@@ -13642,7 +13739,7 @@
         <w:pStyle w:val="BodyText"/>
       </w:pPr>
       <w:r>
-        <w:t xml:space="preserve">Rescue is directionally but not completely successful here. At a deep-collapse cell, the same uniform-injection intervention that fully rescues the other two tasks improves accuracy only partially (mean</w:t>
+        <w:t xml:space="preserve">Rescue is directionally but not completely successful here. At a deep-collapse cell, the same uniform-injection intervention that fully rescues the other two tasks improves accuracy only partially, mean</w:t>
       </w:r>
       <w:r>
         <w:t xml:space="preserve"> </w:t>
@@ -13653,7 +13750,7 @@
         </m:r>
       </m:oMath>
       <w:r>
-        <w:t xml:space="preserve">, zero of five seeds reaching the generalization threshold), while targeted and frequent-state injection remain at the collapsed baseline (both</w:t>
+        <w:t xml:space="preserve">, zero of five seeds reaching the generalization threshold, while targeted and frequent-state injection remain at the collapsed baseline of</w:t>
       </w:r>
       <w:r>
         <w:t xml:space="preserve"> </w:t>
@@ -13664,7 +13761,10 @@
         </m:r>
       </m:oMath>
       <w:r>
-        <w:t xml:space="preserve">)—the injection-ranking direction reproduces, but the magnitude does not. At one boundary cell, extending training from 60</w:t>
+        <w:t xml:space="preserve"> </w:t>
+      </w:r>
+      <w:r>
+        <w:t xml:space="preserve">each—the injection-ranking direction reproduces, but the magnitude does not. At one boundary cell, extending training from 60</w:t>
       </w:r>
       <w:r>
         <w:t xml:space="preserve">,</w:t>
@@ -17910,7 +18010,7 @@
         <w:t xml:space="preserve"> </w:t>
       </w:r>
       <w:r>
-        <w:t xml:space="preserve">rarest non-bottleneck states (§3.4’s rare-but-short-carry pool, excluding all bottleneck states with carry length</w:t>
+        <w:t xml:space="preserve">rarest non-bottleneck states, §3.4’s rare-but-short-carry pool, excluding all bottleneck states with carry length</w:t>
       </w:r>
       <w:r>
         <w:t xml:space="preserve"> </w:t>
@@ -17952,7 +18052,7 @@
         </m:r>
       </m:oMath>
       <w:r>
-        <w:t xml:space="preserve">) achieves only partial credit (mean</w:t>
+        <w:t xml:space="preserve">, achieves only partial credit, mean</w:t>
       </w:r>
       <w:r>
         <w:t xml:space="preserve"> </w:t>
@@ -17963,7 +18063,7 @@
         </m:r>
       </m:oMath>
       <w:r>
-        <w:t xml:space="preserve">), while injection drawn from the full state space—which does include the 32 bottleneck states—achieves complete rescue (mean</w:t>
+        <w:t xml:space="preserve">, while injection drawn from the full state space, which does include the 32 bottleneck states, achieves complete rescue, mean</w:t>
       </w:r>
       <w:r>
         <w:t xml:space="preserve"> </w:t>
@@ -17974,7 +18074,7 @@
         </m:r>
       </m:oMath>
       <w:r>
-        <w:t xml:space="preserve">). Because these two conditions differ in both breadth (102 vs. 1024 candidate states) and composition (bottleneck states excluded vs. included), this comparison alone cannot say which property is responsible.</w:t>
+        <w:t xml:space="preserve">. Because these two conditions differ in both breadth, 102 vs. 1024 candidate states, and composition, bottleneck states excluded vs. included, this comparison alone cannot say which property is responsible.</w:t>
       </w:r>
     </w:p>
     <w:p>
@@ -17982,7 +18082,10 @@
         <w:pStyle w:val="BodyText"/>
       </w:pPr>
       <w:r>
-        <w:t xml:space="preserve">We isolate breadth by holding composition fixed: bottleneck states (</w:t>
+        <w:t xml:space="preserve">We isolate breadth by holding composition fixed: bottleneck states,</w:t>
+      </w:r>
+      <w:r>
+        <w:t xml:space="preserve"> </w:t>
       </w:r>
       <m:oMath>
         <m:r>
@@ -18021,7 +18124,7 @@
         </m:r>
       </m:oMath>
       <w:r>
-        <w:t xml:space="preserve">, 32 of 1024 states) are excluded from the injection pool at every setting, and only the pool size</w:t>
+        <w:t xml:space="preserve">, 32 of 1024 states, are excluded from the injection pool at every setting, and only the pool size</w:t>
       </w:r>
       <w:r>
         <w:t xml:space="preserve"> </w:t>
@@ -18094,10 +18197,7 @@
         </m:r>
       </m:oMath>
       <w:r>
-        <w:t xml:space="preserve"> </w:t>
-      </w:r>
-      <w:r>
-        <w:t xml:space="preserve">(the</w:t>
+        <w:t xml:space="preserve">, the</w:t>
       </w:r>
       <w:r>
         <w:t xml:space="preserve"> </w:t>
@@ -18134,7 +18234,10 @@
         <w:t xml:space="preserve"> </w:t>
       </w:r>
       <w:r>
-        <w:t xml:space="preserve">weight), at the same cell as the rescue battery (</w:t>
+        <w:t xml:space="preserve">weight, at the same cell as the rescue battery,</w:t>
+      </w:r>
+      <w:r>
+        <w:t xml:space="preserve"> </w:t>
       </w:r>
       <m:oMath>
         <m:r>
@@ -18194,7 +18297,7 @@
         <w:t xml:space="preserve"> </w:t>
       </w:r>
       <w:r>
-        <w:t xml:space="preserve">per batch of 128, 8 seeds).</w:t>
+        <w:t xml:space="preserve">per batch of 128, 8 seeds.</w:t>
       </w:r>
       <w:r>
         <w:t xml:space="preserve"> </w:t>
@@ -18583,10 +18686,10 @@
         </m:r>
       </m:oMath>
       <w:r>
-        <w:t xml:space="preserve"> </w:t>
-      </w:r>
-      <w:r>
-        <w:t xml:space="preserve">(all non-bottleneck states, still excluding every bottleneck state) statistically matching full-state uniform injection’s mean (</w:t>
+        <w:t xml:space="preserve">, all non-bottleneck states, still excluding every bottleneck state, statistically matching full-state uniform injection’s mean,</w:t>
+      </w:r>
+      <w:r>
+        <w:t xml:space="preserve"> </w:t>
       </w:r>
       <m:oMath>
         <m:r>
@@ -18605,7 +18708,7 @@
         </m:r>
       </m:oMath>
       <w:r>
-        <w:t xml:space="preserve">). Bottleneck-state inclusion is therefore not necessary for rescue at this cell: breadth among non-bottleneck states alone is sufficient once the pool is large enough, and the partial credit of the original</w:t>
+        <w:t xml:space="preserve">. Bottleneck-state inclusion is therefore not necessary for rescue at this cell: breadth among non-bottleneck states alone is sufficient once the pool is large enough, and the partial credit of the original</w:t>
       </w:r>
       <w:r>
         <w:t xml:space="preserve"> </w:t>

</xml_diff>

<commit_message>
Redesign all 6 figures with a publication-quality house style
Rewrote generate_figures.py's plotting style following the house-style
conventions from ChenLiu-1996/figures4papers's scientific-figure-making
skill (Nature Machine Intelligence / ICML / NeurIPS figures): serif
typography matching the LaTeX body, minimalist spines (top/right off),
frameless legends, a semantic color palette (blue=uniform/proposed,
orange/red=targeted/head/baseline), and consistent grid/marker styling.

All figures remain pure matplotlib renders of the same real experimental
data in results/*.json -- no AI image generation is involved anywhere,
per the project's data-integrity discipline.

Specific fixes: Figure 1's weight-decay axis (35 non-uniformly-spaced
values) was unreadable with every tick labeled; now shows every 3rd tick.
Figure 6's 6 overlapping seed trajectories only had 2 legend entries
explained; now labeled unambiguously by budget group.

Co-Authored-By: Claude Sonnet 5 <noreply@anthropic.com>
</commit_message>
<xml_diff>
--- a/paper_rewriting_output/final_paper/paper.docx
+++ b/paper_rewriting_output/final_paper/paper.docx
@@ -5642,7 +5642,7 @@
       <w:r>
         <w:drawing>
           <wp:inline>
-            <wp:extent cx="4533900" cy="2914650"/>
+            <wp:extent cx="4533900" cy="3076236"/>
             <wp:effectExtent b="0" l="0" r="0" t="0"/>
             <wp:docPr descr="" title="" id="31" name="Picture"/>
             <a:graphic>
@@ -5663,7 +5663,7 @@
                   <pic:spPr bwMode="auto">
                     <a:xfrm>
                       <a:off x="0" y="0"/>
-                      <a:ext cx="4533900" cy="2914650"/>
+                      <a:ext cx="4533900" cy="3076236"/>
                     </a:xfrm>
                     <a:prstGeom prst="rect">
                       <a:avLst/>
@@ -7656,7 +7656,7 @@
       <w:r>
         <w:drawing>
           <wp:inline>
-            <wp:extent cx="5067300" cy="2134834"/>
+            <wp:extent cx="5067300" cy="2039185"/>
             <wp:effectExtent b="0" l="0" r="0" t="0"/>
             <wp:docPr descr="" title="" id="36" name="Picture"/>
             <a:graphic>
@@ -7677,7 +7677,7 @@
                   <pic:spPr bwMode="auto">
                     <a:xfrm>
                       <a:off x="0" y="0"/>
-                      <a:ext cx="5067300" cy="2134834"/>
+                      <a:ext cx="5067300" cy="2039185"/>
                     </a:xfrm>
                     <a:prstGeom prst="rect">
                       <a:avLst/>
@@ -8532,7 +8532,7 @@
       <w:r>
         <w:drawing>
           <wp:inline>
-            <wp:extent cx="3733800" cy="2489200"/>
+            <wp:extent cx="3733800" cy="2459915"/>
             <wp:effectExtent b="0" l="0" r="0" t="0"/>
             <wp:docPr descr="" title="" id="40" name="Picture"/>
             <a:graphic>
@@ -8553,7 +8553,7 @@
                   <pic:spPr bwMode="auto">
                     <a:xfrm>
                       <a:off x="0" y="0"/>
-                      <a:ext cx="3733800" cy="2489200"/>
+                      <a:ext cx="3733800" cy="2459915"/>
                     </a:xfrm>
                     <a:prstGeom prst="rect">
                       <a:avLst/>
@@ -13513,7 +13513,7 @@
       <w:r>
         <w:drawing>
           <wp:inline>
-            <wp:extent cx="2400300" cy="2133600"/>
+            <wp:extent cx="2400300" cy="2185458"/>
             <wp:effectExtent b="0" l="0" r="0" t="0"/>
             <wp:docPr descr="" title="" id="49" name="Picture"/>
             <a:graphic>
@@ -13534,7 +13534,7 @@
                   <pic:spPr bwMode="auto">
                     <a:xfrm>
                       <a:off x="0" y="0"/>
-                      <a:ext cx="2400300" cy="2133600"/>
+                      <a:ext cx="2400300" cy="2185458"/>
                     </a:xfrm>
                     <a:prstGeom prst="rect">
                       <a:avLst/>
@@ -13666,7 +13666,7 @@
       <w:r>
         <w:drawing>
           <wp:inline>
-            <wp:extent cx="4000500" cy="2769576"/>
+            <wp:extent cx="4000500" cy="2743705"/>
             <wp:effectExtent b="0" l="0" r="0" t="0"/>
             <wp:docPr descr="" title="" id="53" name="Picture"/>
             <a:graphic>
@@ -13687,7 +13687,7 @@
                   <pic:spPr bwMode="auto">
                     <a:xfrm>
                       <a:off x="0" y="0"/>
-                      <a:ext cx="4000500" cy="2769576"/>
+                      <a:ext cx="4000500" cy="2743705"/>
                     </a:xfrm>
                     <a:prstGeom prst="rect">
                       <a:avLst/>
@@ -13806,7 +13806,7 @@
       <w:r>
         <w:drawing>
           <wp:inline>
-            <wp:extent cx="4000500" cy="2461846"/>
+            <wp:extent cx="4000500" cy="2402009"/>
             <wp:effectExtent b="0" l="0" r="0" t="0"/>
             <wp:docPr descr="" title="" id="56" name="Picture"/>
             <a:graphic>
@@ -13827,7 +13827,7 @@
                   <pic:spPr bwMode="auto">
                     <a:xfrm>
                       <a:off x="0" y="0"/>
-                      <a:ext cx="4000500" cy="2461846"/>
+                      <a:ext cx="4000500" cy="2402009"/>
                     </a:xfrm>
                     <a:prstGeom prst="rect">
                       <a:avLst/>

</xml_diff>